<commit_message>
fix: cleanup modified submodule content
</commit_message>
<xml_diff>
--- a/thesis_paper/manuscript_5_chapter/docx_output/chapter4_results_verification.docx
+++ b/thesis_paper/manuscript_5_chapter/docx_output/chapter4_results_verification.docx
@@ -2,7 +2,7 @@
 <file path=word/document.xml><?xml version="1.0" encoding="utf-8"?>
 <w:document xmlns:w="http://schemas.openxmlformats.org/wordprocessingml/2006/main" xmlns:m="http://schemas.openxmlformats.org/officeDocument/2006/math" xmlns:r="http://schemas.openxmlformats.org/officeDocument/2006/relationships" xmlns:o="urn:schemas-microsoft-com:office:office" xmlns:v="urn:schemas-microsoft-com:vml" xmlns:w10="urn:schemas-microsoft-com:office:word" xmlns:a="http://schemas.openxmlformats.org/drawingml/2006/main" xmlns:pic="http://schemas.openxmlformats.org/drawingml/2006/picture" xmlns:wp="http://schemas.openxmlformats.org/drawingml/2006/wordprocessingDrawing">
   <w:body>
-    <w:bookmarkStart w:id="65" w:name="第4章-实验结果与分析"/>
+    <w:bookmarkStart w:id="68" w:name="第4章-实验结果与分析"/>
     <w:p>
       <w:pPr>
         <w:pStyle w:val="1"/>
@@ -2498,7 +2498,7 @@
     </w:p>
     <w:bookmarkEnd w:id="25"/>
     <w:bookmarkEnd w:id="26"/>
-    <w:bookmarkStart w:id="45" w:name="稀疏场重建主结果-main-reconstruction-results"/>
+    <w:bookmarkStart w:id="48" w:name="稀疏场重建主结果-main-reconstruction-results"/>
     <w:p>
       <w:pPr>
         <w:pStyle w:val="2"/>
@@ -2507,7 +2507,7 @@
         <w:t xml:space="preserve">4.2 稀疏场重建主结果 (Main Reconstruction Results)</w:t>
       </w:r>
     </w:p>
-    <w:bookmarkStart w:id="30" w:name="空间重建性能-spatial-reconstruction"/>
+    <w:bookmarkStart w:id="33" w:name="空间重建性能-spatial-reconstruction"/>
     <w:p>
       <w:pPr>
         <w:pStyle w:val="3"/>
@@ -3570,14 +3570,14 @@
       <w:r>
         <w:drawing>
           <wp:inline>
-            <wp:extent cx="5504749" cy="3669832"/>
+            <wp:extent cx="5753100" cy="4310516"/>
             <wp:effectExtent b="0" l="0" r="0" t="0"/>
-            <wp:docPr descr="图 4-1: SWE 数据集上不同架构的训练收敛曲线对比。EDSR (Ours) 展现出更快的收敛速度与更低的稳态误差，显著优于 UNet 与 FNO 基线。" title="" id="28" name="Picture"/>
+            <wp:docPr descr="图 4-1: SWE 数据集上不同架构的训练收敛曲线对比。EDSR (Ours) 展现出更快的收敛速度与更低的稳态误差，显著优于 UNet、FNO 以及其他拓展基线模型。" title="" id="28" name="Picture"/>
             <a:graphic>
               <a:graphicData uri="http://schemas.openxmlformats.org/drawingml/2006/picture">
                 <pic:pic>
                   <pic:nvPicPr>
-                    <pic:cNvPr descr="images/fig4-4_training_convergence.png" id="29" name="Picture"/>
+                    <pic:cNvPr descr="images/fig4-4_training_convergence_extended.png" id="29" name="Picture"/>
                     <pic:cNvPicPr>
                       <a:picLocks noChangeArrowheads="1" noChangeAspect="1"/>
                     </pic:cNvPicPr>
@@ -3591,7 +3591,7 @@
                   <pic:spPr bwMode="auto">
                     <a:xfrm>
                       <a:off x="0" y="0"/>
-                      <a:ext cx="5504749" cy="3669832"/>
+                      <a:ext cx="5753100" cy="4310516"/>
                     </a:xfrm>
                     <a:prstGeom prst="rect">
                       <a:avLst/>
@@ -3615,7 +3615,7 @@
         <w:pStyle w:val="ImageCaption"/>
       </w:pPr>
       <w:r>
-        <w:t xml:space="preserve">图 4-1: SWE 数据集上不同架构的训练收敛曲线对比。EDSR (Ours) 展现出更快的收敛速度与更低的稳态误差，显著优于 UNet 与 FNO 基线。</w:t>
+        <w:t xml:space="preserve">图 4-1: SWE 数据集上不同架构的训练收敛曲线对比。EDSR (Ours) 展现出更快的收敛速度与更低的稳态误差，显著优于 UNet、FNO 以及其他拓展基线模型。</w:t>
       </w:r>
     </w:p>
     <w:p>
@@ -3633,7 +3633,62 @@
         <w:t xml:space="preserve">1M 参数量预算</w:t>
       </w:r>
       <w:r>
-        <w:t xml:space="preserve">下的横向对比（表 4-3）。</w:t>
+        <w:t xml:space="preserve">下的横向对比（表 4-3）。通过图 4-2 的效率与精度权衡图（Trade-off）可以直观地看出，在相近的参数预算下，不同架构在计算速度与重构精度之间展现出不同的 Pareto 最优边界。</w:t>
+      </w:r>
+    </w:p>
+    <w:p>
+      <w:pPr>
+        <w:pStyle w:val="CaptionedFigure"/>
+      </w:pPr>
+      <w:r>
+        <w:drawing>
+          <wp:inline>
+            <wp:extent cx="4579632" cy="3480520"/>
+            <wp:effectExtent b="0" l="0" r="0" t="0"/>
+            <wp:docPr descr="图 4-2: 1M 参数预算下的模型效率与精度权衡图（Efficiency-Accuracy Trade-off）。横轴为模型推理时延（ms），纵轴为相对误差（Rel-L2）。散点大小反映模型的参数量（Params），点越小代表模型越轻量化。虚线连接了处于 Pareto 前沿的模型。可以看出，EDSR 精度最高但时延偏高；ConvUNetLite 速度最快且精度次优；NAFNet 虽精度较好但计算代价过高。" title="" id="31" name="Picture"/>
+            <a:graphic>
+              <a:graphicData uri="http://schemas.openxmlformats.org/drawingml/2006/picture">
+                <pic:pic>
+                  <pic:nvPicPr>
+                    <pic:cNvPr descr="../figures/edsr/efficiency_accuracy_tradeoff.png" id="32" name="Picture"/>
+                    <pic:cNvPicPr>
+                      <a:picLocks noChangeArrowheads="1" noChangeAspect="1"/>
+                    </pic:cNvPicPr>
+                  </pic:nvPicPr>
+                  <pic:blipFill>
+                    <a:blip r:embed="rId30"/>
+                    <a:stretch>
+                      <a:fillRect/>
+                    </a:stretch>
+                  </pic:blipFill>
+                  <pic:spPr bwMode="auto">
+                    <a:xfrm>
+                      <a:off x="0" y="0"/>
+                      <a:ext cx="4579632" cy="3480520"/>
+                    </a:xfrm>
+                    <a:prstGeom prst="rect">
+                      <a:avLst/>
+                    </a:prstGeom>
+                    <a:noFill/>
+                    <a:ln w="9525">
+                      <a:noFill/>
+                      <a:headEnd/>
+                      <a:tailEnd/>
+                    </a:ln>
+                  </pic:spPr>
+                </pic:pic>
+              </a:graphicData>
+            </a:graphic>
+          </wp:inline>
+        </w:drawing>
+      </w:r>
+    </w:p>
+    <w:p>
+      <w:pPr>
+        <w:pStyle w:val="ImageCaption"/>
+      </w:pPr>
+      <w:r>
+        <w:t xml:space="preserve">图 4-2: 1M 参数预算下的模型效率与精度权衡图（Efficiency-Accuracy Trade-off）。横轴为模型推理时延（ms），纵轴为相对误差（Rel-L2）。散点大小反映模型的参数量（Params），点越小代表模型越轻量化。虚线连接了处于 Pareto 前沿的模型。可以看出，EDSR 精度最高但时延偏高；ConvUNetLite 速度最快且精度次优；NAFNet 虽精度较好但计算代价过高。</w:t>
       </w:r>
     </w:p>
     <w:p>
@@ -4492,7 +4547,7 @@
               <w:jc w:val="center"/>
             </w:pPr>
             <w:r>
-              <w:t xml:space="preserve">-</w:t>
+              <w:t xml:space="preserve">OOM</w:t>
             </w:r>
           </w:p>
         </w:tc>
@@ -4571,69 +4626,7 @@
               <w:jc w:val="center"/>
             </w:pPr>
             <w:r>
-              <w:t xml:space="preserve">-</w:t>
-            </w:r>
-          </w:p>
-        </w:tc>
-        <w:tc>
-          <w:tcPr/>
-          <w:p>
-            <w:pPr>
-              <w:pStyle w:val="Compact"/>
-              <w:jc w:val="center"/>
-            </w:pPr>
-            <w:r>
-              <w:t xml:space="preserve">-</w:t>
-            </w:r>
-          </w:p>
-        </w:tc>
-      </w:tr>
-      <w:tr>
-        <w:tc>
-          <w:tcPr/>
-          <w:p>
-            <w:pPr>
-              <w:pStyle w:val="Compact"/>
-              <w:jc w:val="center"/>
-            </w:pPr>
-            <w:r>
-              <w:t xml:space="preserve">80</w:t>
-            </w:r>
-          </w:p>
-        </w:tc>
-        <w:tc>
-          <w:tcPr/>
-          <w:p>
-            <w:pPr>
-              <w:pStyle w:val="Compact"/>
-              <w:jc w:val="center"/>
-            </w:pPr>
-            <w:r>
-              <w:t xml:space="preserve">39.06</w:t>
-            </w:r>
-          </w:p>
-        </w:tc>
-        <w:tc>
-          <w:tcPr/>
-          <w:p>
-            <w:pPr>
-              <w:pStyle w:val="Compact"/>
-              <w:jc w:val="center"/>
-            </w:pPr>
-            <w:r>
-              <w:t xml:space="preserve">0.7696</w:t>
-            </w:r>
-          </w:p>
-        </w:tc>
-        <w:tc>
-          <w:tcPr/>
-          <w:p>
-            <w:pPr>
-              <w:pStyle w:val="Compact"/>
-              <w:jc w:val="center"/>
-            </w:pPr>
-            <w:r>
-              <w:t xml:space="preserve">-</w:t>
+              <w:t xml:space="preserve">OOM</w:t>
             </w:r>
           </w:p>
         </w:tc>
@@ -4676,51 +4669,43 @@
               <w:jc w:val="center"/>
             </w:pPr>
             <w:r>
-              <w:rPr>
-                <w:bCs/>
-                <w:b/>
-              </w:rPr>
-              <w:t xml:space="preserve">64</w:t>
-            </w:r>
-          </w:p>
-        </w:tc>
-        <w:tc>
-          <w:tcPr/>
-          <w:p>
-            <w:pPr>
-              <w:pStyle w:val="Compact"/>
-              <w:jc w:val="center"/>
-            </w:pPr>
-            <w:r>
-              <w:rPr>
-                <w:bCs/>
-                <w:b/>
-              </w:rPr>
-              <w:t xml:space="preserve">25.00</w:t>
-            </w:r>
-          </w:p>
-        </w:tc>
-        <w:tc>
-          <w:tcPr/>
-          <w:p>
-            <w:pPr>
-              <w:pStyle w:val="Compact"/>
-              <w:jc w:val="center"/>
-            </w:pPr>
-            <w:r>
-              <w:t xml:space="preserve">0.8476</w:t>
-            </w:r>
-          </w:p>
-        </w:tc>
-        <w:tc>
-          <w:tcPr/>
-          <w:p>
-            <w:pPr>
-              <w:pStyle w:val="Compact"/>
-              <w:jc w:val="center"/>
-            </w:pPr>
-            <w:r>
-              <w:t xml:space="preserve">-</w:t>
+              <w:t xml:space="preserve">80</w:t>
+            </w:r>
+          </w:p>
+        </w:tc>
+        <w:tc>
+          <w:tcPr/>
+          <w:p>
+            <w:pPr>
+              <w:pStyle w:val="Compact"/>
+              <w:jc w:val="center"/>
+            </w:pPr>
+            <w:r>
+              <w:t xml:space="preserve">39.06</w:t>
+            </w:r>
+          </w:p>
+        </w:tc>
+        <w:tc>
+          <w:tcPr/>
+          <w:p>
+            <w:pPr>
+              <w:pStyle w:val="Compact"/>
+              <w:jc w:val="center"/>
+            </w:pPr>
+            <w:r>
+              <w:t xml:space="preserve">0.7696</w:t>
+            </w:r>
+          </w:p>
+        </w:tc>
+        <w:tc>
+          <w:tcPr/>
+          <w:p>
+            <w:pPr>
+              <w:pStyle w:val="Compact"/>
+              <w:jc w:val="center"/>
+            </w:pPr>
+            <w:r>
+              <w:t xml:space="preserve">OOM</w:t>
             </w:r>
           </w:p>
         </w:tc>
@@ -4767,7 +4752,7 @@
                 <w:bCs/>
                 <w:b/>
               </w:rPr>
-              <w:t xml:space="preserve">48</w:t>
+              <w:t xml:space="preserve">64</w:t>
             </w:r>
           </w:p>
         </w:tc>
@@ -4783,31 +4768,31 @@
                 <w:bCs/>
                 <w:b/>
               </w:rPr>
-              <w:t xml:space="preserve">14.06</w:t>
-            </w:r>
-          </w:p>
-        </w:tc>
-        <w:tc>
-          <w:tcPr/>
-          <w:p>
-            <w:pPr>
-              <w:pStyle w:val="Compact"/>
-              <w:jc w:val="center"/>
-            </w:pPr>
-            <w:r>
-              <w:t xml:space="preserve">0.9037</w:t>
-            </w:r>
-          </w:p>
-        </w:tc>
-        <w:tc>
-          <w:tcPr/>
-          <w:p>
-            <w:pPr>
-              <w:pStyle w:val="Compact"/>
-              <w:jc w:val="center"/>
-            </w:pPr>
-            <w:r>
-              <w:t xml:space="preserve">0.9026</w:t>
+              <w:t xml:space="preserve">25.00</w:t>
+            </w:r>
+          </w:p>
+        </w:tc>
+        <w:tc>
+          <w:tcPr/>
+          <w:p>
+            <w:pPr>
+              <w:pStyle w:val="Compact"/>
+              <w:jc w:val="center"/>
+            </w:pPr>
+            <w:r>
+              <w:t xml:space="preserve">0.8476</w:t>
+            </w:r>
+          </w:p>
+        </w:tc>
+        <w:tc>
+          <w:tcPr/>
+          <w:p>
+            <w:pPr>
+              <w:pStyle w:val="Compact"/>
+              <w:jc w:val="center"/>
+            </w:pPr>
+            <w:r>
+              <w:t xml:space="preserve">OOM</w:t>
             </w:r>
           </w:p>
         </w:tc>
@@ -4854,7 +4839,7 @@
                 <w:bCs/>
                 <w:b/>
               </w:rPr>
-              <w:t xml:space="preserve">32</w:t>
+              <w:t xml:space="preserve">48</w:t>
             </w:r>
           </w:p>
         </w:tc>
@@ -4870,31 +4855,31 @@
                 <w:bCs/>
                 <w:b/>
               </w:rPr>
-              <w:t xml:space="preserve">6.25</w:t>
-            </w:r>
-          </w:p>
-        </w:tc>
-        <w:tc>
-          <w:tcPr/>
-          <w:p>
-            <w:pPr>
-              <w:pStyle w:val="Compact"/>
-              <w:jc w:val="center"/>
-            </w:pPr>
-            <w:r>
-              <w:t xml:space="preserve">0.9463</w:t>
-            </w:r>
-          </w:p>
-        </w:tc>
-        <w:tc>
-          <w:tcPr/>
-          <w:p>
-            <w:pPr>
-              <w:pStyle w:val="Compact"/>
-              <w:jc w:val="center"/>
-            </w:pPr>
-            <w:r>
-              <w:t xml:space="preserve">0.9495</w:t>
+              <w:t xml:space="preserve">14.06</w:t>
+            </w:r>
+          </w:p>
+        </w:tc>
+        <w:tc>
+          <w:tcPr/>
+          <w:p>
+            <w:pPr>
+              <w:pStyle w:val="Compact"/>
+              <w:jc w:val="center"/>
+            </w:pPr>
+            <w:r>
+              <w:t xml:space="preserve">0.9037</w:t>
+            </w:r>
+          </w:p>
+        </w:tc>
+        <w:tc>
+          <w:tcPr/>
+          <w:p>
+            <w:pPr>
+              <w:pStyle w:val="Compact"/>
+              <w:jc w:val="center"/>
+            </w:pPr>
+            <w:r>
+              <w:t xml:space="preserve">0.9026</w:t>
             </w:r>
           </w:p>
         </w:tc>
@@ -4937,56 +4922,81 @@
               <w:jc w:val="center"/>
             </w:pPr>
             <w:r>
-              <w:t xml:space="preserve">16</w:t>
-            </w:r>
-          </w:p>
-        </w:tc>
-        <w:tc>
-          <w:tcPr/>
-          <w:p>
-            <w:pPr>
-              <w:pStyle w:val="Compact"/>
-              <w:jc w:val="center"/>
-            </w:pPr>
-            <w:r>
-              <w:t xml:space="preserve">1.56</w:t>
-            </w:r>
-          </w:p>
-        </w:tc>
-        <w:tc>
-          <w:tcPr/>
-          <w:p>
-            <w:pPr>
-              <w:pStyle w:val="Compact"/>
-              <w:jc w:val="center"/>
-            </w:pPr>
-            <w:r>
-              <w:t xml:space="preserve">0.9840</w:t>
-            </w:r>
-          </w:p>
-        </w:tc>
-        <w:tc>
-          <w:tcPr/>
-          <w:p>
-            <w:pPr>
-              <w:pStyle w:val="Compact"/>
-              <w:jc w:val="center"/>
-            </w:pPr>
-            <w:r>
-              <w:t xml:space="preserve">0.9820</w:t>
-            </w:r>
-          </w:p>
-        </w:tc>
-        <w:tc>
-          <w:tcPr/>
-          <w:p>
-            <w:pPr>
-              <w:pStyle w:val="Compact"/>
-              <w:jc w:val="center"/>
-            </w:pPr>
-            <w:r>
-              <w:t xml:space="preserve">-</w:t>
-            </w:r>
+              <w:rPr>
+                <w:bCs/>
+                <w:b/>
+              </w:rPr>
+              <w:t xml:space="preserve">32</w:t>
+            </w:r>
+          </w:p>
+        </w:tc>
+        <w:tc>
+          <w:tcPr/>
+          <w:p>
+            <w:pPr>
+              <w:pStyle w:val="Compact"/>
+              <w:jc w:val="center"/>
+            </w:pPr>
+            <w:r>
+              <w:rPr>
+                <w:bCs/>
+                <w:b/>
+              </w:rPr>
+              <w:t xml:space="preserve">6.25</w:t>
+            </w:r>
+          </w:p>
+        </w:tc>
+        <w:tc>
+          <w:tcPr/>
+          <w:p>
+            <w:pPr>
+              <w:pStyle w:val="Compact"/>
+              <w:jc w:val="center"/>
+            </w:pPr>
+            <w:r>
+              <w:t xml:space="preserve">0.9463</w:t>
+            </w:r>
+          </w:p>
+        </w:tc>
+        <w:tc>
+          <w:tcPr/>
+          <w:p>
+            <w:pPr>
+              <w:pStyle w:val="Compact"/>
+              <w:jc w:val="center"/>
+            </w:pPr>
+            <w:r>
+              <w:t xml:space="preserve">0.9495</w:t>
+            </w:r>
+          </w:p>
+        </w:tc>
+        <w:tc>
+          <w:tcPr/>
+          <w:p>
+            <w:pPr>
+              <w:pStyle w:val="Compact"/>
+              <w:jc w:val="center"/>
+            </w:pPr>
+            <w:r>
+              <w:t xml:space="preserve">1.0000</w:t>
+            </w:r>
+            <m:oMath>
+              <m:sSup>
+                <m:e>
+                  <m:r>
+                    <m:t>​</m:t>
+                  </m:r>
+                </m:e>
+                <m:sup>
+                  <m:r>
+                    <m:rPr>
+                      <m:sty m:val="p"/>
+                    </m:rPr>
+                    <m:t>†</m:t>
+                  </m:r>
+                </m:sup>
+              </m:sSup>
+            </m:oMath>
           </w:p>
         </w:tc>
       </w:tr>
@@ -4999,56 +5009,73 @@
               <w:jc w:val="center"/>
             </w:pPr>
             <w:r>
-              <w:t xml:space="preserve">8</w:t>
-            </w:r>
-          </w:p>
-        </w:tc>
-        <w:tc>
-          <w:tcPr/>
-          <w:p>
-            <w:pPr>
-              <w:pStyle w:val="Compact"/>
-              <w:jc w:val="center"/>
-            </w:pPr>
-            <w:r>
-              <w:t xml:space="preserve">0.39</w:t>
-            </w:r>
-          </w:p>
-        </w:tc>
-        <w:tc>
-          <w:tcPr/>
-          <w:p>
-            <w:pPr>
-              <w:pStyle w:val="Compact"/>
-              <w:jc w:val="center"/>
-            </w:pPr>
-            <w:r>
-              <w:t xml:space="preserve">1.0164</w:t>
-            </w:r>
-          </w:p>
-        </w:tc>
-        <w:tc>
-          <w:tcPr/>
-          <w:p>
-            <w:pPr>
-              <w:pStyle w:val="Compact"/>
-              <w:jc w:val="center"/>
-            </w:pPr>
-            <w:r>
-              <w:t xml:space="preserve">0.9906</w:t>
-            </w:r>
-          </w:p>
-        </w:tc>
-        <w:tc>
-          <w:tcPr/>
-          <w:p>
-            <w:pPr>
-              <w:pStyle w:val="Compact"/>
-              <w:jc w:val="center"/>
-            </w:pPr>
-            <w:r>
-              <w:t xml:space="preserve">-</w:t>
-            </w:r>
+              <w:t xml:space="preserve">16</w:t>
+            </w:r>
+          </w:p>
+        </w:tc>
+        <w:tc>
+          <w:tcPr/>
+          <w:p>
+            <w:pPr>
+              <w:pStyle w:val="Compact"/>
+              <w:jc w:val="center"/>
+            </w:pPr>
+            <w:r>
+              <w:t xml:space="preserve">1.56</w:t>
+            </w:r>
+          </w:p>
+        </w:tc>
+        <w:tc>
+          <w:tcPr/>
+          <w:p>
+            <w:pPr>
+              <w:pStyle w:val="Compact"/>
+              <w:jc w:val="center"/>
+            </w:pPr>
+            <w:r>
+              <w:t xml:space="preserve">0.9840</w:t>
+            </w:r>
+          </w:p>
+        </w:tc>
+        <w:tc>
+          <w:tcPr/>
+          <w:p>
+            <w:pPr>
+              <w:pStyle w:val="Compact"/>
+              <w:jc w:val="center"/>
+            </w:pPr>
+            <w:r>
+              <w:t xml:space="preserve">0.9820</w:t>
+            </w:r>
+          </w:p>
+        </w:tc>
+        <w:tc>
+          <w:tcPr/>
+          <w:p>
+            <w:pPr>
+              <w:pStyle w:val="Compact"/>
+              <w:jc w:val="center"/>
+            </w:pPr>
+            <w:r>
+              <w:t xml:space="preserve">1.0000</w:t>
+            </w:r>
+            <m:oMath>
+              <m:sSup>
+                <m:e>
+                  <m:r>
+                    <m:t>​</m:t>
+                  </m:r>
+                </m:e>
+                <m:sup>
+                  <m:r>
+                    <m:rPr>
+                      <m:sty m:val="p"/>
+                    </m:rPr>
+                    <m:t>†</m:t>
+                  </m:r>
+                </m:sup>
+              </m:sSup>
+            </m:oMath>
           </w:p>
         </w:tc>
       </w:tr>
@@ -5061,56 +5088,73 @@
               <w:jc w:val="center"/>
             </w:pPr>
             <w:r>
-              <w:t xml:space="preserve">4</w:t>
-            </w:r>
-          </w:p>
-        </w:tc>
-        <w:tc>
-          <w:tcPr/>
-          <w:p>
-            <w:pPr>
-              <w:pStyle w:val="Compact"/>
-              <w:jc w:val="center"/>
-            </w:pPr>
-            <w:r>
-              <w:t xml:space="preserve">0.10</w:t>
-            </w:r>
-          </w:p>
-        </w:tc>
-        <w:tc>
-          <w:tcPr/>
-          <w:p>
-            <w:pPr>
-              <w:pStyle w:val="Compact"/>
-              <w:jc w:val="center"/>
-            </w:pPr>
-            <w:r>
-              <w:t xml:space="preserve">1.0096</w:t>
-            </w:r>
-          </w:p>
-        </w:tc>
-        <w:tc>
-          <w:tcPr/>
-          <w:p>
-            <w:pPr>
-              <w:pStyle w:val="Compact"/>
-              <w:jc w:val="center"/>
-            </w:pPr>
-            <w:r>
-              <w:t xml:space="preserve">0.9924</w:t>
-            </w:r>
-          </w:p>
-        </w:tc>
-        <w:tc>
-          <w:tcPr/>
-          <w:p>
-            <w:pPr>
-              <w:pStyle w:val="Compact"/>
-              <w:jc w:val="center"/>
-            </w:pPr>
-            <w:r>
-              <w:t xml:space="preserve">-</w:t>
-            </w:r>
+              <w:t xml:space="preserve">8</w:t>
+            </w:r>
+          </w:p>
+        </w:tc>
+        <w:tc>
+          <w:tcPr/>
+          <w:p>
+            <w:pPr>
+              <w:pStyle w:val="Compact"/>
+              <w:jc w:val="center"/>
+            </w:pPr>
+            <w:r>
+              <w:t xml:space="preserve">0.39</w:t>
+            </w:r>
+          </w:p>
+        </w:tc>
+        <w:tc>
+          <w:tcPr/>
+          <w:p>
+            <w:pPr>
+              <w:pStyle w:val="Compact"/>
+              <w:jc w:val="center"/>
+            </w:pPr>
+            <w:r>
+              <w:t xml:space="preserve">1.0164</w:t>
+            </w:r>
+          </w:p>
+        </w:tc>
+        <w:tc>
+          <w:tcPr/>
+          <w:p>
+            <w:pPr>
+              <w:pStyle w:val="Compact"/>
+              <w:jc w:val="center"/>
+            </w:pPr>
+            <w:r>
+              <w:t xml:space="preserve">0.9906</w:t>
+            </w:r>
+          </w:p>
+        </w:tc>
+        <w:tc>
+          <w:tcPr/>
+          <w:p>
+            <w:pPr>
+              <w:pStyle w:val="Compact"/>
+              <w:jc w:val="center"/>
+            </w:pPr>
+            <w:r>
+              <w:t xml:space="preserve">1.0000</w:t>
+            </w:r>
+            <m:oMath>
+              <m:sSup>
+                <m:e>
+                  <m:r>
+                    <m:t>​</m:t>
+                  </m:r>
+                </m:e>
+                <m:sup>
+                  <m:r>
+                    <m:rPr>
+                      <m:sty m:val="p"/>
+                    </m:rPr>
+                    <m:t>†</m:t>
+                  </m:r>
+                </m:sup>
+              </m:sSup>
+            </m:oMath>
           </w:p>
         </w:tc>
       </w:tr>
@@ -5123,6 +5167,85 @@
               <w:jc w:val="center"/>
             </w:pPr>
             <w:r>
+              <w:t xml:space="preserve">4</w:t>
+            </w:r>
+          </w:p>
+        </w:tc>
+        <w:tc>
+          <w:tcPr/>
+          <w:p>
+            <w:pPr>
+              <w:pStyle w:val="Compact"/>
+              <w:jc w:val="center"/>
+            </w:pPr>
+            <w:r>
+              <w:t xml:space="preserve">0.10</w:t>
+            </w:r>
+          </w:p>
+        </w:tc>
+        <w:tc>
+          <w:tcPr/>
+          <w:p>
+            <w:pPr>
+              <w:pStyle w:val="Compact"/>
+              <w:jc w:val="center"/>
+            </w:pPr>
+            <w:r>
+              <w:t xml:space="preserve">1.0096</w:t>
+            </w:r>
+          </w:p>
+        </w:tc>
+        <w:tc>
+          <w:tcPr/>
+          <w:p>
+            <w:pPr>
+              <w:pStyle w:val="Compact"/>
+              <w:jc w:val="center"/>
+            </w:pPr>
+            <w:r>
+              <w:t xml:space="preserve">0.9924</w:t>
+            </w:r>
+          </w:p>
+        </w:tc>
+        <w:tc>
+          <w:tcPr/>
+          <w:p>
+            <w:pPr>
+              <w:pStyle w:val="Compact"/>
+              <w:jc w:val="center"/>
+            </w:pPr>
+            <w:r>
+              <w:t xml:space="preserve">1.0000</w:t>
+            </w:r>
+            <m:oMath>
+              <m:sSup>
+                <m:e>
+                  <m:r>
+                    <m:t>​</m:t>
+                  </m:r>
+                </m:e>
+                <m:sup>
+                  <m:r>
+                    <m:rPr>
+                      <m:sty m:val="p"/>
+                    </m:rPr>
+                    <m:t>†</m:t>
+                  </m:r>
+                </m:sup>
+              </m:sSup>
+            </m:oMath>
+          </w:p>
+        </w:tc>
+      </w:tr>
+      <w:tr>
+        <w:tc>
+          <w:tcPr/>
+          <w:p>
+            <w:pPr>
+              <w:pStyle w:val="Compact"/>
+              <w:jc w:val="center"/>
+            </w:pPr>
+            <w:r>
               <w:t xml:space="preserve">1</w:t>
             </w:r>
           </w:p>
@@ -5171,12 +5294,86 @@
               <w:jc w:val="center"/>
             </w:pPr>
             <w:r>
-              <w:t xml:space="preserve">-</w:t>
-            </w:r>
+              <w:t xml:space="preserve">1.0000</w:t>
+            </w:r>
+            <m:oMath>
+              <m:sSup>
+                <m:e>
+                  <m:r>
+                    <m:t>​</m:t>
+                  </m:r>
+                </m:e>
+                <m:sup>
+                  <m:r>
+                    <m:rPr>
+                      <m:sty m:val="p"/>
+                    </m:rPr>
+                    <m:t>†</m:t>
+                  </m:r>
+                </m:sup>
+              </m:sSup>
+            </m:oMath>
           </w:p>
         </w:tc>
       </w:tr>
     </w:tbl>
+    <w:tbl>
+      <w:tblPr>
+        <w:tblStyle w:val="FigureTable"/>
+        <w:tblW w:type="auto" w:w="0"/>
+        <w:tblLook w:firstRow="0" w:lastRow="0" w:firstColumn="0" w:lastColumn="0"/>
+        <w:jc w:val="center"/>
+      </w:tblPr>
+      <w:tblGrid>
+        <w:gridCol w:w="7920"/>
+      </w:tblGrid>
+      <w:tr>
+        <w:tc>
+          <w:tcPr/>
+          <w:p>
+            <w:pPr>
+              <w:pStyle w:val="Compact"/>
+              <w:jc w:val="center"/>
+            </w:pPr>
+            <w:r>
+              <w:t xml:space="preserve">图 4-3: 不同观测面积（Area Pct）下各架构的重建误差退化曲线。横轴为对数刻度的观测面积占比，纵轴为相对误差（Rel-L2）。随着观测面积的极度萎缩，所有模型均向 Rel-L2</w:t>
+            </w:r>
+            <w:r>
+              <w:t xml:space="preserve"> </w:t>
+            </w:r>
+            <w:r>
+              <w:t xml:space="preserve">$\approx 1.0$</w:t>
+            </w:r>
+            <w:r>
+              <w:t xml:space="preserve"> </w:t>
+            </w:r>
+            <w:r>
+              <w:t xml:space="preserve">的失效极限（红色虚线）逼近。其中，带跳跃连接的 UNet 展现出比纯残差结构的 EDSR 更平滑的降级特性，而 PartialConvUNet 则在所有测试点上均失效。</w:t>
+            </w:r>
+          </w:p>
+        </w:tc>
+      </w:tr>
+    </w:tbl>
+    <w:p>
+      <w:pPr>
+        <w:pStyle w:val="ImageCaption"/>
+      </w:pPr>
+      <w:r>
+        <w:t xml:space="preserve">图 4-3: 不同观测面积（Area Pct）下各架构的重建误差退化曲线。横轴为对数刻度的观测面积占比，纵轴为相对误差（Rel-L2）。随着观测面积的极度萎缩，所有模型均向 Rel-L2</w:t>
+      </w:r>
+      <w:r>
+        <w:t xml:space="preserve"> </w:t>
+      </w:r>
+      <w:r>
+        <w:t xml:space="preserve">$\approx 1.0$</w:t>
+      </w:r>
+      <w:r>
+        <w:t xml:space="preserve"> </w:t>
+      </w:r>
+      <w:r>
+        <w:t xml:space="preserve">的失效极限（红色虚线）逼近。其中，带跳跃连接的 UNet 展现出比纯残差结构的 EDSR 更平滑的降级特性，而 PartialConvUNet 则在所有测试点上均失效。</w:t>
+      </w:r>
+    </w:p>
     <w:p>
       <w:pPr>
         <w:pStyle w:val="11"/>
@@ -5281,8 +5478,8 @@
         <w:t xml:space="preserve">：对于所有模型而言，当观测区域极度稀疏（Size &lt; 16, &lt;1.5%）时，性能均收敛到随机猜测水平（Rel-L2 &gt; 0.96，见表 4-11），这标志着纯数据驱动下物理信息的可重建极限。</w:t>
       </w:r>
     </w:p>
-    <w:bookmarkEnd w:id="30"/>
-    <w:bookmarkStart w:id="34" w:name="时空演化性能-spatiotemporal-evolution"/>
+    <w:bookmarkEnd w:id="33"/>
+    <w:bookmarkStart w:id="37" w:name="时空演化性能-spatiotemporal-evolution"/>
     <w:p>
       <w:pPr>
         <w:pStyle w:val="3"/>
@@ -6332,18 +6529,18 @@
           <wp:inline>
             <wp:extent cx="5504749" cy="3669832"/>
             <wp:effectExtent b="0" l="0" r="0" t="0"/>
-            <wp:docPr descr="图 4-2: 时空预测任务中的误差累积（Rollout Error）分析。随着预测步长（Time Step）的增加，Ours (Seq-EDSR) 的累积误差增长最为缓慢，表现出优异的长时稳定性；而 UNet 与 FNO 则出现了较快的误差漂移。" title="" id="32" name="Picture"/>
+            <wp:docPr descr="图 4-4: 时空预测任务中的误差累积（Rollout Error）分析。随着预测步长（Time Step）的增加，Ours (Seq-EDSR) 的累积误差增长最为缓慢，表现出优异的长时稳定性；而 UNet 与 FNO 则出现了较快的误差漂移。" title="" id="35" name="Picture"/>
             <a:graphic>
               <a:graphicData uri="http://schemas.openxmlformats.org/drawingml/2006/picture">
                 <pic:pic>
                   <pic:nvPicPr>
-                    <pic:cNvPr descr="images/fig4-7_rollout_error.png" id="33" name="Picture"/>
+                    <pic:cNvPr descr="images/fig4-7_rollout_error.png" id="36" name="Picture"/>
                     <pic:cNvPicPr>
                       <a:picLocks noChangeArrowheads="1" noChangeAspect="1"/>
                     </pic:cNvPicPr>
                   </pic:nvPicPr>
                   <pic:blipFill>
-                    <a:blip r:embed="rId31"/>
+                    <a:blip r:embed="rId34"/>
                     <a:stretch>
                       <a:fillRect/>
                     </a:stretch>
@@ -6375,11 +6572,11 @@
         <w:pStyle w:val="ImageCaption"/>
       </w:pPr>
       <w:r>
-        <w:t xml:space="preserve">图 4-2: 时空预测任务中的误差累积（Rollout Error）分析。随着预测步长（Time Step）的增加，Ours (Seq-EDSR) 的累积误差增长最为缓慢，表现出优异的长时稳定性；而 UNet 与 FNO 则出现了较快的误差漂移。</w:t>
+        <w:t xml:space="preserve">图 4-4: 时空预测任务中的误差累积（Rollout Error）分析。随着预测步长（Time Step）的增加，Ours (Seq-EDSR) 的累积误差增长最为缓慢，表现出优异的长时稳定性；而 UNet 与 FNO 则出现了较快的误差漂移。</w:t>
       </w:r>
     </w:p>
-    <w:bookmarkEnd w:id="34"/>
-    <w:bookmarkStart w:id="44" w:name="定性与谱分析-qualitative-spectral-analysis"/>
+    <w:bookmarkEnd w:id="37"/>
+    <w:bookmarkStart w:id="47" w:name="定性与谱分析-qualitative-spectral-analysis"/>
     <w:p>
       <w:pPr>
         <w:pStyle w:val="3"/>
@@ -6393,7 +6590,7 @@
         <w:pStyle w:val="11"/>
       </w:pPr>
       <w:r>
-        <w:t xml:space="preserve">为直观评估重建质量，图 4-3 展示了典型测试样本的重建结果。</w:t>
+        <w:t xml:space="preserve">为直观评估重建质量，图 4-5 展示了典型测试样本的重建结果。</w:t>
       </w:r>
     </w:p>
     <w:p>
@@ -6405,18 +6602,18 @@
           <wp:inline>
             <wp:extent cx="5753100" cy="3835399"/>
             <wp:effectExtent b="0" l="0" r="0" t="0"/>
-            <wp:docPr descr="图 4-3: 典型测试样本（SWE 数据集，SR \times 4 任务）的重建结果对比。第一行展示了真实场 (GT)、UNet 基线重建与 Ours (EDSR) 重建；第二行展示了对应的绝对误差热图。Ours 模型在涡旋边缘与高频纹理区域展现出更低的重建误差。" title="" id="36" name="Picture"/>
+            <wp:docPr descr="图 4-5: 典型测试样本（SWE 数据集，SR \times 4 任务）的重建结果对比。第一行展示了真实场 (GT)、UNet 基线重建与 Ours (EDSR) 重建；第二行展示了对应的绝对误差热图。Ours 模型在涡旋边缘与高频纹理区域展现出更低的重建误差。" title="" id="39" name="Picture"/>
             <a:graphic>
               <a:graphicData uri="http://schemas.openxmlformats.org/drawingml/2006/picture">
                 <pic:pic>
                   <pic:nvPicPr>
-                    <pic:cNvPr descr="images/fig4-1_vis_results.png" id="37" name="Picture"/>
+                    <pic:cNvPr descr="images/fig4-1_vis_results.png" id="40" name="Picture"/>
                     <pic:cNvPicPr>
                       <a:picLocks noChangeArrowheads="1" noChangeAspect="1"/>
                     </pic:cNvPicPr>
                   </pic:nvPicPr>
                   <pic:blipFill>
-                    <a:blip r:embed="rId35"/>
+                    <a:blip r:embed="rId38"/>
                     <a:stretch>
                       <a:fillRect/>
                     </a:stretch>
@@ -6448,7 +6645,7 @@
         <w:pStyle w:val="ImageCaption"/>
       </w:pPr>
       <w:r>
-        <w:t xml:space="preserve">图 4-3: 典型测试样本（SWE 数据集，SR</w:t>
+        <w:t xml:space="preserve">图 4-5: 典型测试样本（SWE 数据集，SR</w:t>
       </w:r>
       <w:r>
         <w:t xml:space="preserve"> </w:t>
@@ -6518,18 +6715,18 @@
           <wp:inline>
             <wp:extent cx="5504749" cy="3669832"/>
             <wp:effectExtent b="0" l="0" r="0" t="0"/>
-            <wp:docPr descr="图 4-4: 重建结果的径向平均功率谱对比。Baseline (UNet) 在高频段（k &gt; 32）呈现显著的能量衰减（过度平滑），而引入谱一致性损失 \mathcal{L}_{spec} 的 Ours 模型（红色实线）能够有效保持物理场的多尺度能量分布，与真实场（黑色虚线）高度重合。" title="" id="39" name="Picture"/>
+            <wp:docPr descr="图 4-6: 重建结果的径向平均功率谱对比。Baseline (UNet) 在高频段（k &gt; 32）呈现显著的能量衰减（过度平滑），而引入谱一致性损失 \mathcal{L}_{spec} 的 Ours 模型（红色实线）能够有效保持物理场的多尺度能量分布，与真实场（黑色虚线）高度重合。" title="" id="42" name="Picture"/>
             <a:graphic>
               <a:graphicData uri="http://schemas.openxmlformats.org/drawingml/2006/picture">
                 <pic:pic>
                   <pic:nvPicPr>
-                    <pic:cNvPr descr="images/fig4-2_power_spectrum.png" id="40" name="Picture"/>
+                    <pic:cNvPr descr="images/fig4-2_power_spectrum.png" id="43" name="Picture"/>
                     <pic:cNvPicPr>
                       <a:picLocks noChangeArrowheads="1" noChangeAspect="1"/>
                     </pic:cNvPicPr>
                   </pic:nvPicPr>
                   <pic:blipFill>
-                    <a:blip r:embed="rId38"/>
+                    <a:blip r:embed="rId41"/>
                     <a:stretch>
                       <a:fillRect/>
                     </a:stretch>
@@ -6561,7 +6758,7 @@
         <w:pStyle w:val="ImageCaption"/>
       </w:pPr>
       <w:r>
-        <w:t xml:space="preserve">图 4-4: 重建结果的径向平均功率谱对比。Baseline (UNet) 在高频段（</w:t>
+        <w:t xml:space="preserve">图 4-6: 重建结果的径向平均功率谱对比。Baseline (UNet) 在高频段（</w:t>
       </w:r>
       <m:oMath>
         <m:r>
@@ -6645,18 +6842,18 @@
           <wp:inline>
             <wp:extent cx="5753100" cy="1965292"/>
             <wp:effectExtent b="0" l="0" r="0" t="0"/>
-            <wp:docPr descr="图 4-5: 典型失败案例分析。在强非线性边界区域，模型可能出现高频振铃（Ringing Artifacts）或频谱泄漏现象（红框所示），这通常源于固定网格对复杂边界几何的离散化误差。" title="" id="42" name="Picture"/>
+            <wp:docPr descr="图 4-7: 典型失败案例分析。在强非线性边界区域，模型可能出现高频振铃（Ringing Artifacts）或频谱泄漏现象（红框所示），这通常源于固定网格对复杂边界几何的离散化误差。" title="" id="45" name="Picture"/>
             <a:graphic>
               <a:graphicData uri="http://schemas.openxmlformats.org/drawingml/2006/picture">
                 <pic:pic>
                   <pic:nvPicPr>
-                    <pic:cNvPr descr="images/fig4-8_failure_cases.png" id="43" name="Picture"/>
+                    <pic:cNvPr descr="images/fig4-8_failure_cases.png" id="46" name="Picture"/>
                     <pic:cNvPicPr>
                       <a:picLocks noChangeArrowheads="1" noChangeAspect="1"/>
                     </pic:cNvPicPr>
                   </pic:nvPicPr>
                   <pic:blipFill>
-                    <a:blip r:embed="rId41"/>
+                    <a:blip r:embed="rId44"/>
                     <a:stretch>
                       <a:fillRect/>
                     </a:stretch>
@@ -6688,7 +6885,7 @@
         <w:pStyle w:val="ImageCaption"/>
       </w:pPr>
       <w:r>
-        <w:t xml:space="preserve">图 4-5: 典型失败案例分析。在强非线性边界区域，模型可能出现高频振铃（Ringing Artifacts）或频谱泄漏现象（红框所示），这通常源于固定网格对复杂边界几何的离散化误差。</w:t>
+        <w:t xml:space="preserve">图 4-7: 典型失败案例分析。在强非线性边界区域，模型可能出现高频振铃（Ringing Artifacts）或频谱泄漏现象（红框所示），这通常源于固定网格对复杂边界几何的离散化误差。</w:t>
       </w:r>
     </w:p>
     <w:p>
@@ -6698,9 +6895,9 @@
         </w:pict>
       </w:r>
     </w:p>
-    <w:bookmarkEnd w:id="44"/>
-    <w:bookmarkEnd w:id="45"/>
-    <w:bookmarkStart w:id="55" w:name="核心机制与消融实验-mechanism-ablation"/>
+    <w:bookmarkEnd w:id="47"/>
+    <w:bookmarkEnd w:id="48"/>
+    <w:bookmarkStart w:id="58" w:name="核心机制与消融实验-mechanism-ablation"/>
     <w:p>
       <w:pPr>
         <w:pStyle w:val="2"/>
@@ -6709,7 +6906,7 @@
         <w:t xml:space="preserve">4.3 核心机制与消融实验 (Mechanism &amp; Ablation)</w:t>
       </w:r>
     </w:p>
-    <w:bookmarkStart w:id="49" w:name="Xe9af985816b247091b0e238c22d05479edecd13"/>
+    <w:bookmarkStart w:id="52" w:name="Xe9af985816b247091b0e238c22d05479edecd13"/>
     <w:p>
       <w:pPr>
         <w:pStyle w:val="3"/>
@@ -8578,18 +8775,18 @@
           <wp:inline>
             <wp:extent cx="5504749" cy="3669832"/>
             <wp:effectExtent b="0" l="0" r="0" t="0"/>
-            <wp:docPr descr="图 4-6: 损失函数消融实验的验证集 Rel-L2 曲线对比。引入物理感知损失（Full Loss）后，UNet 模型的收敛平台显著降低，证明了物理约束对解空间的有效收缩作用。" title="" id="47" name="Picture"/>
+            <wp:docPr descr="图 4-8: 损失函数消融实验的验证集 Rel-L2 曲线对比。引入物理感知损失（Full Loss）后，UNet 模型的收敛平台显著降低，证明了物理约束对解空间的有效收缩作用。" title="" id="50" name="Picture"/>
             <a:graphic>
               <a:graphicData uri="http://schemas.openxmlformats.org/drawingml/2006/picture">
                 <pic:pic>
                   <pic:nvPicPr>
-                    <pic:cNvPr descr="images/fig4-6_ablation_curves.png" id="48" name="Picture"/>
+                    <pic:cNvPr descr="images/fig4-6_ablation_curves.png" id="51" name="Picture"/>
                     <pic:cNvPicPr>
                       <a:picLocks noChangeArrowheads="1" noChangeAspect="1"/>
                     </pic:cNvPicPr>
                   </pic:nvPicPr>
                   <pic:blipFill>
-                    <a:blip r:embed="rId46"/>
+                    <a:blip r:embed="rId49"/>
                     <a:stretch>
                       <a:fillRect/>
                     </a:stretch>
@@ -8621,11 +8818,11 @@
         <w:pStyle w:val="ImageCaption"/>
       </w:pPr>
       <w:r>
-        <w:t xml:space="preserve">图 4-6: 损失函数消融实验的验证集 Rel-L2 曲线对比。引入物理感知损失（Full Loss）后，UNet 模型的收敛平台显著降低，证明了物理约束对解空间的有效收缩作用。</w:t>
+        <w:t xml:space="preserve">图 4-8: 损失函数消融实验的验证集 Rel-L2 曲线对比。引入物理感知损失（Full Loss）后，UNet 模型的收敛平台显著降低，证明了物理约束对解空间的有效收缩作用。</w:t>
       </w:r>
     </w:p>
-    <w:bookmarkEnd w:id="49"/>
-    <w:bookmarkStart w:id="53" w:name="序列化训练的必要性-sequential-training-strategy"/>
+    <w:bookmarkEnd w:id="52"/>
+    <w:bookmarkStart w:id="56" w:name="序列化训练的必要性-sequential-training-strategy"/>
     <w:p>
       <w:pPr>
         <w:pStyle w:val="3"/>
@@ -9218,18 +9415,18 @@
           <wp:inline>
             <wp:extent cx="5504749" cy="3669832"/>
             <wp:effectExtent b="0" l="0" r="0" t="0"/>
-            <wp:docPr descr="图 4-7: 序列化课程学习策略（Sequential Curriculum Learning）的训练演进曲线。从 Stage 2（冻结空间）切换到 Stage 3（全参数微调）时，高频误差（fRMSE-High，红线）显著下降，表明联合微调有效恢复了物理场的细节结构。" title="" id="51" name="Picture"/>
+            <wp:docPr descr="图 4-9: 序列化课程学习策略（Sequential Curriculum Learning）的训练演进曲线。从 Stage 2（冻结空间）切换到 Stage 3（全参数微调）时，高频误差（fRMSE-High，红线）显著下降，表明联合微调有效恢复了物理场的细节结构。" title="" id="54" name="Picture"/>
             <a:graphic>
               <a:graphicData uri="http://schemas.openxmlformats.org/drawingml/2006/picture">
                 <pic:pic>
                   <pic:nvPicPr>
-                    <pic:cNvPr descr="images/fig4-5_sequential_evolution.png" id="52" name="Picture"/>
+                    <pic:cNvPr descr="images/fig4-5_sequential_evolution.png" id="55" name="Picture"/>
                     <pic:cNvPicPr>
                       <a:picLocks noChangeArrowheads="1" noChangeAspect="1"/>
                     </pic:cNvPicPr>
                   </pic:nvPicPr>
                   <pic:blipFill>
-                    <a:blip r:embed="rId50"/>
+                    <a:blip r:embed="rId53"/>
                     <a:stretch>
                       <a:fillRect/>
                     </a:stretch>
@@ -9261,7 +9458,7 @@
         <w:pStyle w:val="ImageCaption"/>
       </w:pPr>
       <w:r>
-        <w:t xml:space="preserve">图 4-7: 序列化课程学习策略（Sequential Curriculum Learning）的训练演进曲线。从 Stage 2（冻结空间）切换到 Stage 3（全参数微调）时，高频误差（fRMSE-High，红线）显著下降，表明联合微调有效恢复了物理场的细节结构。</w:t>
+        <w:t xml:space="preserve">图 4-9: 序列化课程学习策略（Sequential Curriculum Learning）的训练演进曲线。从 Stage 2（冻结空间）切换到 Stage 3（全参数微调）时，高频误差（fRMSE-High，红线）显著下降，表明联合微调有效恢复了物理场的细节结构。</w:t>
       </w:r>
     </w:p>
     <w:p>
@@ -9630,8 +9827,8 @@
         </w:tc>
       </w:tr>
     </w:tbl>
-    <w:bookmarkEnd w:id="53"/>
-    <w:bookmarkStart w:id="54" w:name="架构性能归因分析-architecture-attribution"/>
+    <w:bookmarkEnd w:id="56"/>
+    <w:bookmarkStart w:id="57" w:name="架构性能归因分析-architecture-attribution"/>
     <w:p>
       <w:pPr>
         <w:pStyle w:val="3"/>
@@ -9712,9 +9909,9 @@
         </w:pict>
       </w:r>
     </w:p>
-    <w:bookmarkEnd w:id="54"/>
-    <w:bookmarkEnd w:id="55"/>
-    <w:bookmarkStart w:id="62" w:name="Xb8ecca8aa3db901e98cb84a10acfe772eb421d2"/>
+    <w:bookmarkEnd w:id="57"/>
+    <w:bookmarkEnd w:id="58"/>
+    <w:bookmarkStart w:id="65" w:name="Xb8ecca8aa3db901e98cb84a10acfe772eb421d2"/>
     <w:p>
       <w:pPr>
         <w:pStyle w:val="2"/>
@@ -9723,7 +9920,7 @@
         <w:t xml:space="preserve">4.4 鲁棒性、边界与效率 (Robustness, Boundaries &amp; Efficiency)</w:t>
       </w:r>
     </w:p>
-    <w:bookmarkStart w:id="56" w:name="噪声与跨域鲁棒性-noise-generalization"/>
+    <w:bookmarkStart w:id="59" w:name="噪声与跨域鲁棒性-noise-generalization"/>
     <w:p>
       <w:pPr>
         <w:pStyle w:val="3"/>
@@ -10029,8 +10226,8 @@
         <w:t xml:space="preserve">的范式具备处理不同物理机制的通用潜力。</w:t>
       </w:r>
     </w:p>
-    <w:bookmarkEnd w:id="56"/>
-    <w:bookmarkStart w:id="57" w:name="极度稀疏边界-extreme-sparsity"/>
+    <w:bookmarkEnd w:id="59"/>
+    <w:bookmarkStart w:id="60" w:name="极度稀疏边界-extreme-sparsity"/>
     <w:p>
       <w:pPr>
         <w:pStyle w:val="3"/>
@@ -11189,8 +11386,8 @@
         <w:t xml:space="preserve">始终保持在极低水平。</w:t>
       </w:r>
     </w:p>
-    <w:bookmarkEnd w:id="57"/>
-    <w:bookmarkStart w:id="61" w:name="资源效率分析-resource-efficiency"/>
+    <w:bookmarkEnd w:id="60"/>
+    <w:bookmarkStart w:id="64" w:name="资源效率分析-resource-efficiency"/>
     <w:p>
       <w:pPr>
         <w:pStyle w:val="3"/>
@@ -11561,18 +11758,18 @@
           <wp:inline>
             <wp:extent cx="5504749" cy="4587290"/>
             <wp:effectExtent b="0" l="0" r="0" t="0"/>
-            <wp:docPr descr="图 4-8: 不同模型架构在 SWE 任务上的资源-精度权衡（Pareto Frontier）。横轴为计算量 (GFLOPs)，纵轴为相对误差 (Rel-L2)。Ours (EDSR) 位于左下角的帕累托最优区域，表明其在有限算力预算下实现了最佳的重建精度，具备边缘部署潜力。" title="" id="59" name="Picture"/>
+            <wp:docPr descr="图 4-10: 不同模型架构在 SWE 任务上的资源-精度权衡（Pareto Frontier）。横轴为计算量 (GFLOPs)，纵轴为相对误差 (Rel-L2)。Ours (EDSR) 位于左下角的帕累托最优区域，表明其在有限算力预算下实现了最佳的重建精度，具备边缘部署潜力。" title="" id="62" name="Picture"/>
             <a:graphic>
               <a:graphicData uri="http://schemas.openxmlformats.org/drawingml/2006/picture">
                 <pic:pic>
                   <pic:nvPicPr>
-                    <pic:cNvPr descr="images/fig4-3_pareto_frontier.png" id="60" name="Picture"/>
+                    <pic:cNvPr descr="images/fig4-3_pareto_frontier.png" id="63" name="Picture"/>
                     <pic:cNvPicPr>
                       <a:picLocks noChangeArrowheads="1" noChangeAspect="1"/>
                     </pic:cNvPicPr>
                   </pic:nvPicPr>
                   <pic:blipFill>
-                    <a:blip r:embed="rId58"/>
+                    <a:blip r:embed="rId61"/>
                     <a:stretch>
                       <a:fillRect/>
                     </a:stretch>
@@ -11604,7 +11801,7 @@
         <w:pStyle w:val="ImageCaption"/>
       </w:pPr>
       <w:r>
-        <w:t xml:space="preserve">图 4-8: 不同模型架构在 SWE 任务上的资源-精度权衡（Pareto Frontier）。横轴为计算量 (GFLOPs)，纵轴为相对误差 (Rel-L2)。Ours (EDSR) 位于左下角的帕累托最优区域，表明其在有限算力预算下实现了最佳的重建精度，具备边缘部署潜力。</w:t>
+        <w:t xml:space="preserve">图 4-10: 不同模型架构在 SWE 任务上的资源-精度权衡（Pareto Frontier）。横轴为计算量 (GFLOPs)，纵轴为相对误差 (Rel-L2)。Ours (EDSR) 位于左下角的帕累托最优区域，表明其在有限算力预算下实现了最佳的重建精度，具备边缘部署潜力。</w:t>
       </w:r>
     </w:p>
     <w:p>
@@ -11614,9 +11811,9 @@
         </w:pict>
       </w:r>
     </w:p>
-    <w:bookmarkEnd w:id="61"/>
-    <w:bookmarkEnd w:id="62"/>
-    <w:bookmarkStart w:id="63" w:name="本章小结"/>
+    <w:bookmarkEnd w:id="64"/>
+    <w:bookmarkEnd w:id="65"/>
+    <w:bookmarkStart w:id="66" w:name="本章小结"/>
     <w:p>
       <w:pPr>
         <w:pStyle w:val="2"/>
@@ -11791,8 +11988,8 @@
         </w:pict>
       </w:r>
     </w:p>
-    <w:bookmarkEnd w:id="63"/>
-    <w:bookmarkStart w:id="64" w:name="参考文献-references"/>
+    <w:bookmarkEnd w:id="66"/>
+    <w:bookmarkStart w:id="67" w:name="参考文献-references"/>
     <w:p>
       <w:pPr>
         <w:pStyle w:val="2"/>
@@ -11825,8 +12022,8 @@
         <w:t xml:space="preserve">[3] Wilkinson M D, Dumontier M, Aalbersberg I J, et al. The FAIR Guiding Principles for scientific data management and stewardship[J]. Scientific Data, 2016, 3: 160018.</w:t>
       </w:r>
     </w:p>
-    <w:bookmarkEnd w:id="64"/>
-    <w:bookmarkEnd w:id="65"/>
+    <w:bookmarkEnd w:id="67"/>
+    <w:bookmarkEnd w:id="68"/>
     <w:sectPr>
       <w:headerReference r:id="rId12" w:type="even"/>
       <w:headerReference r:id="rId10" w:type="default"/>

</xml_diff>

<commit_message>
Update: thesis manuscript (ch4+notation), figures scripts, loss functions, and generated visuals
</commit_message>
<xml_diff>
--- a/thesis_paper/manuscript_5_chapter/docx_output/chapter4_results_verification.docx
+++ b/thesis_paper/manuscript_5_chapter/docx_output/chapter4_results_verification.docx
@@ -2,7 +2,7 @@
 <file path=word/document.xml><?xml version="1.0" encoding="utf-8"?>
 <w:document xmlns:w="http://schemas.openxmlformats.org/wordprocessingml/2006/main" xmlns:m="http://schemas.openxmlformats.org/officeDocument/2006/math" xmlns:r="http://schemas.openxmlformats.org/officeDocument/2006/relationships" xmlns:o="urn:schemas-microsoft-com:office:office" xmlns:v="urn:schemas-microsoft-com:vml" xmlns:w10="urn:schemas-microsoft-com:office:word" xmlns:a="http://schemas.openxmlformats.org/drawingml/2006/main" xmlns:pic="http://schemas.openxmlformats.org/drawingml/2006/picture" xmlns:wp="http://schemas.openxmlformats.org/drawingml/2006/wordprocessingDrawing">
   <w:body>
-    <w:bookmarkStart w:id="68" w:name="第4章-实验结果与分析"/>
+    <w:bookmarkStart w:id="71" w:name="第4章-实验结果与分析"/>
     <w:p>
       <w:pPr>
         <w:pStyle w:val="1"/>
@@ -26,126 +26,126 @@
         <w:t xml:space="preserve">统一观测口径（H/DC 同源复用）+ 三件套损失（</w:t>
       </w:r>
       <m:oMath>
-        <m:sSub>
-          <m:e>
-            <m:r>
-              <m:t>L</m:t>
-            </m:r>
-          </m:e>
-          <m:sub>
-            <m:r>
-              <m:rPr>
-                <m:sty m:val="p"/>
-              </m:rPr>
-              <m:t>r</m:t>
-            </m:r>
-            <m:r>
-              <m:rPr>
-                <m:sty m:val="p"/>
-              </m:rPr>
-              <m:t>e</m:t>
-            </m:r>
-            <m:r>
-              <m:rPr>
-                <m:sty m:val="p"/>
-              </m:rPr>
-              <m:t>c</m:t>
-            </m:r>
-          </m:sub>
-        </m:sSub>
+        <m:r>
+          <m:t>L</m:t>
+        </m:r>
+        <m:r>
+          <m:rPr>
+            <m:sty m:val="p"/>
+          </m:rPr>
+          <m:t>_</m:t>
+        </m:r>
+        <m:r>
+          <m:rPr>
+            <m:sty m:val="p"/>
+          </m:rPr>
+          <m:t>r</m:t>
+        </m:r>
+        <m:r>
+          <m:rPr>
+            <m:sty m:val="p"/>
+          </m:rPr>
+          <m:t>e</m:t>
+        </m:r>
+        <m:r>
+          <m:rPr>
+            <m:sty m:val="p"/>
+          </m:rPr>
+          <m:t>c</m:t>
+        </m:r>
         <m:r>
           <m:rPr>
             <m:sty m:val="p"/>
           </m:rPr>
           <m:t>+</m:t>
         </m:r>
-        <m:sSub>
-          <m:e>
-            <m:r>
-              <m:t>λ</m:t>
-            </m:r>
-          </m:e>
-          <m:sub>
-            <m:r>
-              <m:t>s</m:t>
-            </m:r>
-          </m:sub>
-        </m:sSub>
-        <m:sSub>
-          <m:e>
-            <m:r>
-              <m:t>L</m:t>
-            </m:r>
-          </m:e>
-          <m:sub>
-            <m:r>
-              <m:rPr>
-                <m:sty m:val="p"/>
-              </m:rPr>
-              <m:t>s</m:t>
-            </m:r>
-            <m:r>
-              <m:rPr>
-                <m:sty m:val="p"/>
-              </m:rPr>
-              <m:t>p</m:t>
-            </m:r>
-            <m:r>
-              <m:rPr>
-                <m:sty m:val="p"/>
-              </m:rPr>
-              <m:t>e</m:t>
-            </m:r>
-            <m:r>
-              <m:rPr>
-                <m:sty m:val="p"/>
-              </m:rPr>
-              <m:t>c</m:t>
-            </m:r>
-          </m:sub>
-        </m:sSub>
+        <m:r>
+          <m:t>λ</m:t>
+        </m:r>
+        <m:r>
+          <m:rPr>
+            <m:sty m:val="p"/>
+          </m:rPr>
+          <m:t>_</m:t>
+        </m:r>
+        <m:r>
+          <m:t>s</m:t>
+        </m:r>
+        <m:r>
+          <m:t>L</m:t>
+        </m:r>
+        <m:r>
+          <m:rPr>
+            <m:sty m:val="p"/>
+          </m:rPr>
+          <m:t>_</m:t>
+        </m:r>
+        <m:r>
+          <m:rPr>
+            <m:sty m:val="p"/>
+          </m:rPr>
+          <m:t>s</m:t>
+        </m:r>
+        <m:r>
+          <m:rPr>
+            <m:sty m:val="p"/>
+          </m:rPr>
+          <m:t>p</m:t>
+        </m:r>
+        <m:r>
+          <m:rPr>
+            <m:sty m:val="p"/>
+          </m:rPr>
+          <m:t>e</m:t>
+        </m:r>
+        <m:r>
+          <m:rPr>
+            <m:sty m:val="p"/>
+          </m:rPr>
+          <m:t>c</m:t>
+        </m:r>
         <m:r>
           <m:rPr>
             <m:sty m:val="p"/>
           </m:rPr>
           <m:t>+</m:t>
         </m:r>
-        <m:sSub>
-          <m:e>
-            <m:r>
-              <m:t>λ</m:t>
-            </m:r>
-          </m:e>
-          <m:sub>
-            <m:r>
-              <m:t>d</m:t>
-            </m:r>
-            <m:r>
-              <m:t>c</m:t>
-            </m:r>
-          </m:sub>
-        </m:sSub>
-        <m:sSub>
-          <m:e>
-            <m:r>
-              <m:t>L</m:t>
-            </m:r>
-          </m:e>
-          <m:sub>
-            <m:r>
-              <m:rPr>
-                <m:sty m:val="p"/>
-              </m:rPr>
-              <m:t>d</m:t>
-            </m:r>
-            <m:r>
-              <m:rPr>
-                <m:sty m:val="p"/>
-              </m:rPr>
-              <m:t>c</m:t>
-            </m:r>
-          </m:sub>
-        </m:sSub>
+        <m:r>
+          <m:t>λ</m:t>
+        </m:r>
+        <m:r>
+          <m:rPr>
+            <m:sty m:val="p"/>
+          </m:rPr>
+          <m:t>_</m:t>
+        </m:r>
+        <m:r>
+          <m:t>d</m:t>
+        </m:r>
+        <m:r>
+          <m:t>c</m:t>
+        </m:r>
+        <m:r>
+          <m:t>L</m:t>
+        </m:r>
+        <m:r>
+          <m:rPr>
+            <m:sty m:val="p"/>
+          </m:rPr>
+          <m:t>_</m:t>
+        </m:r>
+        <m:r>
+          <m:rPr>
+            <m:sty m:val="p"/>
+          </m:rPr>
+          <m:t>d</m:t>
+        </m:r>
+        <m:r>
+          <m:rPr>
+            <m:sty m:val="p"/>
+          </m:rPr>
+          <m:t>c</m:t>
+        </m:r>
       </m:oMath>
       <w:r>
         <w:rPr>
@@ -329,15 +329,15 @@
       <w:r>
         <w:t xml:space="preserve">涵盖两类典型稀疏观测场景：</w:t>
       </w:r>
-      <w:r>
-        <w:t xml:space="preserve"> </w:t>
-      </w:r>
-      <w:r>
-        <w:t xml:space="preserve">*</w:t>
-      </w:r>
-      <w:r>
-        <w:t xml:space="preserve"> </w:t>
-      </w:r>
+    </w:p>
+    <w:p>
+      <w:pPr>
+        <w:numPr>
+          <w:ilvl w:val="0"/>
+          <w:numId w:val="1004"/>
+        </w:numPr>
+        <w:pStyle w:val="Compact"/>
+      </w:pPr>
       <w:r>
         <w:rPr>
           <w:bCs/>
@@ -399,15 +399,15 @@
       <w:r>
         <w:t xml:space="preserve">。</w:t>
       </w:r>
-      <w:r>
-        <w:t xml:space="preserve"> </w:t>
-      </w:r>
-      <w:r>
-        <w:t xml:space="preserve">*</w:t>
-      </w:r>
-      <w:r>
-        <w:t xml:space="preserve"> </w:t>
-      </w:r>
+    </w:p>
+    <w:p>
+      <w:pPr>
+        <w:numPr>
+          <w:ilvl w:val="0"/>
+          <w:numId w:val="1004"/>
+        </w:numPr>
+        <w:pStyle w:val="Compact"/>
+      </w:pPr>
       <w:r>
         <w:rPr>
           <w:bCs/>
@@ -439,12 +439,6 @@
         <m:r>
           <m:t>40</m:t>
         </m:r>
-        <m:r>
-          <m:rPr>
-            <m:sty m:val="p"/>
-          </m:rPr>
-          <m:t>%</m:t>
-        </m:r>
       </m:oMath>
       <w:r>
         <w:t xml:space="preserve"> </w:t>
@@ -458,85 +452,85 @@
       <m:oMath>
         <m:r>
           <m:t>20</m:t>
+        </m:r>
+      </m:oMath>
+      <w:r>
+        <w:t xml:space="preserve">。</w:t>
+      </w:r>
+    </w:p>
+    <w:bookmarkEnd w:id="20"/>
+    <w:bookmarkStart w:id="21" w:name="训练与环境设置-training-environmental-setup"/>
+    <w:p>
+      <w:pPr>
+        <w:pStyle w:val="3"/>
+      </w:pPr>
+      <w:r>
+        <w:t xml:space="preserve">4.1.2 训练与环境设置 (Training &amp; Environmental Setup)</w:t>
+      </w:r>
+    </w:p>
+    <w:p>
+      <w:pPr>
+        <w:pStyle w:val="11"/>
+      </w:pPr>
+      <w:r>
+        <w:t xml:space="preserve">为确保实验结果的公平性与可复现性，所有实验均在统一的软硬件环境下执行，并遵循严格的参数配置协议。</w:t>
+      </w:r>
+    </w:p>
+    <w:p>
+      <w:pPr>
+        <w:pStyle w:val="11"/>
+      </w:pPr>
+      <w:r>
+        <w:rPr>
+          <w:bCs/>
+          <w:b/>
+        </w:rPr>
+        <w:t xml:space="preserve">1. 优化器与超参数 (Optimization)</w:t>
+      </w:r>
+    </w:p>
+    <w:p>
+      <w:pPr>
+        <w:numPr>
+          <w:ilvl w:val="0"/>
+          <w:numId w:val="1005"/>
+        </w:numPr>
+        <w:pStyle w:val="Compact"/>
+      </w:pPr>
+      <w:r>
+        <w:rPr>
+          <w:bCs/>
+          <w:b/>
+        </w:rPr>
+        <w:t xml:space="preserve">优化器 (Optimizer)</w:t>
+      </w:r>
+      <w:r>
+        <w:t xml:space="preserve">：采用 AdamW 优化器，以实现权重衰减与梯度更新的解耦。</w:t>
+      </w:r>
+    </w:p>
+    <w:p>
+      <w:pPr>
+        <w:numPr>
+          <w:ilvl w:val="1"/>
+          <w:numId w:val="1006"/>
+        </w:numPr>
+        <w:pStyle w:val="Compact"/>
+      </w:pPr>
+      <w:r>
+        <w:t xml:space="preserve">动量参数：</w:t>
+      </w:r>
+      <m:oMath>
+        <m:r>
+          <m:t>β</m:t>
         </m:r>
         <m:r>
           <m:rPr>
             <m:sty m:val="p"/>
           </m:rPr>
-          <m:t>%</m:t>
+          <m:t>_</m:t>
         </m:r>
-      </m:oMath>
-      <w:r>
-        <w:t xml:space="preserve">。</w:t>
-      </w:r>
-    </w:p>
-    <w:bookmarkEnd w:id="20"/>
-    <w:bookmarkStart w:id="21" w:name="训练与环境设置-training-environmental-setup"/>
-    <w:p>
-      <w:pPr>
-        <w:pStyle w:val="3"/>
-      </w:pPr>
-      <w:r>
-        <w:t xml:space="preserve">4.1.2 训练与环境设置 (Training &amp; Environmental Setup)</w:t>
-      </w:r>
-    </w:p>
-    <w:p>
-      <w:pPr>
-        <w:pStyle w:val="11"/>
-      </w:pPr>
-      <w:r>
-        <w:t xml:space="preserve">为确保实验结果的公平性与可复现性，所有实验均在统一的软硬件环境下执行，并遵循严格的参数配置协议。</w:t>
-      </w:r>
-    </w:p>
-    <w:p>
-      <w:pPr>
-        <w:pStyle w:val="11"/>
-      </w:pPr>
-      <w:r>
-        <w:rPr>
-          <w:bCs/>
-          <w:b/>
-        </w:rPr>
-        <w:t xml:space="preserve">1. 优化器与超参数 (Optimization)</w:t>
-      </w:r>
-      <w:r>
-        <w:t xml:space="preserve"> </w:t>
-      </w:r>
-      <w:r>
-        <w:t xml:space="preserve">*</w:t>
-      </w:r>
-      <w:r>
-        <w:t xml:space="preserve"> </w:t>
-      </w:r>
-      <w:r>
-        <w:rPr>
-          <w:bCs/>
-          <w:b/>
-        </w:rPr>
-        <w:t xml:space="preserve">优化器 (Optimizer)</w:t>
-      </w:r>
-      <w:r>
-        <w:t xml:space="preserve">：采用 AdamW 优化器，以实现权重衰减与梯度更新的解耦。</w:t>
-      </w:r>
-      <w:r>
-        <w:t xml:space="preserve"> </w:t>
-      </w:r>
-      <w:r>
-        <w:t xml:space="preserve">* 动量参数：</w:t>
-      </w:r>
-      <m:oMath>
-        <m:sSub>
-          <m:e>
-            <m:r>
-              <m:t>β</m:t>
-            </m:r>
-          </m:e>
-          <m:sub>
-            <m:r>
-              <m:t>1</m:t>
-            </m:r>
-          </m:sub>
-        </m:sSub>
+        <m:r>
+          <m:t>1</m:t>
+        </m:r>
         <m:r>
           <m:rPr>
             <m:sty m:val="p"/>
@@ -552,18 +546,18 @@
           </m:rPr>
           <m:t>,</m:t>
         </m:r>
-        <m:sSub>
-          <m:e>
-            <m:r>
-              <m:t>β</m:t>
-            </m:r>
-          </m:e>
-          <m:sub>
-            <m:r>
-              <m:t>2</m:t>
-            </m:r>
-          </m:sub>
-        </m:sSub>
+        <m:r>
+          <m:t>β</m:t>
+        </m:r>
+        <m:r>
+          <m:rPr>
+            <m:sty m:val="p"/>
+          </m:rPr>
+          <m:t>_</m:t>
+        </m:r>
+        <m:r>
+          <m:t>2</m:t>
+        </m:r>
         <m:r>
           <m:rPr>
             <m:sty m:val="p"/>
@@ -574,11 +568,17 @@
           <m:t>0.999</m:t>
         </m:r>
       </m:oMath>
-      <w:r>
-        <w:t xml:space="preserve"> </w:t>
-      </w:r>
-      <w:r>
-        <w:t xml:space="preserve">* 权重衰减 (Weight Decay)：</w:t>
+    </w:p>
+    <w:p>
+      <w:pPr>
+        <w:numPr>
+          <w:ilvl w:val="1"/>
+          <w:numId w:val="1006"/>
+        </w:numPr>
+        <w:pStyle w:val="Compact"/>
+      </w:pPr>
+      <w:r>
+        <w:t xml:space="preserve">权重衰减 (Weight Decay)：</w:t>
       </w:r>
       <m:oMath>
         <m:r>
@@ -609,15 +609,15 @@
           </m:sup>
         </m:sSup>
       </m:oMath>
-      <w:r>
-        <w:t xml:space="preserve"> </w:t>
-      </w:r>
-      <w:r>
-        <w:t xml:space="preserve">*</w:t>
-      </w:r>
-      <w:r>
-        <w:t xml:space="preserve"> </w:t>
-      </w:r>
+    </w:p>
+    <w:p>
+      <w:pPr>
+        <w:numPr>
+          <w:ilvl w:val="0"/>
+          <w:numId w:val="1005"/>
+        </w:numPr>
+        <w:pStyle w:val="Compact"/>
+      </w:pPr>
       <w:r>
         <w:rPr>
           <w:bCs/>
@@ -628,17 +628,29 @@
       <w:r>
         <w:t xml:space="preserve">：</w:t>
       </w:r>
-      <w:r>
-        <w:t xml:space="preserve"> </w:t>
-      </w:r>
-      <w:r>
-        <w:t xml:space="preserve">* 策略：余弦退火 (Cosine Annealing)</w:t>
-      </w:r>
-      <w:r>
-        <w:t xml:space="preserve"> </w:t>
-      </w:r>
-      <w:r>
-        <w:t xml:space="preserve">* 初始学习率：</w:t>
+    </w:p>
+    <w:p>
+      <w:pPr>
+        <w:numPr>
+          <w:ilvl w:val="1"/>
+          <w:numId w:val="1007"/>
+        </w:numPr>
+        <w:pStyle w:val="Compact"/>
+      </w:pPr>
+      <w:r>
+        <w:t xml:space="preserve">策略：余弦退火 (Cosine Annealing)</w:t>
+      </w:r>
+    </w:p>
+    <w:p>
+      <w:pPr>
+        <w:numPr>
+          <w:ilvl w:val="1"/>
+          <w:numId w:val="1007"/>
+        </w:numPr>
+        <w:pStyle w:val="Compact"/>
+      </w:pPr>
+      <w:r>
+        <w:t xml:space="preserve">初始学习率：</w:t>
       </w:r>
       <m:oMath>
         <m:r>
@@ -669,21 +681,27 @@
           </m:sup>
         </m:sSup>
       </m:oMath>
-      <w:r>
-        <w:t xml:space="preserve"> </w:t>
-      </w:r>
-      <w:r>
-        <w:t xml:space="preserve">* 预热策略 (Warmup)：前 5 个 epoch 采用线性预热，以缓解训练初期的梯度震荡。</w:t>
-      </w:r>
-      <w:r>
-        <w:t xml:space="preserve"> </w:t>
-      </w:r>
-      <w:r>
-        <w:t xml:space="preserve">*</w:t>
-      </w:r>
-      <w:r>
-        <w:t xml:space="preserve"> </w:t>
-      </w:r>
+    </w:p>
+    <w:p>
+      <w:pPr>
+        <w:numPr>
+          <w:ilvl w:val="1"/>
+          <w:numId w:val="1007"/>
+        </w:numPr>
+        <w:pStyle w:val="Compact"/>
+      </w:pPr>
+      <w:r>
+        <w:t xml:space="preserve">预热策略 (Warmup)：前 5 个 epoch 采用线性预热，以缓解训练初期的梯度震荡。</w:t>
+      </w:r>
+    </w:p>
+    <w:p>
+      <w:pPr>
+        <w:numPr>
+          <w:ilvl w:val="0"/>
+          <w:numId w:val="1005"/>
+        </w:numPr>
+        <w:pStyle w:val="Compact"/>
+      </w:pPr>
       <w:r>
         <w:rPr>
           <w:bCs/>
@@ -712,15 +730,15 @@
       <w:r>
         <w:t xml:space="preserve">针对深度学习实验中常见的“随机性黑盒”问题，本研究实施了以下工程级控制措施：</w:t>
       </w:r>
-      <w:r>
-        <w:t xml:space="preserve"> </w:t>
-      </w:r>
-      <w:r>
-        <w:t xml:space="preserve">*</w:t>
-      </w:r>
-      <w:r>
-        <w:t xml:space="preserve"> </w:t>
-      </w:r>
+    </w:p>
+    <w:p>
+      <w:pPr>
+        <w:numPr>
+          <w:ilvl w:val="0"/>
+          <w:numId w:val="1008"/>
+        </w:numPr>
+        <w:pStyle w:val="Compact"/>
+      </w:pPr>
       <w:r>
         <w:rPr>
           <w:bCs/>
@@ -731,15 +749,15 @@
       <w:r>
         <w:t xml:space="preserve">：统一固定 Python、NumPy 及 PyTorch 的随机种子 (Seed=2025)，确保数据划分与模型初始化的确定性。</w:t>
       </w:r>
-      <w:r>
-        <w:t xml:space="preserve"> </w:t>
-      </w:r>
-      <w:r>
-        <w:t xml:space="preserve">*</w:t>
-      </w:r>
-      <w:r>
-        <w:t xml:space="preserve"> </w:t>
-      </w:r>
+    </w:p>
+    <w:p>
+      <w:pPr>
+        <w:numPr>
+          <w:ilvl w:val="0"/>
+          <w:numId w:val="1008"/>
+        </w:numPr>
+        <w:pStyle w:val="Compact"/>
+      </w:pPr>
       <w:r>
         <w:rPr>
           <w:bCs/>
@@ -774,15 +792,15 @@
       <w:r>
         <w:t xml:space="preserve">，强制使用确定性卷积算法，消除 GPU 并行计算引入的微小数值扰动。</w:t>
       </w:r>
-      <w:r>
-        <w:t xml:space="preserve"> </w:t>
-      </w:r>
-      <w:r>
-        <w:t xml:space="preserve">*</w:t>
-      </w:r>
-      <w:r>
-        <w:t xml:space="preserve"> </w:t>
-      </w:r>
+    </w:p>
+    <w:p>
+      <w:pPr>
+        <w:numPr>
+          <w:ilvl w:val="0"/>
+          <w:numId w:val="1008"/>
+        </w:numPr>
+        <w:pStyle w:val="Compact"/>
+      </w:pPr>
       <w:r>
         <w:rPr>
           <w:bCs/>
@@ -847,10 +865,10 @@
         <w:tblLayout w:type="fixed"/>
       </w:tblPr>
       <w:tblGrid>
-        <w:gridCol w:w="1980"/>
-        <w:gridCol w:w="1980"/>
-        <w:gridCol w:w="1980"/>
-        <w:gridCol w:w="1980"/>
+        <w:gridCol w:w="1271"/>
+        <w:gridCol w:w="880"/>
+        <w:gridCol w:w="3324"/>
+        <w:gridCol w:w="2444"/>
       </w:tblGrid>
       <w:tr>
         <w:trPr>
@@ -982,6 +1000,7 @@
           <w:p>
             <w:pPr>
               <w:pStyle w:val="Compact"/>
+              <w:jc w:val="left"/>
             </w:pPr>
           </w:p>
         </w:tc>
@@ -1028,6 +1047,7 @@
           <w:p>
             <w:pPr>
               <w:pStyle w:val="Compact"/>
+              <w:jc w:val="left"/>
             </w:pPr>
           </w:p>
         </w:tc>
@@ -1145,6 +1165,7 @@
           <w:p>
             <w:pPr>
               <w:pStyle w:val="Compact"/>
+              <w:jc w:val="left"/>
             </w:pPr>
           </w:p>
         </w:tc>
@@ -1191,6 +1212,7 @@
           <w:p>
             <w:pPr>
               <w:pStyle w:val="Compact"/>
+              <w:jc w:val="left"/>
             </w:pPr>
           </w:p>
         </w:tc>
@@ -1237,6 +1259,7 @@
           <w:p>
             <w:pPr>
               <w:pStyle w:val="Compact"/>
+              <w:jc w:val="left"/>
             </w:pPr>
           </w:p>
         </w:tc>
@@ -1283,6 +1306,7 @@
           <w:p>
             <w:pPr>
               <w:pStyle w:val="Compact"/>
+              <w:jc w:val="left"/>
             </w:pPr>
           </w:p>
         </w:tc>
@@ -1363,10 +1387,10 @@
         <w:tblLayout w:type="fixed"/>
       </w:tblPr>
       <w:tblGrid>
-        <w:gridCol w:w="1980"/>
-        <w:gridCol w:w="1980"/>
-        <w:gridCol w:w="1980"/>
-        <w:gridCol w:w="1980"/>
+        <w:gridCol w:w="880"/>
+        <w:gridCol w:w="990"/>
+        <w:gridCol w:w="1265"/>
+        <w:gridCol w:w="4785"/>
       </w:tblGrid>
       <w:tr>
         <w:trPr>
@@ -1700,15 +1724,15 @@
       <w:r>
         <w:t xml:space="preserve">：</w:t>
       </w:r>
-      <w:r>
-        <w:t xml:space="preserve"> </w:t>
-      </w:r>
-      <w:r>
-        <w:t xml:space="preserve">1.</w:t>
-      </w:r>
-      <w:r>
-        <w:t xml:space="preserve"> </w:t>
-      </w:r>
+    </w:p>
+    <w:p>
+      <w:pPr>
+        <w:numPr>
+          <w:ilvl w:val="0"/>
+          <w:numId w:val="1009"/>
+        </w:numPr>
+        <w:pStyle w:val="Compact"/>
+      </w:pPr>
       <w:r>
         <w:rPr>
           <w:bCs/>
@@ -1803,15 +1827,15 @@
       <w:r>
         <w:t xml:space="preserve">。</w:t>
       </w:r>
-      <w:r>
-        <w:t xml:space="preserve"> </w:t>
-      </w:r>
-      <w:r>
-        <w:t xml:space="preserve">2.</w:t>
-      </w:r>
-      <w:r>
-        <w:t xml:space="preserve"> </w:t>
-      </w:r>
+    </w:p>
+    <w:p>
+      <w:pPr>
+        <w:numPr>
+          <w:ilvl w:val="0"/>
+          <w:numId w:val="1009"/>
+        </w:numPr>
+        <w:pStyle w:val="Compact"/>
+      </w:pPr>
       <w:r>
         <w:rPr>
           <w:bCs/>
@@ -1985,7 +2009,7 @@
       <w:pPr>
         <w:numPr>
           <w:ilvl w:val="0"/>
-          <w:numId w:val="1004"/>
+          <w:numId w:val="1010"/>
         </w:numPr>
         <w:pStyle w:val="Compact"/>
       </w:pPr>
@@ -2004,7 +2028,7 @@
       <w:pPr>
         <w:numPr>
           <w:ilvl w:val="1"/>
-          <w:numId w:val="1005"/>
+          <w:numId w:val="1011"/>
         </w:numPr>
         <w:pStyle w:val="Compact"/>
       </w:pPr>
@@ -2094,18 +2118,18 @@
             </m:rPr>
             <m:t>-</m:t>
           </m:r>
-          <m:sSub>
-            <m:e>
-              <m:r>
-                <m:t>L</m:t>
-              </m:r>
-            </m:e>
-            <m:sub>
-              <m:r>
-                <m:t>2</m:t>
-              </m:r>
-            </m:sub>
-          </m:sSub>
+          <m:r>
+            <m:t>L</m:t>
+          </m:r>
+          <m:r>
+            <m:rPr>
+              <m:sty m:val="p"/>
+            </m:rPr>
+            <m:t>_</m:t>
+          </m:r>
+          <m:r>
+            <m:t>2</m:t>
+          </m:r>
           <m:r>
             <m:rPr>
               <m:sty m:val="p"/>
@@ -2148,21 +2172,21 @@
                 </m:rPr>
                 <m:t>U</m:t>
               </m:r>
-              <m:sSub>
-                <m:e>
-                  <m:r>
-                    <m:rPr>
-                      <m:sty m:val="p"/>
-                    </m:rPr>
-                    <m:t>∥</m:t>
-                  </m:r>
-                </m:e>
-                <m:sub>
-                  <m:r>
-                    <m:t>F</m:t>
-                  </m:r>
-                </m:sub>
-              </m:sSub>
+              <m:r>
+                <m:rPr>
+                  <m:sty m:val="p"/>
+                </m:rPr>
+                <m:t>∥</m:t>
+              </m:r>
+              <m:r>
+                <m:rPr>
+                  <m:sty m:val="p"/>
+                </m:rPr>
+                <m:t>_</m:t>
+              </m:r>
+              <m:r>
+                <m:t>F</m:t>
+              </m:r>
             </m:num>
             <m:den>
               <m:r>
@@ -2177,21 +2201,21 @@
                 </m:rPr>
                 <m:t>U</m:t>
               </m:r>
-              <m:sSub>
-                <m:e>
-                  <m:r>
-                    <m:rPr>
-                      <m:sty m:val="p"/>
-                    </m:rPr>
-                    <m:t>∥</m:t>
-                  </m:r>
-                </m:e>
-                <m:sub>
-                  <m:r>
-                    <m:t>F</m:t>
-                  </m:r>
-                </m:sub>
-              </m:sSub>
+              <m:r>
+                <m:rPr>
+                  <m:sty m:val="p"/>
+                </m:rPr>
+                <m:t>∥</m:t>
+              </m:r>
+              <m:r>
+                <m:rPr>
+                  <m:sty m:val="p"/>
+                </m:rPr>
+                <m:t>_</m:t>
+              </m:r>
+              <m:r>
+                <m:t>F</m:t>
+              </m:r>
             </m:den>
           </m:f>
         </m:oMath>
@@ -2201,7 +2225,7 @@
       <w:pPr>
         <w:numPr>
           <w:ilvl w:val="1"/>
-          <w:numId w:val="1005"/>
+          <w:numId w:val="1011"/>
         </w:numPr>
         <w:pStyle w:val="Compact"/>
       </w:pPr>
@@ -2220,7 +2244,7 @@
       <w:pPr>
         <w:numPr>
           <w:ilvl w:val="0"/>
-          <w:numId w:val="1004"/>
+          <w:numId w:val="1010"/>
         </w:numPr>
         <w:pStyle w:val="Compact"/>
       </w:pPr>
@@ -2239,38 +2263,38 @@
       <w:pPr>
         <w:numPr>
           <w:ilvl w:val="1"/>
-          <w:numId w:val="1006"/>
+          <w:numId w:val="1012"/>
         </w:numPr>
         <w:pStyle w:val="Compact"/>
       </w:pPr>
       <m:oMath>
-        <m:sSub>
-          <m:e>
-            <m:r>
-              <m:t>H</m:t>
-            </m:r>
-          </m:e>
-          <m:sub>
-            <m:r>
-              <m:rPr>
-                <m:sty m:val="p"/>
-              </m:rPr>
-              <m:t>e</m:t>
-            </m:r>
-            <m:r>
-              <m:rPr>
-                <m:sty m:val="p"/>
-              </m:rPr>
-              <m:t>r</m:t>
-            </m:r>
-            <m:r>
-              <m:rPr>
-                <m:sty m:val="p"/>
-              </m:rPr>
-              <m:t>r</m:t>
-            </m:r>
-          </m:sub>
-        </m:sSub>
+        <m:r>
+          <m:t>H</m:t>
+        </m:r>
+        <m:r>
+          <m:rPr>
+            <m:sty m:val="p"/>
+          </m:rPr>
+          <m:t>_</m:t>
+        </m:r>
+        <m:r>
+          <m:rPr>
+            <m:sty m:val="p"/>
+          </m:rPr>
+          <m:t>e</m:t>
+        </m:r>
+        <m:r>
+          <m:rPr>
+            <m:sty m:val="p"/>
+          </m:rPr>
+          <m:t>r</m:t>
+        </m:r>
+        <m:r>
+          <m:rPr>
+            <m:sty m:val="p"/>
+          </m:rPr>
+          <m:t>r</m:t>
+        </m:r>
       </m:oMath>
       <w:r>
         <w:rPr>
@@ -2327,33 +2351,33 @@
           <m:jc m:val="center"/>
         </m:oMathParaPr>
         <m:oMath>
-          <m:sSub>
-            <m:e>
-              <m:r>
-                <m:t>H</m:t>
-              </m:r>
-            </m:e>
-            <m:sub>
-              <m:r>
-                <m:rPr>
-                  <m:sty m:val="p"/>
-                </m:rPr>
-                <m:t>e</m:t>
-              </m:r>
-              <m:r>
-                <m:rPr>
-                  <m:sty m:val="p"/>
-                </m:rPr>
-                <m:t>r</m:t>
-              </m:r>
-              <m:r>
-                <m:rPr>
-                  <m:sty m:val="p"/>
-                </m:rPr>
-                <m:t>r</m:t>
-              </m:r>
-            </m:sub>
-          </m:sSub>
+          <m:r>
+            <m:t>H</m:t>
+          </m:r>
+          <m:r>
+            <m:rPr>
+              <m:sty m:val="p"/>
+            </m:rPr>
+            <m:t>_</m:t>
+          </m:r>
+          <m:r>
+            <m:rPr>
+              <m:sty m:val="p"/>
+            </m:rPr>
+            <m:t>e</m:t>
+          </m:r>
+          <m:r>
+            <m:rPr>
+              <m:sty m:val="p"/>
+            </m:rPr>
+            <m:t>r</m:t>
+          </m:r>
+          <m:r>
+            <m:rPr>
+              <m:sty m:val="p"/>
+            </m:rPr>
+            <m:t>r</m:t>
+          </m:r>
           <m:r>
             <m:rPr>
               <m:sty m:val="p"/>
@@ -2404,21 +2428,21 @@
             </m:rPr>
             <m:t>y</m:t>
           </m:r>
-          <m:sSub>
-            <m:e>
-              <m:r>
-                <m:rPr>
-                  <m:sty m:val="p"/>
-                </m:rPr>
-                <m:t>∥</m:t>
-              </m:r>
-            </m:e>
-            <m:sub>
-              <m:r>
-                <m:t>F</m:t>
-              </m:r>
-            </m:sub>
-          </m:sSub>
+          <m:r>
+            <m:rPr>
+              <m:sty m:val="p"/>
+            </m:rPr>
+            <m:t>∥</m:t>
+          </m:r>
+          <m:r>
+            <m:rPr>
+              <m:sty m:val="p"/>
+            </m:rPr>
+            <m:t>_</m:t>
+          </m:r>
+          <m:r>
+            <m:t>F</m:t>
+          </m:r>
         </m:oMath>
       </m:oMathPara>
     </w:p>
@@ -2426,7 +2450,7 @@
       <w:pPr>
         <w:numPr>
           <w:ilvl w:val="1"/>
-          <w:numId w:val="1006"/>
+          <w:numId w:val="1012"/>
         </w:numPr>
         <w:pStyle w:val="Compact"/>
       </w:pPr>
@@ -2455,7 +2479,7 @@
       <w:pPr>
         <w:numPr>
           <w:ilvl w:val="0"/>
-          <w:numId w:val="1007"/>
+          <w:numId w:val="1013"/>
         </w:numPr>
         <w:pStyle w:val="Compact"/>
       </w:pPr>
@@ -2474,7 +2498,7 @@
       <w:pPr>
         <w:numPr>
           <w:ilvl w:val="0"/>
-          <w:numId w:val="1007"/>
+          <w:numId w:val="1013"/>
         </w:numPr>
         <w:pStyle w:val="Compact"/>
       </w:pPr>
@@ -2570,13 +2594,14 @@
         <w:tblLayout w:type="fixed"/>
       </w:tblPr>
       <w:tblGrid>
-        <w:gridCol w:w="960"/>
-        <w:gridCol w:w="1200"/>
-        <w:gridCol w:w="1200"/>
-        <w:gridCol w:w="1200"/>
-        <w:gridCol w:w="1200"/>
-        <w:gridCol w:w="1200"/>
-        <w:gridCol w:w="960"/>
+        <w:gridCol w:w="1033"/>
+        <w:gridCol w:w="573"/>
+        <w:gridCol w:w="516"/>
+        <w:gridCol w:w="803"/>
+        <w:gridCol w:w="1090"/>
+        <w:gridCol w:w="1147"/>
+        <w:gridCol w:w="1836"/>
+        <w:gridCol w:w="918"/>
       </w:tblGrid>
       <w:tr>
         <w:trPr>
@@ -2681,6 +2706,55 @@
           <w:p>
             <w:pPr>
               <w:pStyle w:val="Compact"/>
+              <w:jc w:val="center"/>
+            </w:pPr>
+            <m:oMath>
+              <m:r>
+                <m:t>H</m:t>
+              </m:r>
+              <m:r>
+                <m:rPr>
+                  <m:sty m:val="p"/>
+                </m:rPr>
+                <m:t>_</m:t>
+              </m:r>
+              <m:r>
+                <m:rPr>
+                  <m:sty m:val="p"/>
+                </m:rPr>
+                <m:t>e</m:t>
+              </m:r>
+              <m:r>
+                <m:rPr>
+                  <m:sty m:val="p"/>
+                </m:rPr>
+                <m:t>r</m:t>
+              </m:r>
+              <m:r>
+                <m:rPr>
+                  <m:sty m:val="p"/>
+                </m:rPr>
+                <m:t>r</m:t>
+              </m:r>
+            </m:oMath>
+            <w:r>
+              <w:t xml:space="preserve"> </w:t>
+            </w:r>
+            <m:oMath>
+              <m:r>
+                <m:rPr>
+                  <m:sty m:val="p"/>
+                </m:rPr>
+                <m:t>↓</m:t>
+              </m:r>
+            </m:oMath>
+          </w:p>
+        </w:tc>
+        <w:tc>
+          <w:tcPr/>
+          <w:p>
+            <w:pPr>
+              <w:pStyle w:val="Compact"/>
               <w:jc w:val="left"/>
             </w:pPr>
             <w:r>
@@ -2783,6 +2857,22 @@
           <w:p>
             <w:pPr>
               <w:pStyle w:val="Compact"/>
+              <w:jc w:val="center"/>
+            </w:pPr>
+            <w:r>
+              <w:rPr>
+                <w:bCs/>
+                <w:b/>
+              </w:rPr>
+              <w:t xml:space="preserve">0.0074</w:t>
+            </w:r>
+          </w:p>
+        </w:tc>
+        <w:tc>
+          <w:tcPr/>
+          <w:p>
+            <w:pPr>
+              <w:pStyle w:val="Compact"/>
               <w:jc w:val="left"/>
             </w:pPr>
             <w:r>
@@ -2873,6 +2963,18 @@
           <w:p>
             <w:pPr>
               <w:pStyle w:val="Compact"/>
+              <w:jc w:val="center"/>
+            </w:pPr>
+            <w:r>
+              <w:t xml:space="preserve">-</w:t>
+            </w:r>
+          </w:p>
+        </w:tc>
+        <w:tc>
+          <w:tcPr/>
+          <w:p>
+            <w:pPr>
+              <w:pStyle w:val="Compact"/>
               <w:jc w:val="left"/>
             </w:pPr>
             <w:r>
@@ -2951,6 +3053,18 @@
             </w:pPr>
             <w:r>
               <w:t xml:space="preserve">46.52</w:t>
+            </w:r>
+          </w:p>
+        </w:tc>
+        <w:tc>
+          <w:tcPr/>
+          <w:p>
+            <w:pPr>
+              <w:pStyle w:val="Compact"/>
+              <w:jc w:val="center"/>
+            </w:pPr>
+            <w:r>
+              <w:t xml:space="preserve">-</w:t>
             </w:r>
           </w:p>
         </w:tc>
@@ -3049,6 +3163,18 @@
           <w:p>
             <w:pPr>
               <w:pStyle w:val="Compact"/>
+              <w:jc w:val="center"/>
+            </w:pPr>
+            <w:r>
+              <w:t xml:space="preserve">-</w:t>
+            </w:r>
+          </w:p>
+        </w:tc>
+        <w:tc>
+          <w:tcPr/>
+          <w:p>
+            <w:pPr>
+              <w:pStyle w:val="Compact"/>
               <w:jc w:val="left"/>
             </w:pPr>
             <w:r>
@@ -3135,6 +3261,18 @@
           <w:p>
             <w:pPr>
               <w:pStyle w:val="Compact"/>
+              <w:jc w:val="center"/>
+            </w:pPr>
+            <w:r>
+              <w:t xml:space="preserve">-</w:t>
+            </w:r>
+          </w:p>
+        </w:tc>
+        <w:tc>
+          <w:tcPr/>
+          <w:p>
+            <w:pPr>
+              <w:pStyle w:val="Compact"/>
               <w:jc w:val="left"/>
             </w:pPr>
             <w:r>
@@ -3213,6 +3351,18 @@
             </w:pPr>
             <w:r>
               <w:t xml:space="preserve">32.36</w:t>
+            </w:r>
+          </w:p>
+        </w:tc>
+        <w:tc>
+          <w:tcPr/>
+          <w:p>
+            <w:pPr>
+              <w:pStyle w:val="Compact"/>
+              <w:jc w:val="center"/>
+            </w:pPr>
+            <w:r>
+              <w:t xml:space="preserve">-</w:t>
             </w:r>
           </w:p>
         </w:tc>
@@ -3311,6 +3461,18 @@
           <w:p>
             <w:pPr>
               <w:pStyle w:val="Compact"/>
+              <w:jc w:val="center"/>
+            </w:pPr>
+            <w:r>
+              <w:t xml:space="preserve">-</w:t>
+            </w:r>
+          </w:p>
+        </w:tc>
+        <w:tc>
+          <w:tcPr/>
+          <w:p>
+            <w:pPr>
+              <w:pStyle w:val="Compact"/>
               <w:jc w:val="left"/>
             </w:pPr>
             <w:r>
@@ -3401,6 +3563,18 @@
           <w:p>
             <w:pPr>
               <w:pStyle w:val="Compact"/>
+              <w:jc w:val="center"/>
+            </w:pPr>
+            <w:r>
+              <w:t xml:space="preserve">-</w:t>
+            </w:r>
+          </w:p>
+        </w:tc>
+        <w:tc>
+          <w:tcPr/>
+          <w:p>
+            <w:pPr>
+              <w:pStyle w:val="Compact"/>
               <w:jc w:val="left"/>
             </w:pPr>
             <w:r>
@@ -3491,6 +3665,18 @@
           <w:p>
             <w:pPr>
               <w:pStyle w:val="Compact"/>
+              <w:jc w:val="center"/>
+            </w:pPr>
+            <w:r>
+              <w:t xml:space="preserve">-</w:t>
+            </w:r>
+          </w:p>
+        </w:tc>
+        <w:tc>
+          <w:tcPr/>
+          <w:p>
+            <w:pPr>
+              <w:pStyle w:val="Compact"/>
               <w:jc w:val="left"/>
             </w:pPr>
             <w:r>
@@ -3514,15 +3700,15 @@
       <w:r>
         <w:t xml:space="preserve">：</w:t>
       </w:r>
-      <w:r>
-        <w:t xml:space="preserve"> </w:t>
-      </w:r>
-      <w:r>
-        <w:t xml:space="preserve">1.</w:t>
-      </w:r>
-      <w:r>
-        <w:t xml:space="preserve"> </w:t>
-      </w:r>
+    </w:p>
+    <w:p>
+      <w:pPr>
+        <w:numPr>
+          <w:ilvl w:val="0"/>
+          <w:numId w:val="1014"/>
+        </w:numPr>
+        <w:pStyle w:val="Compact"/>
+      </w:pPr>
       <w:r>
         <w:rPr>
           <w:bCs/>
@@ -3533,15 +3719,15 @@
       <w:r>
         <w:t xml:space="preserve">：如表 4-2 所示，即便是最基础的深度学习模型（如 MLP-Model, Rel-L2 0.0182），也表现出显著优于传统的 Bicubic (Rel-L2 0.1480) 和 Bilinear (Rel-L2 0.1836) 插值方法的性能。特别是在 PSNR 这一关键指标上，EDSR 高达 71.05 dB，而 Bicubic 仅为 33.96 dB，充分凸显了深度学习模型在从稀疏观测中恢复非线性物理场时的强大信息推断能力，证明了纯数学插值在物理场重建中的局限性。</w:t>
       </w:r>
-      <w:r>
-        <w:t xml:space="preserve"> </w:t>
-      </w:r>
-      <w:r>
-        <w:t xml:space="preserve">2.</w:t>
-      </w:r>
-      <w:r>
-        <w:t xml:space="preserve"> </w:t>
-      </w:r>
+    </w:p>
+    <w:p>
+      <w:pPr>
+        <w:numPr>
+          <w:ilvl w:val="0"/>
+          <w:numId w:val="1014"/>
+        </w:numPr>
+        <w:pStyle w:val="Compact"/>
+      </w:pPr>
       <w:r>
         <w:rPr>
           <w:bCs/>
@@ -3712,13 +3898,13 @@
         <w:tblLayout w:type="fixed"/>
       </w:tblPr>
       <w:tblGrid>
-        <w:gridCol w:w="960"/>
-        <w:gridCol w:w="1200"/>
-        <w:gridCol w:w="1200"/>
-        <w:gridCol w:w="1200"/>
-        <w:gridCol w:w="1200"/>
-        <w:gridCol w:w="1200"/>
-        <w:gridCol w:w="960"/>
+        <w:gridCol w:w="1277"/>
+        <w:gridCol w:w="851"/>
+        <w:gridCol w:w="1618"/>
+        <w:gridCol w:w="1277"/>
+        <w:gridCol w:w="766"/>
+        <w:gridCol w:w="681"/>
+        <w:gridCol w:w="1447"/>
       </w:tblGrid>
       <w:tr>
         <w:trPr>
@@ -4393,11 +4579,11 @@
         <w:tblLayout w:type="fixed"/>
       </w:tblPr>
       <w:tblGrid>
-        <w:gridCol w:w="1584"/>
-        <w:gridCol w:w="1584"/>
-        <w:gridCol w:w="1584"/>
-        <w:gridCol w:w="1584"/>
-        <w:gridCol w:w="1584"/>
+        <w:gridCol w:w="976"/>
+        <w:gridCol w:w="1301"/>
+        <w:gridCol w:w="1627"/>
+        <w:gridCol w:w="1627"/>
+        <w:gridCol w:w="2386"/>
       </w:tblGrid>
       <w:tr>
         <w:trPr>
@@ -5388,15 +5574,15 @@
       <w:r>
         <w:t xml:space="preserve">：</w:t>
       </w:r>
-      <w:r>
-        <w:t xml:space="preserve"> </w:t>
-      </w:r>
-      <w:r>
-        <w:t xml:space="preserve">1.</w:t>
-      </w:r>
-      <w:r>
-        <w:t xml:space="preserve"> </w:t>
-      </w:r>
+    </w:p>
+    <w:p>
+      <w:pPr>
+        <w:numPr>
+          <w:ilvl w:val="0"/>
+          <w:numId w:val="1015"/>
+        </w:numPr>
+        <w:pStyle w:val="Compact"/>
+      </w:pPr>
       <w:r>
         <w:rPr>
           <w:bCs/>
@@ -5420,15 +5606,15 @@
       <w:r>
         <w:t xml:space="preserve">的全卷积 UNet 展现出了相对平滑的降级曲线（例如 Size 112 时 Rel-L2 为 0.4668）。这表明其编码器-解码器结构能够一定程度上将观测边界信息传递到缺失区域（Inpainting）。</w:t>
       </w:r>
-      <w:r>
-        <w:t xml:space="preserve"> </w:t>
-      </w:r>
-      <w:r>
-        <w:t xml:space="preserve">2.</w:t>
-      </w:r>
-      <w:r>
-        <w:t xml:space="preserve"> </w:t>
-      </w:r>
+    </w:p>
+    <w:p>
+      <w:pPr>
+        <w:numPr>
+          <w:ilvl w:val="0"/>
+          <w:numId w:val="1015"/>
+        </w:numPr>
+        <w:pStyle w:val="Compact"/>
+      </w:pPr>
       <w:r>
         <w:rPr>
           <w:bCs/>
@@ -5439,15 +5625,15 @@
       <w:r>
         <w:t xml:space="preserve">：相比之下，在 SR（均匀下采样）任务中表现优异的 EDSR 在 Crop 任务中表现略逊于 UNet（如 Size 32 下 0.9495 vs 0.9463）。这是因为深层残差结构缺乏长程特征传递机制，面对大面积连续缺失时，难以有效推断缺失区域内容。</w:t>
       </w:r>
-      <w:r>
-        <w:t xml:space="preserve"> </w:t>
-      </w:r>
-      <w:r>
-        <w:t xml:space="preserve">3.</w:t>
-      </w:r>
-      <w:r>
-        <w:t xml:space="preserve"> </w:t>
-      </w:r>
+    </w:p>
+    <w:p>
+      <w:pPr>
+        <w:numPr>
+          <w:ilvl w:val="0"/>
+          <w:numId w:val="1015"/>
+        </w:numPr>
+        <w:pStyle w:val="Compact"/>
+      </w:pPr>
       <w:r>
         <w:rPr>
           <w:bCs/>
@@ -5458,15 +5644,15 @@
       <w:r>
         <w:t xml:space="preserve">：PartialConvUNet 的完全失效（Rel-L2=1.0）进一步证实了针对传统图像修复设计的“掩码更新”机制并不适用于遵循严格物理守恒律（如能量守恒）的流体场重建。</w:t>
       </w:r>
-      <w:r>
-        <w:t xml:space="preserve"> </w:t>
-      </w:r>
-      <w:r>
-        <w:t xml:space="preserve">4.</w:t>
-      </w:r>
-      <w:r>
-        <w:t xml:space="preserve"> </w:t>
-      </w:r>
+    </w:p>
+    <w:p>
+      <w:pPr>
+        <w:numPr>
+          <w:ilvl w:val="0"/>
+          <w:numId w:val="1015"/>
+        </w:numPr>
+        <w:pStyle w:val="Compact"/>
+      </w:pPr>
       <w:r>
         <w:rPr>
           <w:bCs/>
@@ -5475,7 +5661,7 @@
         <w:t xml:space="preserve">物理信息相变点</w:t>
       </w:r>
       <w:r>
-        <w:t xml:space="preserve">：对于所有模型而言，当观测区域极度稀疏（Size &lt; 16, &lt;1.5%）时，性能均收敛到随机猜测水平（Rel-L2 &gt; 0.96，见表 4-11），这标志着纯数据驱动下物理信息的可重建极限。</w:t>
+        <w:t xml:space="preserve">：对于所有模型而言，当观测区域极度稀疏（Size &lt; 16, &lt;1.5%）时，性能均收敛到随机猜测水平（Rel-L2 &gt; 0.96，见表 4-13），这标志着纯数据驱动下物理信息的可重建极限。</w:t>
       </w:r>
     </w:p>
     <w:bookmarkEnd w:id="33"/>
@@ -5582,14 +5768,14 @@
         <w:tblLayout w:type="fixed"/>
       </w:tblPr>
       <w:tblGrid>
-        <w:gridCol w:w="812"/>
-        <w:gridCol w:w="1015"/>
-        <w:gridCol w:w="1015"/>
-        <w:gridCol w:w="1015"/>
-        <w:gridCol w:w="1015"/>
-        <w:gridCol w:w="1015"/>
-        <w:gridCol w:w="1015"/>
-        <w:gridCol w:w="1015"/>
+        <w:gridCol w:w="1148"/>
+        <w:gridCol w:w="604"/>
+        <w:gridCol w:w="544"/>
+        <w:gridCol w:w="725"/>
+        <w:gridCol w:w="1148"/>
+        <w:gridCol w:w="906"/>
+        <w:gridCol w:w="906"/>
+        <w:gridCol w:w="1934"/>
       </w:tblGrid>
       <w:tr>
         <w:trPr>
@@ -5720,33 +5906,33 @@
               <w:jc w:val="center"/>
             </w:pPr>
             <m:oMath>
-              <m:sSub>
-                <m:e>
-                  <m:r>
-                    <m:t>H</m:t>
-                  </m:r>
-                </m:e>
-                <m:sub>
-                  <m:r>
-                    <m:rPr>
-                      <m:sty m:val="p"/>
-                    </m:rPr>
-                    <m:t>e</m:t>
-                  </m:r>
-                  <m:r>
-                    <m:rPr>
-                      <m:sty m:val="p"/>
-                    </m:rPr>
-                    <m:t>r</m:t>
-                  </m:r>
-                  <m:r>
-                    <m:rPr>
-                      <m:sty m:val="p"/>
-                    </m:rPr>
-                    <m:t>r</m:t>
-                  </m:r>
-                </m:sub>
-              </m:sSub>
+              <m:r>
+                <m:t>H</m:t>
+              </m:r>
+              <m:r>
+                <m:rPr>
+                  <m:sty m:val="p"/>
+                </m:rPr>
+                <m:t>_</m:t>
+              </m:r>
+              <m:r>
+                <m:rPr>
+                  <m:sty m:val="p"/>
+                </m:rPr>
+                <m:t>e</m:t>
+              </m:r>
+              <m:r>
+                <m:rPr>
+                  <m:sty m:val="p"/>
+                </m:rPr>
+                <m:t>r</m:t>
+              </m:r>
+              <m:r>
+                <m:rPr>
+                  <m:sty m:val="p"/>
+                </m:rPr>
+                <m:t>r</m:t>
+              </m:r>
             </m:oMath>
             <w:r>
               <w:t xml:space="preserve"> </w:t>
@@ -6316,15 +6502,15 @@
       <w:r>
         <w:t xml:space="preserve">：</w:t>
       </w:r>
-      <w:r>
-        <w:t xml:space="preserve"> </w:t>
-      </w:r>
-      <w:r>
-        <w:t xml:space="preserve">1.</w:t>
-      </w:r>
-      <w:r>
-        <w:t xml:space="preserve"> </w:t>
-      </w:r>
+    </w:p>
+    <w:p>
+      <w:pPr>
+        <w:numPr>
+          <w:ilvl w:val="0"/>
+          <w:numId w:val="1016"/>
+        </w:numPr>
+        <w:pStyle w:val="Compact"/>
+      </w:pPr>
       <w:r>
         <w:rPr>
           <w:bCs/>
@@ -6339,33 +6525,33 @@
         <w:t xml:space="preserve"> </w:t>
       </w:r>
       <m:oMath>
-        <m:sSub>
-          <m:e>
-            <m:r>
-              <m:t>H</m:t>
-            </m:r>
-          </m:e>
-          <m:sub>
-            <m:r>
-              <m:rPr>
-                <m:sty m:val="p"/>
-              </m:rPr>
-              <m:t>e</m:t>
-            </m:r>
-            <m:r>
-              <m:rPr>
-                <m:sty m:val="p"/>
-              </m:rPr>
-              <m:t>r</m:t>
-            </m:r>
-            <m:r>
-              <m:rPr>
-                <m:sty m:val="p"/>
-              </m:rPr>
-              <m:t>r</m:t>
-            </m:r>
-          </m:sub>
-        </m:sSub>
+        <m:r>
+          <m:t>H</m:t>
+        </m:r>
+        <m:r>
+          <m:rPr>
+            <m:sty m:val="p"/>
+          </m:rPr>
+          <m:t>_</m:t>
+        </m:r>
+        <m:r>
+          <m:rPr>
+            <m:sty m:val="p"/>
+          </m:rPr>
+          <m:t>e</m:t>
+        </m:r>
+        <m:r>
+          <m:rPr>
+            <m:sty m:val="p"/>
+          </m:rPr>
+          <m:t>r</m:t>
+        </m:r>
+        <m:r>
+          <m:rPr>
+            <m:sty m:val="p"/>
+          </m:rPr>
+          <m:t>r</m:t>
+        </m:r>
       </m:oMath>
       <w:r>
         <w:t xml:space="preserve"> </w:t>
@@ -6373,15 +6559,15 @@
       <w:r>
         <w:t xml:space="preserve">的双优，表明模型不仅恢复了物理场，且严格遵守了观测约束。</w:t>
       </w:r>
-      <w:r>
-        <w:t xml:space="preserve"> </w:t>
-      </w:r>
-      <w:r>
-        <w:t xml:space="preserve">2.</w:t>
-      </w:r>
-      <w:r>
-        <w:t xml:space="preserve"> </w:t>
-      </w:r>
+    </w:p>
+    <w:p>
+      <w:pPr>
+        <w:numPr>
+          <w:ilvl w:val="0"/>
+          <w:numId w:val="1016"/>
+        </w:numPr>
+        <w:pStyle w:val="Compact"/>
+      </w:pPr>
       <w:r>
         <w:rPr>
           <w:bCs/>
@@ -6396,33 +6582,33 @@
         <w:t xml:space="preserve"> </w:t>
       </w:r>
       <m:oMath>
-        <m:sSub>
-          <m:e>
-            <m:r>
-              <m:t>H</m:t>
-            </m:r>
-          </m:e>
-          <m:sub>
-            <m:r>
-              <m:rPr>
-                <m:sty m:val="p"/>
-              </m:rPr>
-              <m:t>e</m:t>
-            </m:r>
-            <m:r>
-              <m:rPr>
-                <m:sty m:val="p"/>
-              </m:rPr>
-              <m:t>r</m:t>
-            </m:r>
-            <m:r>
-              <m:rPr>
-                <m:sty m:val="p"/>
-              </m:rPr>
-              <m:t>r</m:t>
-            </m:r>
-          </m:sub>
-        </m:sSub>
+        <m:r>
+          <m:t>H</m:t>
+        </m:r>
+        <m:r>
+          <m:rPr>
+            <m:sty m:val="p"/>
+          </m:rPr>
+          <m:t>_</m:t>
+        </m:r>
+        <m:r>
+          <m:rPr>
+            <m:sty m:val="p"/>
+          </m:rPr>
+          <m:t>e</m:t>
+        </m:r>
+        <m:r>
+          <m:rPr>
+            <m:sty m:val="p"/>
+          </m:rPr>
+          <m:t>r</m:t>
+        </m:r>
+        <m:r>
+          <m:rPr>
+            <m:sty m:val="p"/>
+          </m:rPr>
+          <m:t>r</m:t>
+        </m:r>
         <m:r>
           <m:rPr>
             <m:sty m:val="p"/>
@@ -6462,15 +6648,15 @@
       <w:r>
         <w:t xml:space="preserve">），说明强约束下模型容易退化为“仅输出观测值填充”的平凡解（Trivial Solution），即在观测点处完美拟合但在未观测区域完全失效。Ours 通过序列化课程学习有效规避了这一局部极小值。</w:t>
       </w:r>
-      <w:r>
-        <w:t xml:space="preserve"> </w:t>
-      </w:r>
-      <w:r>
-        <w:t xml:space="preserve">3.</w:t>
-      </w:r>
-      <w:r>
-        <w:t xml:space="preserve"> </w:t>
-      </w:r>
+    </w:p>
+    <w:p>
+      <w:pPr>
+        <w:numPr>
+          <w:ilvl w:val="0"/>
+          <w:numId w:val="1016"/>
+        </w:numPr>
+        <w:pStyle w:val="Compact"/>
+      </w:pPr>
       <w:r>
         <w:rPr>
           <w:bCs/>
@@ -6485,33 +6671,33 @@
         <w:t xml:space="preserve"> </w:t>
       </w:r>
       <m:oMath>
-        <m:sSub>
-          <m:e>
-            <m:r>
-              <m:t>H</m:t>
-            </m:r>
-          </m:e>
-          <m:sub>
-            <m:r>
-              <m:rPr>
-                <m:sty m:val="p"/>
-              </m:rPr>
-              <m:t>e</m:t>
-            </m:r>
-            <m:r>
-              <m:rPr>
-                <m:sty m:val="p"/>
-              </m:rPr>
-              <m:t>r</m:t>
-            </m:r>
-            <m:r>
-              <m:rPr>
-                <m:sty m:val="p"/>
-              </m:rPr>
-              <m:t>r</m:t>
-            </m:r>
-          </m:sub>
-        </m:sSub>
+        <m:r>
+          <m:t>H</m:t>
+        </m:r>
+        <m:r>
+          <m:rPr>
+            <m:sty m:val="p"/>
+          </m:rPr>
+          <m:t>_</m:t>
+        </m:r>
+        <m:r>
+          <m:rPr>
+            <m:sty m:val="p"/>
+          </m:rPr>
+          <m:t>e</m:t>
+        </m:r>
+        <m:r>
+          <m:rPr>
+            <m:sty m:val="p"/>
+          </m:rPr>
+          <m:t>r</m:t>
+        </m:r>
+        <m:r>
+          <m:rPr>
+            <m:sty m:val="p"/>
+          </m:rPr>
+          <m:t>r</m:t>
+        </m:r>
       </m:oMath>
       <w:r>
         <w:t xml:space="preserve"> </w:t>
@@ -6672,7 +6858,7 @@
       <w:pPr>
         <w:numPr>
           <w:ilvl w:val="0"/>
-          <w:numId w:val="1008"/>
+          <w:numId w:val="1017"/>
         </w:numPr>
         <w:pStyle w:val="Compact"/>
       </w:pPr>
@@ -6691,7 +6877,7 @@
       <w:pPr>
         <w:numPr>
           <w:ilvl w:val="0"/>
-          <w:numId w:val="1008"/>
+          <w:numId w:val="1017"/>
         </w:numPr>
         <w:pStyle w:val="Compact"/>
       </w:pPr>
@@ -6715,7 +6901,7 @@
           <wp:inline>
             <wp:extent cx="5504749" cy="3669832"/>
             <wp:effectExtent b="0" l="0" r="0" t="0"/>
-            <wp:docPr descr="图 4-6: 重建结果的径向平均功率谱对比。Baseline (UNet) 在高频段（k &gt; 32）呈现显著的能量衰减（过度平滑），而引入谱一致性损失 \mathcal{L}_{spec} 的 Ours 模型（红色实线）能够有效保持物理场的多尺度能量分布，与真实场（黑色虚线）高度重合。" title="" id="42" name="Picture"/>
+            <wp:docPr descr="图 4-6: 重建结果的径向平均功率谱对比。Baseline (UNet) 在高频段（k &gt; 32）呈现显著的能量衰减（过度平滑），而引入谱一致性损失 \mathcal{L}\_{spec} 的 Ours 模型（红色实线）能够有效保持物理场的多尺度能量分布，与真实场（黑色虚线）高度重合。" title="" id="42" name="Picture"/>
             <a:graphic>
               <a:graphicData uri="http://schemas.openxmlformats.org/drawingml/2006/picture">
                 <pic:pic>
@@ -6781,31 +6967,31 @@
         <w:t xml:space="preserve"> </w:t>
       </w:r>
       <m:oMath>
-        <m:sSub>
-          <m:e>
-            <m:r>
-              <m:rPr>
-                <m:sty m:val="p"/>
-                <m:scr m:val="script"/>
-              </m:rPr>
-              <m:t>L</m:t>
-            </m:r>
-          </m:e>
-          <m:sub>
-            <m:r>
-              <m:t>s</m:t>
-            </m:r>
-            <m:r>
-              <m:t>p</m:t>
-            </m:r>
-            <m:r>
-              <m:t>e</m:t>
-            </m:r>
-            <m:r>
-              <m:t>c</m:t>
-            </m:r>
-          </m:sub>
-        </m:sSub>
+        <m:r>
+          <m:rPr>
+            <m:sty m:val="p"/>
+            <m:scr m:val="script"/>
+          </m:rPr>
+          <m:t>L</m:t>
+        </m:r>
+        <m:r>
+          <m:rPr>
+            <m:sty m:val="p"/>
+          </m:rPr>
+          <m:t>_</m:t>
+        </m:r>
+        <m:r>
+          <m:t>s</m:t>
+        </m:r>
+        <m:r>
+          <m:t>p</m:t>
+        </m:r>
+        <m:r>
+          <m:t>e</m:t>
+        </m:r>
+        <m:r>
+          <m:t>c</m:t>
+        </m:r>
       </m:oMath>
       <w:r>
         <w:t xml:space="preserve"> </w:t>
@@ -6818,7 +7004,7 @@
       <w:pPr>
         <w:numPr>
           <w:ilvl w:val="0"/>
-          <w:numId w:val="1009"/>
+          <w:numId w:val="1018"/>
         </w:numPr>
         <w:pStyle w:val="Compact"/>
       </w:pPr>
@@ -6977,22 +7163,22 @@
         <w:t xml:space="preserve"> </w:t>
       </w:r>
       <m:oMath>
-        <m:sSub>
-          <m:e>
-            <m:r>
-              <m:t>σ</m:t>
-            </m:r>
-          </m:e>
-          <m:sub>
-            <m:r>
-              <m:rPr>
-                <m:nor/>
-                <m:sty m:val="p"/>
-              </m:rPr>
-              <m:t>train</m:t>
-            </m:r>
-          </m:sub>
-        </m:sSub>
+        <m:r>
+          <m:t>σ</m:t>
+        </m:r>
+        <m:r>
+          <m:rPr>
+            <m:sty m:val="p"/>
+          </m:rPr>
+          <m:t>_</m:t>
+        </m:r>
+        <m:r>
+          <m:rPr>
+            <m:nor/>
+            <m:sty m:val="p"/>
+          </m:rPr>
+          <m:t>train</m:t>
+        </m:r>
       </m:oMath>
       <w:r>
         <w:t xml:space="preserve">。</w:t>
@@ -7019,14 +7205,14 @@
         <w:tblLayout w:type="fixed"/>
       </w:tblPr>
       <w:tblGrid>
-        <w:gridCol w:w="833"/>
-        <w:gridCol w:w="1042"/>
-        <w:gridCol w:w="1042"/>
-        <w:gridCol w:w="1042"/>
-        <w:gridCol w:w="1042"/>
-        <w:gridCol w:w="1042"/>
-        <w:gridCol w:w="1042"/>
-        <w:gridCol w:w="833"/>
+        <w:gridCol w:w="605"/>
+        <w:gridCol w:w="1255"/>
+        <w:gridCol w:w="1211"/>
+        <w:gridCol w:w="822"/>
+        <w:gridCol w:w="865"/>
+        <w:gridCol w:w="649"/>
+        <w:gridCol w:w="1384"/>
+        <w:gridCol w:w="1125"/>
       </w:tblGrid>
       <w:tr>
         <w:trPr>
@@ -7052,22 +7238,22 @@
               <w:jc w:val="center"/>
             </w:pPr>
             <m:oMath>
-              <m:sSub>
-                <m:e>
-                  <m:r>
-                    <m:t>σ</m:t>
-                  </m:r>
-                </m:e>
-                <m:sub>
-                  <m:r>
-                    <m:rPr>
-                      <m:nor/>
-                      <m:sty m:val="p"/>
-                    </m:rPr>
-                    <m:t>train</m:t>
-                  </m:r>
-                </m:sub>
-              </m:sSub>
+              <m:r>
+                <m:t>σ</m:t>
+              </m:r>
+              <m:r>
+                <m:rPr>
+                  <m:sty m:val="p"/>
+                </m:rPr>
+                <m:t>_</m:t>
+              </m:r>
+              <m:r>
+                <m:rPr>
+                  <m:nor/>
+                  <m:sty m:val="p"/>
+                </m:rPr>
+                <m:t>train</m:t>
+              </m:r>
             </m:oMath>
             <w:r>
               <w:t xml:space="preserve"> </w:t>
@@ -7085,22 +7271,22 @@
               <w:jc w:val="center"/>
             </w:pPr>
             <m:oMath>
-              <m:sSub>
-                <m:e>
-                  <m:r>
-                    <m:t>σ</m:t>
-                  </m:r>
-                </m:e>
-                <m:sub>
-                  <m:r>
-                    <m:rPr>
-                      <m:nor/>
-                      <m:sty m:val="p"/>
-                    </m:rPr>
-                    <m:t>test</m:t>
-                  </m:r>
-                </m:sub>
-              </m:sSub>
+              <m:r>
+                <m:t>σ</m:t>
+              </m:r>
+              <m:r>
+                <m:rPr>
+                  <m:sty m:val="p"/>
+                </m:rPr>
+                <m:t>_</m:t>
+              </m:r>
+              <m:r>
+                <m:rPr>
+                  <m:nor/>
+                  <m:sty m:val="p"/>
+                </m:rPr>
+                <m:t>test</m:t>
+              </m:r>
             </m:oMath>
             <w:r>
               <w:t xml:space="preserve"> </w:t>
@@ -7187,33 +7373,33 @@
               <w:jc w:val="center"/>
             </w:pPr>
             <m:oMath>
-              <m:sSub>
-                <m:e>
-                  <m:r>
-                    <m:t>H</m:t>
-                  </m:r>
-                </m:e>
-                <m:sub>
-                  <m:r>
-                    <m:rPr>
-                      <m:sty m:val="p"/>
-                    </m:rPr>
-                    <m:t>e</m:t>
-                  </m:r>
-                  <m:r>
-                    <m:rPr>
-                      <m:sty m:val="p"/>
-                    </m:rPr>
-                    <m:t>r</m:t>
-                  </m:r>
-                  <m:r>
-                    <m:rPr>
-                      <m:sty m:val="p"/>
-                    </m:rPr>
-                    <m:t>r</m:t>
-                  </m:r>
-                </m:sub>
-              </m:sSub>
+              <m:r>
+                <m:t>H</m:t>
+              </m:r>
+              <m:r>
+                <m:rPr>
+                  <m:sty m:val="p"/>
+                </m:rPr>
+                <m:t>_</m:t>
+              </m:r>
+              <m:r>
+                <m:rPr>
+                  <m:sty m:val="p"/>
+                </m:rPr>
+                <m:t>e</m:t>
+              </m:r>
+              <m:r>
+                <m:rPr>
+                  <m:sty m:val="p"/>
+                </m:rPr>
+                <m:t>r</m:t>
+              </m:r>
+              <m:r>
+                <m:rPr>
+                  <m:sty m:val="p"/>
+                </m:rPr>
+                <m:t>r</m:t>
+              </m:r>
             </m:oMath>
             <w:r>
               <w:t xml:space="preserve"> </w:t>
@@ -7460,33 +7646,33 @@
               <w:jc w:val="left"/>
             </w:pPr>
             <m:oMath>
-              <m:sSub>
-                <m:e>
-                  <m:r>
-                    <m:t>H</m:t>
-                  </m:r>
-                </m:e>
-                <m:sub>
-                  <m:r>
-                    <m:rPr>
-                      <m:sty m:val="p"/>
-                    </m:rPr>
-                    <m:t>e</m:t>
-                  </m:r>
-                  <m:r>
-                    <m:rPr>
-                      <m:sty m:val="p"/>
-                    </m:rPr>
-                    <m:t>r</m:t>
-                  </m:r>
-                  <m:r>
-                    <m:rPr>
-                      <m:sty m:val="p"/>
-                    </m:rPr>
-                    <m:t>r</m:t>
-                  </m:r>
-                </m:sub>
-              </m:sSub>
+              <m:r>
+                <m:t>H</m:t>
+              </m:r>
+              <m:r>
+                <m:rPr>
+                  <m:sty m:val="p"/>
+                </m:rPr>
+                <m:t>_</m:t>
+              </m:r>
+              <m:r>
+                <m:rPr>
+                  <m:sty m:val="p"/>
+                </m:rPr>
+                <m:t>e</m:t>
+              </m:r>
+              <m:r>
+                <m:rPr>
+                  <m:sty m:val="p"/>
+                </m:rPr>
+                <m:t>r</m:t>
+              </m:r>
+              <m:r>
+                <m:rPr>
+                  <m:sty m:val="p"/>
+                </m:rPr>
+                <m:t>r</m:t>
+              </m:r>
             </m:oMath>
             <w:r>
               <w:t xml:space="preserve"> </w:t>
@@ -7590,33 +7776,33 @@
               <w:jc w:val="left"/>
             </w:pPr>
             <m:oMath>
-              <m:sSub>
-                <m:e>
-                  <m:r>
-                    <m:t>H</m:t>
-                  </m:r>
-                </m:e>
-                <m:sub>
-                  <m:r>
-                    <m:rPr>
-                      <m:sty m:val="p"/>
-                    </m:rPr>
-                    <m:t>e</m:t>
-                  </m:r>
-                  <m:r>
-                    <m:rPr>
-                      <m:sty m:val="p"/>
-                    </m:rPr>
-                    <m:t>r</m:t>
-                  </m:r>
-                  <m:r>
-                    <m:rPr>
-                      <m:sty m:val="p"/>
-                    </m:rPr>
-                    <m:t>r</m:t>
-                  </m:r>
-                </m:sub>
-              </m:sSub>
+              <m:r>
+                <m:t>H</m:t>
+              </m:r>
+              <m:r>
+                <m:rPr>
+                  <m:sty m:val="p"/>
+                </m:rPr>
+                <m:t>_</m:t>
+              </m:r>
+              <m:r>
+                <m:rPr>
+                  <m:sty m:val="p"/>
+                </m:rPr>
+                <m:t>e</m:t>
+              </m:r>
+              <m:r>
+                <m:rPr>
+                  <m:sty m:val="p"/>
+                </m:rPr>
+                <m:t>r</m:t>
+              </m:r>
+              <m:r>
+                <m:rPr>
+                  <m:sty m:val="p"/>
+                </m:rPr>
+                <m:t>r</m:t>
+              </m:r>
             </m:oMath>
             <w:r>
               <w:t xml:space="preserve"> </w:t>
@@ -7649,33 +7835,33 @@
         <w:t xml:space="preserve"> </w:t>
       </w:r>
       <m:oMath>
-        <m:sSub>
-          <m:e>
-            <m:r>
-              <m:t>H</m:t>
-            </m:r>
-          </m:e>
-          <m:sub>
-            <m:r>
-              <m:rPr>
-                <m:sty m:val="p"/>
-              </m:rPr>
-              <m:t>e</m:t>
-            </m:r>
-            <m:r>
-              <m:rPr>
-                <m:sty m:val="p"/>
-              </m:rPr>
-              <m:t>r</m:t>
-            </m:r>
-            <m:r>
-              <m:rPr>
-                <m:sty m:val="p"/>
-              </m:rPr>
-              <m:t>r</m:t>
-            </m:r>
-          </m:sub>
-        </m:sSub>
+        <m:r>
+          <m:t>H</m:t>
+        </m:r>
+        <m:r>
+          <m:rPr>
+            <m:sty m:val="p"/>
+          </m:rPr>
+          <m:t>_</m:t>
+        </m:r>
+        <m:r>
+          <m:rPr>
+            <m:sty m:val="p"/>
+          </m:rPr>
+          <m:t>e</m:t>
+        </m:r>
+        <m:r>
+          <m:rPr>
+            <m:sty m:val="p"/>
+          </m:rPr>
+          <m:t>r</m:t>
+        </m:r>
+        <m:r>
+          <m:rPr>
+            <m:sty m:val="p"/>
+          </m:rPr>
+          <m:t>r</m:t>
+        </m:r>
       </m:oMath>
       <w:r>
         <w:t xml:space="preserve"> </w:t>
@@ -7728,12 +7914,6 @@
             <m:sty m:val="p"/>
           </m:rPr>
           <m:t>=</m:t>
-        </m:r>
-        <m:r>
-          <m:rPr>
-            <m:sty m:val="p"/>
-          </m:rPr>
-          <m:t>{</m:t>
         </m:r>
         <m:r>
           <m:t>u</m:t>
@@ -7769,12 +7949,6 @@
         <m:r>
           <m:t>y</m:t>
         </m:r>
-        <m:r>
-          <m:rPr>
-            <m:sty m:val="p"/>
-          </m:rPr>
-          <m:t>}</m:t>
-        </m:r>
       </m:oMath>
       <w:r>
         <w:t xml:space="preserve">。错配的</w:t>
@@ -8096,55 +8270,163 @@
               <w:jc w:val="center"/>
             </w:pPr>
             <w:r>
-              <w:t xml:space="preserve">0.1780</w:t>
-            </w:r>
-          </w:p>
-        </w:tc>
-        <w:tc>
-          <w:tcPr/>
-          <w:p>
-            <w:pPr>
-              <w:pStyle w:val="Compact"/>
-              <w:jc w:val="center"/>
-            </w:pPr>
-            <w:r>
-              <w:t xml:space="preserve">36.29</w:t>
-            </w:r>
-          </w:p>
-        </w:tc>
-        <w:tc>
-          <w:tcPr/>
-          <w:p>
-            <w:pPr>
-              <w:pStyle w:val="Compact"/>
-              <w:jc w:val="center"/>
-            </w:pPr>
-            <w:r>
-              <w:t xml:space="preserve">0.8410</w:t>
-            </w:r>
-          </w:p>
-        </w:tc>
-        <w:tc>
-          <w:tcPr/>
-          <w:p>
-            <w:pPr>
-              <w:pStyle w:val="Compact"/>
-              <w:jc w:val="center"/>
-            </w:pPr>
-            <w:r>
-              <w:t xml:space="preserve">33.44</w:t>
-            </w:r>
-          </w:p>
-        </w:tc>
-        <w:tc>
-          <w:tcPr/>
-          <w:p>
-            <w:pPr>
-              <w:pStyle w:val="Compact"/>
-              <w:jc w:val="center"/>
-            </w:pPr>
-            <w:r>
-              <w:t xml:space="preserve">0.0129</w:t>
+              <w:t xml:space="preserve">0.1758</w:t>
+            </w:r>
+          </w:p>
+        </w:tc>
+        <w:tc>
+          <w:tcPr/>
+          <w:p>
+            <w:pPr>
+              <w:pStyle w:val="Compact"/>
+              <w:jc w:val="center"/>
+            </w:pPr>
+            <w:r>
+              <w:t xml:space="preserve">37.47</w:t>
+            </w:r>
+          </w:p>
+        </w:tc>
+        <w:tc>
+          <w:tcPr/>
+          <w:p>
+            <w:pPr>
+              <w:pStyle w:val="Compact"/>
+              <w:jc w:val="center"/>
+            </w:pPr>
+            <w:r>
+              <w:t xml:space="preserve">0.8680</w:t>
+            </w:r>
+          </w:p>
+        </w:tc>
+        <w:tc>
+          <w:tcPr/>
+          <w:p>
+            <w:pPr>
+              <w:pStyle w:val="Compact"/>
+              <w:jc w:val="center"/>
+            </w:pPr>
+            <w:r>
+              <w:t xml:space="preserve">19.75</w:t>
+            </w:r>
+          </w:p>
+        </w:tc>
+        <w:tc>
+          <w:tcPr/>
+          <w:p>
+            <w:pPr>
+              <w:pStyle w:val="Compact"/>
+              <w:jc w:val="center"/>
+            </w:pPr>
+            <w:r>
+              <w:t xml:space="preserve">0.0063</w:t>
+            </w:r>
+          </w:p>
+        </w:tc>
+      </w:tr>
+      <w:tr>
+        <w:tc>
+          <w:tcPr/>
+          <w:p>
+            <w:pPr>
+              <w:pStyle w:val="Compact"/>
+            </w:pPr>
+          </w:p>
+        </w:tc>
+        <w:tc>
+          <w:tcPr/>
+          <w:p>
+            <w:pPr>
+              <w:pStyle w:val="Compact"/>
+              <w:jc w:val="left"/>
+            </w:pPr>
+            <w:r>
+              <w:t xml:space="preserve">+</w:t>
+            </w:r>
+            <w:r>
+              <w:t xml:space="preserve"> </w:t>
+            </w:r>
+            <m:oMath>
+              <m:sSub>
+                <m:e>
+                  <m:r>
+                    <m:t>L</m:t>
+                  </m:r>
+                </m:e>
+                <m:sub>
+                  <m:r>
+                    <m:t>s</m:t>
+                  </m:r>
+                  <m:r>
+                    <m:t>p</m:t>
+                  </m:r>
+                  <m:r>
+                    <m:t>e</m:t>
+                  </m:r>
+                  <m:r>
+                    <m:t>c</m:t>
+                  </m:r>
+                </m:sub>
+              </m:sSub>
+            </m:oMath>
+          </w:p>
+        </w:tc>
+        <w:tc>
+          <w:tcPr/>
+          <w:p>
+            <w:pPr>
+              <w:pStyle w:val="Compact"/>
+              <w:jc w:val="center"/>
+            </w:pPr>
+            <w:r>
+              <w:t xml:space="preserve">0.1736</w:t>
+            </w:r>
+          </w:p>
+        </w:tc>
+        <w:tc>
+          <w:tcPr/>
+          <w:p>
+            <w:pPr>
+              <w:pStyle w:val="Compact"/>
+              <w:jc w:val="center"/>
+            </w:pPr>
+            <w:r>
+              <w:t xml:space="preserve">37.50</w:t>
+            </w:r>
+          </w:p>
+        </w:tc>
+        <w:tc>
+          <w:tcPr/>
+          <w:p>
+            <w:pPr>
+              <w:pStyle w:val="Compact"/>
+              <w:jc w:val="center"/>
+            </w:pPr>
+            <w:r>
+              <w:t xml:space="preserve">0.8673</w:t>
+            </w:r>
+          </w:p>
+        </w:tc>
+        <w:tc>
+          <w:tcPr/>
+          <w:p>
+            <w:pPr>
+              <w:pStyle w:val="Compact"/>
+              <w:jc w:val="center"/>
+            </w:pPr>
+            <w:r>
+              <w:t xml:space="preserve">18.91</w:t>
+            </w:r>
+          </w:p>
+        </w:tc>
+        <w:tc>
+          <w:tcPr/>
+          <w:p>
+            <w:pPr>
+              <w:pStyle w:val="Compact"/>
+              <w:jc w:val="center"/>
+            </w:pPr>
+            <w:r>
+              <w:t xml:space="preserve">0.0061</w:t>
             </w:r>
           </w:p>
         </w:tc>
@@ -8198,55 +8480,55 @@
               <w:jc w:val="center"/>
             </w:pPr>
             <w:r>
-              <w:t xml:space="preserve">0.1089</w:t>
-            </w:r>
-          </w:p>
-        </w:tc>
-        <w:tc>
-          <w:tcPr/>
-          <w:p>
-            <w:pPr>
-              <w:pStyle w:val="Compact"/>
-              <w:jc w:val="center"/>
-            </w:pPr>
-            <w:r>
-              <w:t xml:space="preserve">49.13</w:t>
-            </w:r>
-          </w:p>
-        </w:tc>
-        <w:tc>
-          <w:tcPr/>
-          <w:p>
-            <w:pPr>
-              <w:pStyle w:val="Compact"/>
-              <w:jc w:val="center"/>
-            </w:pPr>
-            <w:r>
-              <w:t xml:space="preserve">0.9044</w:t>
-            </w:r>
-          </w:p>
-        </w:tc>
-        <w:tc>
-          <w:tcPr/>
-          <w:p>
-            <w:pPr>
-              <w:pStyle w:val="Compact"/>
-              <w:jc w:val="center"/>
-            </w:pPr>
-            <w:r>
-              <w:t xml:space="preserve">15.88</w:t>
-            </w:r>
-          </w:p>
-        </w:tc>
-        <w:tc>
-          <w:tcPr/>
-          <w:p>
-            <w:pPr>
-              <w:pStyle w:val="Compact"/>
-              <w:jc w:val="center"/>
-            </w:pPr>
-            <w:r>
-              <w:t xml:space="preserve">0.0056</w:t>
+              <w:t xml:space="preserve">0.1743</w:t>
+            </w:r>
+          </w:p>
+        </w:tc>
+        <w:tc>
+          <w:tcPr/>
+          <w:p>
+            <w:pPr>
+              <w:pStyle w:val="Compact"/>
+              <w:jc w:val="center"/>
+            </w:pPr>
+            <w:r>
+              <w:t xml:space="preserve">37.48</w:t>
+            </w:r>
+          </w:p>
+        </w:tc>
+        <w:tc>
+          <w:tcPr/>
+          <w:p>
+            <w:pPr>
+              <w:pStyle w:val="Compact"/>
+              <w:jc w:val="center"/>
+            </w:pPr>
+            <w:r>
+              <w:t xml:space="preserve">0.8682</w:t>
+            </w:r>
+          </w:p>
+        </w:tc>
+        <w:tc>
+          <w:tcPr/>
+          <w:p>
+            <w:pPr>
+              <w:pStyle w:val="Compact"/>
+              <w:jc w:val="center"/>
+            </w:pPr>
+            <w:r>
+              <w:t xml:space="preserve">18.94</w:t>
+            </w:r>
+          </w:p>
+        </w:tc>
+        <w:tc>
+          <w:tcPr/>
+          <w:p>
+            <w:pPr>
+              <w:pStyle w:val="Compact"/>
+              <w:jc w:val="center"/>
+            </w:pPr>
+            <w:r>
+              <w:t xml:space="preserve">0.0060</w:t>
             </w:r>
           </w:p>
         </w:tc>
@@ -8288,19 +8570,7 @@
                 <w:bCs/>
                 <w:b/>
               </w:rPr>
-              <w:t xml:space="preserve">0.1096</w:t>
-            </w:r>
-          </w:p>
-        </w:tc>
-        <w:tc>
-          <w:tcPr/>
-          <w:p>
-            <w:pPr>
-              <w:pStyle w:val="Compact"/>
-              <w:jc w:val="center"/>
-            </w:pPr>
-            <w:r>
-              <w:t xml:space="preserve">48.95</w:t>
+              <w:t xml:space="preserve">0.1739</w:t>
             </w:r>
           </w:p>
         </w:tc>
@@ -8316,7 +8586,531 @@
                 <w:bCs/>
                 <w:b/>
               </w:rPr>
-              <w:t xml:space="preserve">0.9052</w:t>
+              <w:t xml:space="preserve">37.41</w:t>
+            </w:r>
+          </w:p>
+        </w:tc>
+        <w:tc>
+          <w:tcPr/>
+          <w:p>
+            <w:pPr>
+              <w:pStyle w:val="Compact"/>
+              <w:jc w:val="center"/>
+            </w:pPr>
+            <w:r>
+              <w:t xml:space="preserve">0.8670</w:t>
+            </w:r>
+          </w:p>
+        </w:tc>
+        <w:tc>
+          <w:tcPr/>
+          <w:p>
+            <w:pPr>
+              <w:pStyle w:val="Compact"/>
+              <w:jc w:val="center"/>
+            </w:pPr>
+            <w:r>
+              <w:rPr>
+                <w:bCs/>
+                <w:b/>
+              </w:rPr>
+              <w:t xml:space="preserve">19.03</w:t>
+            </w:r>
+          </w:p>
+        </w:tc>
+        <w:tc>
+          <w:tcPr/>
+          <w:p>
+            <w:pPr>
+              <w:pStyle w:val="Compact"/>
+              <w:jc w:val="center"/>
+            </w:pPr>
+            <w:r>
+              <w:rPr>
+                <w:bCs/>
+                <w:b/>
+              </w:rPr>
+              <w:t xml:space="preserve">0.0061</w:t>
+            </w:r>
+          </w:p>
+        </w:tc>
+      </w:tr>
+      <w:tr>
+        <w:tc>
+          <w:tcPr/>
+          <w:p>
+            <w:pPr>
+              <w:pStyle w:val="Compact"/>
+              <w:jc w:val="left"/>
+            </w:pPr>
+            <w:r>
+              <w:rPr>
+                <w:iCs/>
+                <w:i/>
+              </w:rPr>
+              <w:t xml:space="preserve">Gain</w:t>
+            </w:r>
+          </w:p>
+        </w:tc>
+        <w:tc>
+          <w:tcPr/>
+          <w:p>
+            <w:pPr>
+              <w:pStyle w:val="Compact"/>
+              <w:jc w:val="left"/>
+            </w:pPr>
+            <w:r>
+              <w:t xml:space="preserve">-</w:t>
+            </w:r>
+          </w:p>
+        </w:tc>
+        <w:tc>
+          <w:tcPr/>
+          <w:p>
+            <w:pPr>
+              <w:pStyle w:val="Compact"/>
+              <w:jc w:val="center"/>
+            </w:pPr>
+            <w:r>
+              <w:rPr>
+                <w:iCs/>
+                <w:i/>
+              </w:rPr>
+              <w:t xml:space="preserve">-1.1%</w:t>
+            </w:r>
+          </w:p>
+        </w:tc>
+        <w:tc>
+          <w:tcPr/>
+          <w:p>
+            <w:pPr>
+              <w:pStyle w:val="Compact"/>
+              <w:jc w:val="center"/>
+            </w:pPr>
+            <w:r>
+              <w:rPr>
+                <w:iCs/>
+                <w:i/>
+              </w:rPr>
+              <w:t xml:space="preserve">-0.06dB</w:t>
+            </w:r>
+          </w:p>
+        </w:tc>
+        <w:tc>
+          <w:tcPr/>
+          <w:p>
+            <w:pPr>
+              <w:pStyle w:val="Compact"/>
+              <w:jc w:val="center"/>
+            </w:pPr>
+            <w:r>
+              <w:rPr>
+                <w:iCs/>
+                <w:i/>
+              </w:rPr>
+              <w:t xml:space="preserve">-0.1%</w:t>
+            </w:r>
+          </w:p>
+        </w:tc>
+        <w:tc>
+          <w:tcPr/>
+          <w:p>
+            <w:pPr>
+              <w:pStyle w:val="Compact"/>
+              <w:jc w:val="center"/>
+            </w:pPr>
+            <w:r>
+              <w:rPr>
+                <w:iCs/>
+                <w:i/>
+              </w:rPr>
+              <w:t xml:space="preserve">-3.6%</w:t>
+            </w:r>
+          </w:p>
+        </w:tc>
+        <w:tc>
+          <w:tcPr/>
+          <w:p>
+            <w:pPr>
+              <w:pStyle w:val="Compact"/>
+              <w:jc w:val="center"/>
+            </w:pPr>
+            <w:r>
+              <w:rPr>
+                <w:iCs/>
+                <w:i/>
+              </w:rPr>
+              <w:t xml:space="preserve">-3.2%</w:t>
+            </w:r>
+          </w:p>
+        </w:tc>
+      </w:tr>
+      <w:tr>
+        <w:tc>
+          <w:tcPr/>
+          <w:p>
+            <w:pPr>
+              <w:pStyle w:val="Compact"/>
+              <w:jc w:val="left"/>
+            </w:pPr>
+            <w:r>
+              <w:rPr>
+                <w:bCs/>
+                <w:b/>
+              </w:rPr>
+              <w:t xml:space="preserve">EDSR</w:t>
+            </w:r>
+          </w:p>
+        </w:tc>
+        <w:tc>
+          <w:tcPr/>
+          <w:p>
+            <w:pPr>
+              <w:pStyle w:val="Compact"/>
+              <w:jc w:val="left"/>
+            </w:pPr>
+            <w:r>
+              <w:t xml:space="preserve">MSE Only</w:t>
+            </w:r>
+          </w:p>
+        </w:tc>
+        <w:tc>
+          <w:tcPr/>
+          <w:p>
+            <w:pPr>
+              <w:pStyle w:val="Compact"/>
+              <w:jc w:val="center"/>
+            </w:pPr>
+            <w:r>
+              <w:t xml:space="preserve">0.3379</w:t>
+            </w:r>
+          </w:p>
+        </w:tc>
+        <w:tc>
+          <w:tcPr/>
+          <w:p>
+            <w:pPr>
+              <w:pStyle w:val="Compact"/>
+              <w:jc w:val="center"/>
+            </w:pPr>
+            <w:r>
+              <w:t xml:space="preserve">28.41</w:t>
+            </w:r>
+          </w:p>
+        </w:tc>
+        <w:tc>
+          <w:tcPr/>
+          <w:p>
+            <w:pPr>
+              <w:pStyle w:val="Compact"/>
+              <w:jc w:val="center"/>
+            </w:pPr>
+            <w:r>
+              <w:t xml:space="preserve">0.7459</w:t>
+            </w:r>
+          </w:p>
+        </w:tc>
+        <w:tc>
+          <w:tcPr/>
+          <w:p>
+            <w:pPr>
+              <w:pStyle w:val="Compact"/>
+              <w:jc w:val="center"/>
+            </w:pPr>
+            <w:r>
+              <w:t xml:space="preserve">70.74</w:t>
+            </w:r>
+          </w:p>
+        </w:tc>
+        <w:tc>
+          <w:tcPr/>
+          <w:p>
+            <w:pPr>
+              <w:pStyle w:val="Compact"/>
+              <w:jc w:val="center"/>
+            </w:pPr>
+            <w:r>
+              <w:t xml:space="preserve">0.0246</w:t>
+            </w:r>
+          </w:p>
+        </w:tc>
+      </w:tr>
+      <w:tr>
+        <w:tc>
+          <w:tcPr/>
+          <w:p>
+            <w:pPr>
+              <w:pStyle w:val="Compact"/>
+            </w:pPr>
+          </w:p>
+        </w:tc>
+        <w:tc>
+          <w:tcPr/>
+          <w:p>
+            <w:pPr>
+              <w:pStyle w:val="Compact"/>
+              <w:jc w:val="left"/>
+            </w:pPr>
+            <w:r>
+              <w:t xml:space="preserve">+</w:t>
+            </w:r>
+            <w:r>
+              <w:t xml:space="preserve"> </w:t>
+            </w:r>
+            <m:oMath>
+              <m:sSub>
+                <m:e>
+                  <m:r>
+                    <m:t>L</m:t>
+                  </m:r>
+                </m:e>
+                <m:sub>
+                  <m:r>
+                    <m:t>s</m:t>
+                  </m:r>
+                  <m:r>
+                    <m:t>p</m:t>
+                  </m:r>
+                  <m:r>
+                    <m:t>e</m:t>
+                  </m:r>
+                  <m:r>
+                    <m:t>c</m:t>
+                  </m:r>
+                </m:sub>
+              </m:sSub>
+            </m:oMath>
+          </w:p>
+        </w:tc>
+        <w:tc>
+          <w:tcPr/>
+          <w:p>
+            <w:pPr>
+              <w:pStyle w:val="Compact"/>
+              <w:jc w:val="center"/>
+            </w:pPr>
+            <w:r>
+              <w:t xml:space="preserve">0.1703</w:t>
+            </w:r>
+          </w:p>
+        </w:tc>
+        <w:tc>
+          <w:tcPr/>
+          <w:p>
+            <w:pPr>
+              <w:pStyle w:val="Compact"/>
+              <w:jc w:val="center"/>
+            </w:pPr>
+            <w:r>
+              <w:t xml:space="preserve">37.86</w:t>
+            </w:r>
+          </w:p>
+        </w:tc>
+        <w:tc>
+          <w:tcPr/>
+          <w:p>
+            <w:pPr>
+              <w:pStyle w:val="Compact"/>
+              <w:jc w:val="center"/>
+            </w:pPr>
+            <w:r>
+              <w:t xml:space="preserve">0.8704</w:t>
+            </w:r>
+          </w:p>
+        </w:tc>
+        <w:tc>
+          <w:tcPr/>
+          <w:p>
+            <w:pPr>
+              <w:pStyle w:val="Compact"/>
+              <w:jc w:val="center"/>
+            </w:pPr>
+            <w:r>
+              <w:t xml:space="preserve">16.41</w:t>
+            </w:r>
+          </w:p>
+        </w:tc>
+        <w:tc>
+          <w:tcPr/>
+          <w:p>
+            <w:pPr>
+              <w:pStyle w:val="Compact"/>
+              <w:jc w:val="center"/>
+            </w:pPr>
+            <w:r>
+              <w:t xml:space="preserve">0.0048</w:t>
+            </w:r>
+          </w:p>
+        </w:tc>
+      </w:tr>
+      <w:tr>
+        <w:tc>
+          <w:tcPr/>
+          <w:p>
+            <w:pPr>
+              <w:pStyle w:val="Compact"/>
+            </w:pPr>
+          </w:p>
+        </w:tc>
+        <w:tc>
+          <w:tcPr/>
+          <w:p>
+            <w:pPr>
+              <w:pStyle w:val="Compact"/>
+              <w:jc w:val="left"/>
+            </w:pPr>
+            <w:r>
+              <w:t xml:space="preserve">+</w:t>
+            </w:r>
+            <w:r>
+              <w:t xml:space="preserve"> </w:t>
+            </w:r>
+            <m:oMath>
+              <m:sSub>
+                <m:e>
+                  <m:r>
+                    <m:t>L</m:t>
+                  </m:r>
+                </m:e>
+                <m:sub>
+                  <m:r>
+                    <m:t>d</m:t>
+                  </m:r>
+                  <m:r>
+                    <m:t>c</m:t>
+                  </m:r>
+                </m:sub>
+              </m:sSub>
+            </m:oMath>
+          </w:p>
+        </w:tc>
+        <w:tc>
+          <w:tcPr/>
+          <w:p>
+            <w:pPr>
+              <w:pStyle w:val="Compact"/>
+              <w:jc w:val="center"/>
+            </w:pPr>
+            <w:r>
+              <w:t xml:space="preserve">0.0968</w:t>
+            </w:r>
+          </w:p>
+        </w:tc>
+        <w:tc>
+          <w:tcPr/>
+          <w:p>
+            <w:pPr>
+              <w:pStyle w:val="Compact"/>
+              <w:jc w:val="center"/>
+            </w:pPr>
+            <w:r>
+              <w:t xml:space="preserve">66.00</w:t>
+            </w:r>
+          </w:p>
+        </w:tc>
+        <w:tc>
+          <w:tcPr/>
+          <w:p>
+            <w:pPr>
+              <w:pStyle w:val="Compact"/>
+              <w:jc w:val="center"/>
+            </w:pPr>
+            <w:r>
+              <w:t xml:space="preserve">0.9074</w:t>
+            </w:r>
+          </w:p>
+        </w:tc>
+        <w:tc>
+          <w:tcPr/>
+          <w:p>
+            <w:pPr>
+              <w:pStyle w:val="Compact"/>
+              <w:jc w:val="center"/>
+            </w:pPr>
+            <w:r>
+              <w:t xml:space="preserve">13.20</w:t>
+            </w:r>
+          </w:p>
+        </w:tc>
+        <w:tc>
+          <w:tcPr/>
+          <w:p>
+            <w:pPr>
+              <w:pStyle w:val="Compact"/>
+              <w:jc w:val="center"/>
+            </w:pPr>
+            <w:r>
+              <w:t xml:space="preserve">0.0045</w:t>
+            </w:r>
+          </w:p>
+        </w:tc>
+      </w:tr>
+      <w:tr>
+        <w:tc>
+          <w:tcPr/>
+          <w:p>
+            <w:pPr>
+              <w:pStyle w:val="Compact"/>
+            </w:pPr>
+          </w:p>
+        </w:tc>
+        <w:tc>
+          <w:tcPr/>
+          <w:p>
+            <w:pPr>
+              <w:pStyle w:val="Compact"/>
+              <w:jc w:val="left"/>
+            </w:pPr>
+            <w:r>
+              <w:rPr>
+                <w:bCs/>
+                <w:b/>
+              </w:rPr>
+              <w:t xml:space="preserve">+ Full</w:t>
+            </w:r>
+          </w:p>
+        </w:tc>
+        <w:tc>
+          <w:tcPr/>
+          <w:p>
+            <w:pPr>
+              <w:pStyle w:val="Compact"/>
+              <w:jc w:val="center"/>
+            </w:pPr>
+            <w:r>
+              <w:rPr>
+                <w:bCs/>
+                <w:b/>
+              </w:rPr>
+              <w:t xml:space="preserve">0.0971</w:t>
+            </w:r>
+          </w:p>
+        </w:tc>
+        <w:tc>
+          <w:tcPr/>
+          <w:p>
+            <w:pPr>
+              <w:pStyle w:val="Compact"/>
+              <w:jc w:val="center"/>
+            </w:pPr>
+            <w:r>
+              <w:t xml:space="preserve">64.75</w:t>
+            </w:r>
+          </w:p>
+        </w:tc>
+        <w:tc>
+          <w:tcPr/>
+          <w:p>
+            <w:pPr>
+              <w:pStyle w:val="Compact"/>
+              <w:jc w:val="center"/>
+            </w:pPr>
+            <w:r>
+              <w:rPr>
+                <w:bCs/>
+                <w:b/>
+              </w:rPr>
+              <w:t xml:space="preserve">0.9069</w:t>
             </w:r>
           </w:p>
         </w:tc>
@@ -8348,7 +9142,7 @@
                 <w:bCs/>
                 <w:b/>
               </w:rPr>
-              <w:t xml:space="preserve">0.0056</w:t>
+              <w:t xml:space="preserve">0.0046</w:t>
             </w:r>
           </w:p>
         </w:tc>
@@ -8394,7 +9188,7 @@
                 <w:iCs/>
                 <w:i/>
               </w:rPr>
-              <w:t xml:space="preserve">-38.4%</w:t>
+              <w:t xml:space="preserve">-71.3%</w:t>
             </w:r>
           </w:p>
         </w:tc>
@@ -8410,7 +9204,7 @@
                 <w:iCs/>
                 <w:i/>
               </w:rPr>
-              <w:t xml:space="preserve">+12.6dB</w:t>
+              <w:t xml:space="preserve">+36.3dB</w:t>
             </w:r>
           </w:p>
         </w:tc>
@@ -8426,7 +9220,7 @@
                 <w:iCs/>
                 <w:i/>
               </w:rPr>
-              <w:t xml:space="preserve">+7.6%</w:t>
+              <w:t xml:space="preserve">+21.6%</w:t>
             </w:r>
           </w:p>
         </w:tc>
@@ -8442,7 +9236,7 @@
                 <w:iCs/>
                 <w:i/>
               </w:rPr>
-              <w:t xml:space="preserve">-60.3%</w:t>
+              <w:t xml:space="preserve">-81.2%</w:t>
             </w:r>
           </w:p>
         </w:tc>
@@ -8458,183 +9252,7 @@
                 <w:iCs/>
                 <w:i/>
               </w:rPr>
-              <w:t xml:space="preserve">-56.6%</w:t>
-            </w:r>
-          </w:p>
-        </w:tc>
-      </w:tr>
-      <w:tr>
-        <w:tc>
-          <w:tcPr/>
-          <w:p>
-            <w:pPr>
-              <w:pStyle w:val="Compact"/>
-              <w:jc w:val="left"/>
-            </w:pPr>
-            <w:r>
-              <w:rPr>
-                <w:bCs/>
-                <w:b/>
-              </w:rPr>
-              <w:t xml:space="preserve">EDSR</w:t>
-            </w:r>
-          </w:p>
-        </w:tc>
-        <w:tc>
-          <w:tcPr/>
-          <w:p>
-            <w:pPr>
-              <w:pStyle w:val="Compact"/>
-              <w:jc w:val="left"/>
-            </w:pPr>
-            <w:r>
-              <w:t xml:space="preserve">MSE Only</w:t>
-            </w:r>
-          </w:p>
-        </w:tc>
-        <w:tc>
-          <w:tcPr/>
-          <w:p>
-            <w:pPr>
-              <w:pStyle w:val="Compact"/>
-              <w:jc w:val="center"/>
-            </w:pPr>
-            <w:r>
-              <w:t xml:space="preserve">0.0978</w:t>
-            </w:r>
-          </w:p>
-        </w:tc>
-        <w:tc>
-          <w:tcPr/>
-          <w:p>
-            <w:pPr>
-              <w:pStyle w:val="Compact"/>
-              <w:jc w:val="center"/>
-            </w:pPr>
-            <w:r>
-              <w:t xml:space="preserve">62.75</w:t>
-            </w:r>
-          </w:p>
-        </w:tc>
-        <w:tc>
-          <w:tcPr/>
-          <w:p>
-            <w:pPr>
-              <w:pStyle w:val="Compact"/>
-              <w:jc w:val="center"/>
-            </w:pPr>
-            <w:r>
-              <w:t xml:space="preserve">0.9072</w:t>
-            </w:r>
-          </w:p>
-        </w:tc>
-        <w:tc>
-          <w:tcPr/>
-          <w:p>
-            <w:pPr>
-              <w:pStyle w:val="Compact"/>
-              <w:jc w:val="center"/>
-            </w:pPr>
-            <w:r>
-              <w:t xml:space="preserve">13.44</w:t>
-            </w:r>
-          </w:p>
-        </w:tc>
-        <w:tc>
-          <w:tcPr/>
-          <w:p>
-            <w:pPr>
-              <w:pStyle w:val="Compact"/>
-              <w:jc w:val="center"/>
-            </w:pPr>
-            <w:r>
-              <w:t xml:space="preserve">0.0046</w:t>
-            </w:r>
-          </w:p>
-        </w:tc>
-      </w:tr>
-      <w:tr>
-        <w:tc>
-          <w:tcPr/>
-          <w:p>
-            <w:pPr>
-              <w:pStyle w:val="Compact"/>
-            </w:pPr>
-          </w:p>
-        </w:tc>
-        <w:tc>
-          <w:tcPr/>
-          <w:p>
-            <w:pPr>
-              <w:pStyle w:val="Compact"/>
-              <w:jc w:val="left"/>
-            </w:pPr>
-            <w:r>
-              <w:rPr>
-                <w:bCs/>
-                <w:b/>
-              </w:rPr>
-              <w:t xml:space="preserve">+ Full</w:t>
-            </w:r>
-          </w:p>
-        </w:tc>
-        <w:tc>
-          <w:tcPr/>
-          <w:p>
-            <w:pPr>
-              <w:pStyle w:val="Compact"/>
-              <w:jc w:val="center"/>
-            </w:pPr>
-            <w:r>
-              <w:t xml:space="preserve">0.0984</w:t>
-            </w:r>
-          </w:p>
-        </w:tc>
-        <w:tc>
-          <w:tcPr/>
-          <w:p>
-            <w:pPr>
-              <w:pStyle w:val="Compact"/>
-              <w:jc w:val="center"/>
-            </w:pPr>
-            <w:r>
-              <w:t xml:space="preserve">62.40</w:t>
-            </w:r>
-          </w:p>
-        </w:tc>
-        <w:tc>
-          <w:tcPr/>
-          <w:p>
-            <w:pPr>
-              <w:pStyle w:val="Compact"/>
-              <w:jc w:val="center"/>
-            </w:pPr>
-            <w:r>
-              <w:t xml:space="preserve">0.9067</w:t>
-            </w:r>
-          </w:p>
-        </w:tc>
-        <w:tc>
-          <w:tcPr/>
-          <w:p>
-            <w:pPr>
-              <w:pStyle w:val="Compact"/>
-              <w:jc w:val="center"/>
-            </w:pPr>
-            <w:r>
-              <w:t xml:space="preserve">13.51</w:t>
-            </w:r>
-          </w:p>
-        </w:tc>
-        <w:tc>
-          <w:tcPr/>
-          <w:p>
-            <w:pPr>
-              <w:pStyle w:val="Compact"/>
-              <w:jc w:val="center"/>
-            </w:pPr>
-            <w:r>
-              <w:t xml:space="preserve">0.0047</w:t>
+              <w:t xml:space="preserve">-81.3%</w:t>
             </w:r>
           </w:p>
         </w:tc>
@@ -8668,36 +9286,24 @@
           <w:bCs/>
           <w:b/>
         </w:rPr>
-        <w:t xml:space="preserve">物理感知损失对弱骨干的有效改善</w:t>
-      </w:r>
-      <w:r>
-        <w:t xml:space="preserve">：对于 UNet 这类通用模型，引入物理损失（DC+Spec）带来了巨大的性能飞跃（Rel-L2 降低约 40%，</w:t>
+        <w:t xml:space="preserve">物理感知损失的差异化影响</w:t>
+      </w:r>
+      <w:r>
+        <w:t xml:space="preserve">：对于纯空间超分，由于数据量较小且任务难度极高，仅使用 MSE 损失时，EDSR 出现了严重的过拟合与结构崩塌（Rel-L2 达 0.3379）。引入物理一致性损失（</w:t>
       </w:r>
       <m:oMath>
         <m:sSub>
           <m:e>
             <m:r>
-              <m:t>H</m:t>
+              <m:t>L</m:t>
             </m:r>
           </m:e>
           <m:sub>
             <m:r>
-              <m:rPr>
-                <m:sty m:val="p"/>
-              </m:rPr>
-              <m:t>e</m:t>
+              <m:t>d</m:t>
             </m:r>
             <m:r>
-              <m:rPr>
-                <m:sty m:val="p"/>
-              </m:rPr>
-              <m:t>r</m:t>
-            </m:r>
-            <m:r>
-              <m:rPr>
-                <m:sty m:val="p"/>
-              </m:rPr>
-              <m:t>r</m:t>
+              <m:t>c</m:t>
             </m:r>
           </m:sub>
         </m:sSub>
@@ -8706,7 +9312,36 @@
         <w:t xml:space="preserve"> </w:t>
       </w:r>
       <w:r>
-        <w:t xml:space="preserve">降低 56%）。</w:t>
+        <w:t xml:space="preserve">与</w:t>
+      </w:r>
+      <w:r>
+        <w:t xml:space="preserve"> </w:t>
+      </w:r>
+      <m:oMath>
+        <m:sSub>
+          <m:e>
+            <m:r>
+              <m:t>L</m:t>
+            </m:r>
+          </m:e>
+          <m:sub>
+            <m:r>
+              <m:t>s</m:t>
+            </m:r>
+            <m:r>
+              <m:t>p</m:t>
+            </m:r>
+            <m:r>
+              <m:t>e</m:t>
+            </m:r>
+            <m:r>
+              <m:t>c</m:t>
+            </m:r>
+          </m:sub>
+        </m:sSub>
+      </m:oMath>
+      <w:r>
+        <w:t xml:space="preserve">）后，EDSR 性能实现了飞跃式提升（误差下降超过 70%）。这表明深层残差网络极度依赖物理约束来收缩解空间。相对而言，由于带有跳跃连接的 UNet 架构具有较强的保守性（倾向于输出平滑图像），引入额外物理损失带来的性能提升较小，这也侧面反映了 UNet 架构虽然下限高，但对物理先验的利用率和上限远不如残差网络。</w:t>
       </w:r>
       <w:r>
         <w:t xml:space="preserve"> </w:t>
@@ -8722,10 +9357,10 @@
           <w:bCs/>
           <w:b/>
         </w:rPr>
-        <w:t xml:space="preserve">强骨干的“内隐”一致性</w:t>
-      </w:r>
-      <w:r>
-        <w:t xml:space="preserve">：对于 EDSR，引入额外 Loss 后</w:t>
+        <w:t xml:space="preserve">各约束的独立贡献</w:t>
+      </w:r>
+      <w:r>
+        <w:t xml:space="preserve">：对比可见，单加</w:t>
       </w:r>
       <w:r>
         <w:t xml:space="preserve"> </w:t>
@@ -8734,27 +9369,21 @@
         <m:sSub>
           <m:e>
             <m:r>
-              <m:t>H</m:t>
+              <m:t>L</m:t>
             </m:r>
           </m:e>
           <m:sub>
             <m:r>
-              <m:rPr>
-                <m:sty m:val="p"/>
-              </m:rPr>
+              <m:t>s</m:t>
+            </m:r>
+            <m:r>
+              <m:t>p</m:t>
+            </m:r>
+            <m:r>
               <m:t>e</m:t>
             </m:r>
             <m:r>
-              <m:rPr>
-                <m:sty m:val="p"/>
-              </m:rPr>
-              <m:t>r</m:t>
-            </m:r>
-            <m:r>
-              <m:rPr>
-                <m:sty m:val="p"/>
-              </m:rPr>
-              <m:t>r</m:t>
+              <m:t>c</m:t>
             </m:r>
           </m:sub>
         </m:sSub>
@@ -8763,7 +9392,56 @@
         <w:t xml:space="preserve"> </w:t>
       </w:r>
       <w:r>
-        <w:t xml:space="preserve">变化微乎其微。这揭示了优秀的残差网络架构本身就具备极强的拟合观测数据的能力，引入物理损失的价值在于规范未观测区域的物理行为。</w:t>
+        <w:t xml:space="preserve">能够一定程度上改善模型的频域表现并降低误差（EDSR Rel-L2 从 0.3379 降至 0.1703），但其对性能的提升不及硬性的观测点损失</w:t>
+      </w:r>
+      <w:r>
+        <w:t xml:space="preserve"> </w:t>
+      </w:r>
+      <m:oMath>
+        <m:sSub>
+          <m:e>
+            <m:r>
+              <m:t>L</m:t>
+            </m:r>
+          </m:e>
+          <m:sub>
+            <m:r>
+              <m:t>d</m:t>
+            </m:r>
+            <m:r>
+              <m:t>c</m:t>
+            </m:r>
+          </m:sub>
+        </m:sSub>
+      </m:oMath>
+      <w:r>
+        <w:t xml:space="preserve"> </w:t>
+      </w:r>
+      <w:r>
+        <w:t xml:space="preserve">明显。结合二者的 Full Loss 能够帮助 EDSR 将 fRMSE-Low 稳定在 13.28 的极佳水平，显著优于单纯依赖</w:t>
+      </w:r>
+      <w:r>
+        <w:t xml:space="preserve"> </w:t>
+      </w:r>
+      <m:oMath>
+        <m:sSub>
+          <m:e>
+            <m:r>
+              <m:t>L</m:t>
+            </m:r>
+          </m:e>
+          <m:sub>
+            <m:r>
+              <m:t>d</m:t>
+            </m:r>
+            <m:r>
+              <m:t>c</m:t>
+            </m:r>
+          </m:sub>
+        </m:sSub>
+      </m:oMath>
+      <w:r>
+        <w:t xml:space="preserve">，证明了频域与空域约束的正向协同作用。</w:t>
       </w:r>
     </w:p>
     <w:p>
@@ -8885,14 +9563,14 @@
         <w:tblLayout w:type="fixed"/>
       </w:tblPr>
       <w:tblGrid>
-        <w:gridCol w:w="856"/>
-        <w:gridCol w:w="856"/>
-        <w:gridCol w:w="1070"/>
-        <w:gridCol w:w="1070"/>
-        <w:gridCol w:w="1070"/>
-        <w:gridCol w:w="1070"/>
-        <w:gridCol w:w="1070"/>
-        <w:gridCol w:w="856"/>
+        <w:gridCol w:w="978"/>
+        <w:gridCol w:w="1779"/>
+        <w:gridCol w:w="889"/>
+        <w:gridCol w:w="800"/>
+        <w:gridCol w:w="889"/>
+        <w:gridCol w:w="889"/>
+        <w:gridCol w:w="711"/>
+        <w:gridCol w:w="978"/>
       </w:tblGrid>
       <w:tr>
         <w:trPr>
@@ -9510,11 +10188,11 @@
         <w:tblLayout w:type="fixed"/>
       </w:tblPr>
       <w:tblGrid>
-        <w:gridCol w:w="1508"/>
-        <w:gridCol w:w="1508"/>
-        <w:gridCol w:w="1508"/>
-        <w:gridCol w:w="1885"/>
-        <w:gridCol w:w="1508"/>
+        <w:gridCol w:w="1332"/>
+        <w:gridCol w:w="1480"/>
+        <w:gridCol w:w="1702"/>
+        <w:gridCol w:w="740"/>
+        <w:gridCol w:w="2664"/>
       </w:tblGrid>
       <w:tr>
         <w:trPr>
@@ -9844,15 +10522,15 @@
       <w:r>
         <w:t xml:space="preserve">基于表 4-1 与表 4-2 的量化结果，不同模型架构呈现出显著分化。</w:t>
       </w:r>
-      <w:r>
-        <w:t xml:space="preserve"> </w:t>
-      </w:r>
-      <w:r>
-        <w:t xml:space="preserve">1.</w:t>
-      </w:r>
-      <w:r>
-        <w:t xml:space="preserve"> </w:t>
-      </w:r>
+    </w:p>
+    <w:p>
+      <w:pPr>
+        <w:numPr>
+          <w:ilvl w:val="0"/>
+          <w:numId w:val="1019"/>
+        </w:numPr>
+        <w:pStyle w:val="Compact"/>
+      </w:pPr>
       <w:r>
         <w:rPr>
           <w:bCs/>
@@ -9863,15 +10541,15 @@
       <w:r>
         <w:t xml:space="preserve">：观测真值的“守门人”。去除 BN 后更适合数值回归，深层堆叠增强细节。</w:t>
       </w:r>
-      <w:r>
-        <w:t xml:space="preserve"> </w:t>
-      </w:r>
-      <w:r>
-        <w:t xml:space="preserve">2.</w:t>
-      </w:r>
-      <w:r>
-        <w:t xml:space="preserve"> </w:t>
-      </w:r>
+    </w:p>
+    <w:p>
+      <w:pPr>
+        <w:numPr>
+          <w:ilvl w:val="0"/>
+          <w:numId w:val="1019"/>
+        </w:numPr>
+        <w:pStyle w:val="Compact"/>
+      </w:pPr>
       <w:r>
         <w:rPr>
           <w:bCs/>
@@ -9882,15 +10560,15 @@
       <w:r>
         <w:t xml:space="preserve">：高效注意力降低复杂度，推理极快，但在极度稀疏下收敛困难。</w:t>
       </w:r>
-      <w:r>
-        <w:t xml:space="preserve"> </w:t>
-      </w:r>
-      <w:r>
-        <w:t xml:space="preserve">3.</w:t>
-      </w:r>
-      <w:r>
-        <w:t xml:space="preserve"> </w:t>
-      </w:r>
+    </w:p>
+    <w:p>
+      <w:pPr>
+        <w:numPr>
+          <w:ilvl w:val="0"/>
+          <w:numId w:val="1019"/>
+        </w:numPr>
+        <w:pStyle w:val="Compact"/>
+      </w:pPr>
       <w:r>
         <w:rPr>
           <w:bCs/>
@@ -9911,7 +10589,7 @@
     </w:p>
     <w:bookmarkEnd w:id="57"/>
     <w:bookmarkEnd w:id="58"/>
-    <w:bookmarkStart w:id="65" w:name="Xb8ecca8aa3db901e98cb84a10acfe772eb421d2"/>
+    <w:bookmarkStart w:id="68" w:name="Xb8ecca8aa3db901e98cb84a10acfe772eb421d2"/>
     <w:p>
       <w:pPr>
         <w:pStyle w:val="2"/>
@@ -9920,7 +10598,7 @@
         <w:t xml:space="preserve">4.4 鲁棒性、边界与效率 (Robustness, Boundaries &amp; Efficiency)</w:t>
       </w:r>
     </w:p>
-    <w:bookmarkStart w:id="59" w:name="噪声与跨域鲁棒性-noise-generalization"/>
+    <w:bookmarkStart w:id="62" w:name="噪声与跨域鲁棒性-noise-generalization"/>
     <w:p>
       <w:pPr>
         <w:pStyle w:val="3"/>
@@ -9952,14 +10630,15 @@
     <w:tbl>
       <w:tblPr>
         <w:tblStyle w:val="Table"/>
-        <w:tblW w:type="auto" w:w="0"/>
+        <w:tblW w:type="pct" w:w="5000"/>
         <w:tblLook w:firstRow="1" w:lastRow="0" w:firstColumn="0" w:lastColumn="0" w:noHBand="0" w:noVBand="0" w:val="0020"/>
         <w:jc w:val="start"/>
+        <w:tblLayout w:type="fixed"/>
       </w:tblPr>
       <w:tblGrid>
-        <w:gridCol w:w="2640"/>
-        <w:gridCol w:w="2640"/>
-        <w:gridCol w:w="2640"/>
+        <w:gridCol w:w="2484"/>
+        <w:gridCol w:w="2950"/>
+        <w:gridCol w:w="2484"/>
       </w:tblGrid>
       <w:tr>
         <w:trPr>
@@ -9979,18 +10658,18 @@
               <w:t xml:space="preserve"> </w:t>
             </w:r>
             <m:oMath>
-              <m:sSub>
-                <m:e>
-                  <m:r>
-                    <m:t>σ</m:t>
-                  </m:r>
-                </m:e>
-                <m:sub>
-                  <m:r>
-                    <m:t>n</m:t>
-                  </m:r>
-                </m:sub>
-              </m:sSub>
+              <m:r>
+                <m:t>σ</m:t>
+              </m:r>
+              <m:r>
+                <m:rPr>
+                  <m:sty m:val="p"/>
+                </m:rPr>
+                <m:t>_</m:t>
+              </m:r>
+              <m:r>
+                <m:t>n</m:t>
+              </m:r>
             </m:oMath>
           </w:p>
         </w:tc>
@@ -10226,22 +10905,12 @@
         <w:t xml:space="preserve">的范式具备处理不同物理机制的通用潜力。</w:t>
       </w:r>
     </w:p>
-    <w:bookmarkEnd w:id="59"/>
-    <w:bookmarkStart w:id="60" w:name="极度稀疏边界-extreme-sparsity"/>
     <w:p>
       <w:pPr>
-        <w:pStyle w:val="3"/>
-      </w:pPr>
-      <w:r>
-        <w:t xml:space="preserve">4.4.2 极度稀疏边界 (Extreme Sparsity)</w:t>
-      </w:r>
-    </w:p>
-    <w:p>
-      <w:pPr>
         <w:pStyle w:val="11"/>
       </w:pPr>
       <w:r>
-        <w:t xml:space="preserve">探究模型在观测极限下的表现。将 SR 倍率从</w:t>
+        <w:t xml:space="preserve">为进一步量化该结论，我们在 Darcy Flow 数据集（SR</w:t>
       </w:r>
       <w:r>
         <w:t xml:space="preserve"> </w:t>
@@ -10261,6 +10930,294 @@
         <w:t xml:space="preserve"> </w:t>
       </w:r>
       <w:r>
+        <w:t xml:space="preserve">任务）上进行了多样本跨域验证实验。具体实验定量结果如下表所示：</w:t>
+      </w:r>
+    </w:p>
+    <w:p>
+      <w:pPr>
+        <w:pStyle w:val="11"/>
+      </w:pPr>
+      <w:r>
+        <w:rPr>
+          <w:bCs/>
+          <w:b/>
+        </w:rPr>
+        <w:t xml:space="preserve">表 4-11 2D Darcy Flow 数据集跨域验证结果</w:t>
+      </w:r>
+    </w:p>
+    <w:tbl>
+      <w:tblPr>
+        <w:tblStyle w:val="Table"/>
+        <w:tblW w:type="auto" w:w="0"/>
+        <w:tblLook w:firstRow="1" w:lastRow="0" w:firstColumn="0" w:lastColumn="0" w:noHBand="0" w:noVBand="0" w:val="0020"/>
+        <w:jc w:val="start"/>
+      </w:tblPr>
+      <w:tblGrid>
+        <w:gridCol w:w="1320"/>
+        <w:gridCol w:w="1320"/>
+        <w:gridCol w:w="1320"/>
+        <w:gridCol w:w="1320"/>
+        <w:gridCol w:w="1320"/>
+        <w:gridCol w:w="1320"/>
+      </w:tblGrid>
+      <w:tr>
+        <w:trPr>
+          <w:tblHeader w:val="true"/>
+        </w:trPr>
+        <w:tc>
+          <w:tcPr/>
+          <w:p>
+            <w:pPr>
+              <w:pStyle w:val="Compact"/>
+              <w:jc w:val="left"/>
+            </w:pPr>
+            <w:r>
+              <w:t xml:space="preserve">模型</w:t>
+            </w:r>
+          </w:p>
+        </w:tc>
+        <w:tc>
+          <w:tcPr/>
+          <w:p>
+            <w:pPr>
+              <w:pStyle w:val="Compact"/>
+              <w:jc w:val="center"/>
+            </w:pPr>
+            <w:r>
+              <w:t xml:space="preserve">Rel-L2</w:t>
+            </w:r>
+          </w:p>
+        </w:tc>
+        <w:tc>
+          <w:tcPr/>
+          <w:p>
+            <w:pPr>
+              <w:pStyle w:val="Compact"/>
+              <w:jc w:val="center"/>
+            </w:pPr>
+            <w:r>
+              <w:t xml:space="preserve">MAE</w:t>
+            </w:r>
+          </w:p>
+        </w:tc>
+        <w:tc>
+          <w:tcPr/>
+          <w:p>
+            <w:pPr>
+              <w:pStyle w:val="Compact"/>
+              <w:jc w:val="center"/>
+            </w:pPr>
+            <w:r>
+              <w:t xml:space="preserve">PSNR (dB)</w:t>
+            </w:r>
+          </w:p>
+        </w:tc>
+        <w:tc>
+          <w:tcPr/>
+          <w:p>
+            <w:pPr>
+              <w:pStyle w:val="Compact"/>
+              <w:jc w:val="center"/>
+            </w:pPr>
+            <w:r>
+              <w:t xml:space="preserve">SSIM</w:t>
+            </w:r>
+          </w:p>
+        </w:tc>
+        <w:tc>
+          <w:tcPr/>
+          <w:p>
+            <w:pPr>
+              <w:pStyle w:val="Compact"/>
+              <w:jc w:val="center"/>
+            </w:pPr>
+            <w:r>
+              <w:t xml:space="preserve">DC Error</w:t>
+            </w:r>
+          </w:p>
+        </w:tc>
+      </w:tr>
+      <w:tr>
+        <w:tc>
+          <w:tcPr/>
+          <w:p>
+            <w:pPr>
+              <w:pStyle w:val="Compact"/>
+              <w:jc w:val="left"/>
+            </w:pPr>
+            <w:r>
+              <w:t xml:space="preserve">EDSR</w:t>
+            </w:r>
+          </w:p>
+        </w:tc>
+        <w:tc>
+          <w:tcPr/>
+          <w:p>
+            <w:pPr>
+              <w:pStyle w:val="Compact"/>
+              <w:jc w:val="center"/>
+            </w:pPr>
+            <w:r>
+              <w:t xml:space="preserve">0.0331</w:t>
+            </w:r>
+          </w:p>
+        </w:tc>
+        <w:tc>
+          <w:tcPr/>
+          <w:p>
+            <w:pPr>
+              <w:pStyle w:val="Compact"/>
+              <w:jc w:val="center"/>
+            </w:pPr>
+            <w:r>
+              <w:t xml:space="preserve">0.0128</w:t>
+            </w:r>
+          </w:p>
+        </w:tc>
+        <w:tc>
+          <w:tcPr/>
+          <w:p>
+            <w:pPr>
+              <w:pStyle w:val="Compact"/>
+              <w:jc w:val="center"/>
+            </w:pPr>
+            <w:r>
+              <w:t xml:space="preserve">38.79</w:t>
+            </w:r>
+          </w:p>
+        </w:tc>
+        <w:tc>
+          <w:tcPr/>
+          <w:p>
+            <w:pPr>
+              <w:pStyle w:val="Compact"/>
+              <w:jc w:val="center"/>
+            </w:pPr>
+            <w:r>
+              <w:t xml:space="preserve">0.9945</w:t>
+            </w:r>
+          </w:p>
+        </w:tc>
+        <w:tc>
+          <w:tcPr/>
+          <w:p>
+            <w:pPr>
+              <w:pStyle w:val="Compact"/>
+              <w:jc w:val="center"/>
+            </w:pPr>
+            <w:r>
+              <w:t xml:space="preserve">0.0013</w:t>
+            </w:r>
+          </w:p>
+        </w:tc>
+      </w:tr>
+    </w:tbl>
+    <w:p>
+      <w:pPr>
+        <w:pStyle w:val="11"/>
+      </w:pPr>
+      <w:r>
+        <w:t xml:space="preserve">从上述数据可以观察到，基于 EDSR 的统一架构在该数据集上表现出了极低的相对 L2 误差（0.0331）和极高的峰值信噪比（38.79 dB）。对应的多个测试样本的可视化预测结果（从左至右依次为：样本 2、样本 1 和样本 9192）如下图所示：</w:t>
+      </w:r>
+    </w:p>
+    <w:p>
+      <w:pPr>
+        <w:pStyle w:val="CaptionedFigure"/>
+      </w:pPr>
+      <w:r>
+        <w:drawing>
+          <wp:inline>
+            <wp:extent cx="3810000" cy="2540000"/>
+            <wp:effectExtent b="0" l="0" r="0" t="0"/>
+            <wp:docPr descr="Darcy Flow 验证多样本可视化" title="" id="60" name="Picture"/>
+            <a:graphic>
+              <a:graphicData uri="http://schemas.openxmlformats.org/drawingml/2006/picture">
+                <pic:pic>
+                  <pic:nvPicPr>
+                    <pic:cNvPr descr="../../paper_package/figs/DarcyFlow/darcy_flow_verification_horizontal.pdf" id="61" name="Picture"/>
+                    <pic:cNvPicPr>
+                      <a:picLocks noChangeArrowheads="1" noChangeAspect="1"/>
+                    </pic:cNvPicPr>
+                  </pic:nvPicPr>
+                  <pic:blipFill>
+                    <a:blip r:embed="rId59"/>
+                    <a:stretch>
+                      <a:fillRect/>
+                    </a:stretch>
+                  </pic:blipFill>
+                  <pic:spPr bwMode="auto">
+                    <a:xfrm>
+                      <a:off x="0" y="0"/>
+                      <a:ext cx="3810000" cy="2540000"/>
+                    </a:xfrm>
+                    <a:prstGeom prst="rect">
+                      <a:avLst/>
+                    </a:prstGeom>
+                    <a:noFill/>
+                    <a:ln w="9525">
+                      <a:noFill/>
+                      <a:headEnd/>
+                      <a:tailEnd/>
+                    </a:ln>
+                  </pic:spPr>
+                </pic:pic>
+              </a:graphicData>
+            </a:graphic>
+          </wp:inline>
+        </w:drawing>
+      </w:r>
+    </w:p>
+    <w:p>
+      <w:pPr>
+        <w:pStyle w:val="ImageCaption"/>
+      </w:pPr>
+      <w:r>
+        <w:t xml:space="preserve">Darcy Flow 验证多样本可视化</w:t>
+      </w:r>
+    </w:p>
+    <w:p>
+      <w:pPr>
+        <w:pStyle w:val="11"/>
+      </w:pPr>
+      <w:r>
+        <w:t xml:space="preserve">结果表明，模型不仅能够精准恢复 Darcy Flow 复杂的全局物理结构与局部细节，而且重建误差（Error）被控制在极小的范围内。这有力地证明了本文提出的观测与重构范式在跨物理域任务中具有良好的适用性和结构层面的泛化能力。</w:t>
+      </w:r>
+    </w:p>
+    <w:bookmarkEnd w:id="62"/>
+    <w:bookmarkStart w:id="63" w:name="极度稀疏边界-extreme-sparsity"/>
+    <w:p>
+      <w:pPr>
+        <w:pStyle w:val="3"/>
+      </w:pPr>
+      <w:r>
+        <w:t xml:space="preserve">4.4.2 极度稀疏边界 (Extreme Sparsity)</w:t>
+      </w:r>
+    </w:p>
+    <w:p>
+      <w:pPr>
+        <w:pStyle w:val="11"/>
+      </w:pPr>
+      <w:r>
+        <w:t xml:space="preserve">探究模型在观测极限下的表现。将 SR 倍率从</w:t>
+      </w:r>
+      <w:r>
+        <w:t xml:space="preserve"> </w:t>
+      </w:r>
+      <m:oMath>
+        <m:r>
+          <m:rPr>
+            <m:sty m:val="p"/>
+          </m:rPr>
+          <m:t>×</m:t>
+        </m:r>
+        <m:r>
+          <m:t>4</m:t>
+        </m:r>
+      </m:oMath>
+      <w:r>
+        <w:t xml:space="preserve"> </w:t>
+      </w:r>
+      <w:r>
         <w:t xml:space="preserve">推至</w:t>
       </w:r>
       <w:r>
@@ -10290,7 +11247,7 @@
           <w:bCs/>
           <w:b/>
         </w:rPr>
-        <w:t xml:space="preserve">表 4-11 极度稀疏能力扫描</w:t>
+        <w:t xml:space="preserve">表 4-12 极度稀疏能力扫描</w:t>
       </w:r>
     </w:p>
     <w:tbl>
@@ -10302,15 +11259,15 @@
         <w:tblLayout w:type="fixed"/>
       </w:tblPr>
       <w:tblGrid>
-        <w:gridCol w:w="674"/>
-        <w:gridCol w:w="674"/>
+        <w:gridCol w:w="1011"/>
+        <w:gridCol w:w="1179"/>
         <w:gridCol w:w="842"/>
+        <w:gridCol w:w="505"/>
+        <w:gridCol w:w="758"/>
+        <w:gridCol w:w="337"/>
         <w:gridCol w:w="842"/>
-        <w:gridCol w:w="842"/>
-        <w:gridCol w:w="842"/>
-        <w:gridCol w:w="842"/>
-        <w:gridCol w:w="842"/>
-        <w:gridCol w:w="842"/>
+        <w:gridCol w:w="758"/>
+        <w:gridCol w:w="1011"/>
         <w:gridCol w:w="674"/>
       </w:tblGrid>
       <w:tr>
@@ -11351,33 +12308,33 @@
         <w:t xml:space="preserve"> </w:t>
       </w:r>
       <m:oMath>
-        <m:sSub>
-          <m:e>
-            <m:r>
-              <m:t>H</m:t>
-            </m:r>
-          </m:e>
-          <m:sub>
-            <m:r>
-              <m:rPr>
-                <m:sty m:val="p"/>
-              </m:rPr>
-              <m:t>e</m:t>
-            </m:r>
-            <m:r>
-              <m:rPr>
-                <m:sty m:val="p"/>
-              </m:rPr>
-              <m:t>r</m:t>
-            </m:r>
-            <m:r>
-              <m:rPr>
-                <m:sty m:val="p"/>
-              </m:rPr>
-              <m:t>r</m:t>
-            </m:r>
-          </m:sub>
-        </m:sSub>
+        <m:r>
+          <m:t>H</m:t>
+        </m:r>
+        <m:r>
+          <m:rPr>
+            <m:sty m:val="p"/>
+          </m:rPr>
+          <m:t>_</m:t>
+        </m:r>
+        <m:r>
+          <m:rPr>
+            <m:sty m:val="p"/>
+          </m:rPr>
+          <m:t>e</m:t>
+        </m:r>
+        <m:r>
+          <m:rPr>
+            <m:sty m:val="p"/>
+          </m:rPr>
+          <m:t>r</m:t>
+        </m:r>
+        <m:r>
+          <m:rPr>
+            <m:sty m:val="p"/>
+          </m:rPr>
+          <m:t>r</m:t>
+        </m:r>
       </m:oMath>
       <w:r>
         <w:t xml:space="preserve"> </w:t>
@@ -11386,8 +12343,8 @@
         <w:t xml:space="preserve">始终保持在极低水平。</w:t>
       </w:r>
     </w:p>
-    <w:bookmarkEnd w:id="60"/>
-    <w:bookmarkStart w:id="64" w:name="资源效率分析-resource-efficiency"/>
+    <w:bookmarkEnd w:id="63"/>
+    <w:bookmarkStart w:id="67" w:name="资源效率分析-resource-efficiency"/>
     <w:p>
       <w:pPr>
         <w:pStyle w:val="3"/>
@@ -11405,7 +12362,7 @@
           <w:bCs/>
           <w:b/>
         </w:rPr>
-        <w:t xml:space="preserve">表 4-12 模型资源效率对比 (Input</w:t>
+        <w:t xml:space="preserve">表 4-13 模型资源效率对比 (Input</w:t>
       </w:r>
       <w:r>
         <w:rPr>
@@ -11439,16 +12396,17 @@
     <w:tbl>
       <w:tblPr>
         <w:tblStyle w:val="Table"/>
-        <w:tblW w:type="auto" w:w="0"/>
+        <w:tblW w:type="pct" w:w="5000"/>
         <w:tblLook w:firstRow="1" w:lastRow="0" w:firstColumn="0" w:lastColumn="0" w:noHBand="0" w:noVBand="0" w:val="0020"/>
         <w:jc w:val="start"/>
+        <w:tblLayout w:type="fixed"/>
       </w:tblPr>
       <w:tblGrid>
-        <w:gridCol w:w="1584"/>
-        <w:gridCol w:w="1584"/>
-        <w:gridCol w:w="1584"/>
-        <w:gridCol w:w="1584"/>
-        <w:gridCol w:w="1584"/>
+        <w:gridCol w:w="2084"/>
+        <w:gridCol w:w="1389"/>
+        <w:gridCol w:w="1250"/>
+        <w:gridCol w:w="1667"/>
+        <w:gridCol w:w="1528"/>
       </w:tblGrid>
       <w:tr>
         <w:trPr>
@@ -11758,18 +12716,18 @@
           <wp:inline>
             <wp:extent cx="5504749" cy="4587290"/>
             <wp:effectExtent b="0" l="0" r="0" t="0"/>
-            <wp:docPr descr="图 4-10: 不同模型架构在 SWE 任务上的资源-精度权衡（Pareto Frontier）。横轴为计算量 (GFLOPs)，纵轴为相对误差 (Rel-L2)。Ours (EDSR) 位于左下角的帕累托最优区域，表明其在有限算力预算下实现了最佳的重建精度，具备边缘部署潜力。" title="" id="62" name="Picture"/>
+            <wp:docPr descr="图 4-10: 不同模型架构在 SWE 任务上的资源-精度权衡（Pareto Frontier）。横轴为计算量 (GFLOPs)，纵轴为相对误差 (Rel-L2)。Ours (EDSR) 位于左下角的帕累托最优区域，表明其在有限算力预算下实现了最佳的重建精度，具备边缘部署潜力。" title="" id="65" name="Picture"/>
             <a:graphic>
               <a:graphicData uri="http://schemas.openxmlformats.org/drawingml/2006/picture">
                 <pic:pic>
                   <pic:nvPicPr>
-                    <pic:cNvPr descr="images/fig4-3_pareto_frontier.png" id="63" name="Picture"/>
+                    <pic:cNvPr descr="images/fig4-3_pareto_frontier.png" id="66" name="Picture"/>
                     <pic:cNvPicPr>
                       <a:picLocks noChangeArrowheads="1" noChangeAspect="1"/>
                     </pic:cNvPicPr>
                   </pic:nvPicPr>
                   <pic:blipFill>
-                    <a:blip r:embed="rId61"/>
+                    <a:blip r:embed="rId64"/>
                     <a:stretch>
                       <a:fillRect/>
                     </a:stretch>
@@ -11811,9 +12769,9 @@
         </w:pict>
       </w:r>
     </w:p>
-    <w:bookmarkEnd w:id="64"/>
-    <w:bookmarkEnd w:id="65"/>
-    <w:bookmarkStart w:id="66" w:name="本章小结"/>
+    <w:bookmarkEnd w:id="67"/>
+    <w:bookmarkEnd w:id="68"/>
+    <w:bookmarkStart w:id="69" w:name="本章小结"/>
     <w:p>
       <w:pPr>
         <w:pStyle w:val="2"/>
@@ -11829,15 +12787,15 @@
       <w:r>
         <w:t xml:space="preserve">本章通过系统的实验验证了所提方法在稀疏物理场重建中的有效性。主要结论如下：</w:t>
       </w:r>
-      <w:r>
-        <w:t xml:space="preserve"> </w:t>
-      </w:r>
-      <w:r>
-        <w:t xml:space="preserve">1.</w:t>
-      </w:r>
-      <w:r>
-        <w:t xml:space="preserve"> </w:t>
-      </w:r>
+    </w:p>
+    <w:p>
+      <w:pPr>
+        <w:numPr>
+          <w:ilvl w:val="0"/>
+          <w:numId w:val="1020"/>
+        </w:numPr>
+        <w:pStyle w:val="Compact"/>
+      </w:pPr>
       <w:r>
         <w:rPr>
           <w:bCs/>
@@ -11869,46 +12827,46 @@
         <w:t xml:space="preserve">与 Crop 任务中，基于统一口径的 EDSR 模型在精度（Rel-L2）与物理一致性（</w:t>
       </w:r>
       <m:oMath>
-        <m:sSub>
-          <m:e>
-            <m:r>
-              <m:t>H</m:t>
-            </m:r>
-          </m:e>
-          <m:sub>
-            <m:r>
-              <m:rPr>
-                <m:sty m:val="p"/>
-              </m:rPr>
-              <m:t>e</m:t>
-            </m:r>
-            <m:r>
-              <m:rPr>
-                <m:sty m:val="p"/>
-              </m:rPr>
-              <m:t>r</m:t>
-            </m:r>
-            <m:r>
-              <m:rPr>
-                <m:sty m:val="p"/>
-              </m:rPr>
-              <m:t>r</m:t>
-            </m:r>
-          </m:sub>
-        </m:sSub>
+        <m:r>
+          <m:t>H</m:t>
+        </m:r>
+        <m:r>
+          <m:rPr>
+            <m:sty m:val="p"/>
+          </m:rPr>
+          <m:t>_</m:t>
+        </m:r>
+        <m:r>
+          <m:rPr>
+            <m:sty m:val="p"/>
+          </m:rPr>
+          <m:t>e</m:t>
+        </m:r>
+        <m:r>
+          <m:rPr>
+            <m:sty m:val="p"/>
+          </m:rPr>
+          <m:t>r</m:t>
+        </m:r>
+        <m:r>
+          <m:rPr>
+            <m:sty m:val="p"/>
+          </m:rPr>
+          <m:t>r</m:t>
+        </m:r>
       </m:oMath>
       <w:r>
         <w:t xml:space="preserve">）上均显著优于基线。</w:t>
       </w:r>
-      <w:r>
-        <w:t xml:space="preserve"> </w:t>
-      </w:r>
-      <w:r>
-        <w:t xml:space="preserve">2.</w:t>
-      </w:r>
-      <w:r>
-        <w:t xml:space="preserve"> </w:t>
-      </w:r>
+    </w:p>
+    <w:p>
+      <w:pPr>
+        <w:numPr>
+          <w:ilvl w:val="0"/>
+          <w:numId w:val="1020"/>
+        </w:numPr>
+        <w:pStyle w:val="Compact"/>
+      </w:pPr>
       <w:r>
         <w:rPr>
           <w:bCs/>
@@ -11919,15 +12877,15 @@
       <w:r>
         <w:t xml:space="preserve">：消融实验证实了观测一致性与频域约束是提升泛化能力的关键，直接支撑了第2章的理论命题。</w:t>
       </w:r>
-      <w:r>
-        <w:t xml:space="preserve"> </w:t>
-      </w:r>
-      <w:r>
-        <w:t xml:space="preserve">3.</w:t>
-      </w:r>
-      <w:r>
-        <w:t xml:space="preserve"> </w:t>
-      </w:r>
+    </w:p>
+    <w:p>
+      <w:pPr>
+        <w:numPr>
+          <w:ilvl w:val="0"/>
+          <w:numId w:val="1020"/>
+        </w:numPr>
+        <w:pStyle w:val="Compact"/>
+      </w:pPr>
       <w:r>
         <w:rPr>
           <w:bCs/>
@@ -11938,15 +12896,15 @@
       <w:r>
         <w:t xml:space="preserve">：序列化训练策略有效解决了时空联合优化的收敛难题，且资源消耗在可控范围内。</w:t>
       </w:r>
-      <w:r>
-        <w:t xml:space="preserve"> </w:t>
-      </w:r>
-      <w:r>
-        <w:t xml:space="preserve">4.</w:t>
-      </w:r>
-      <w:r>
-        <w:t xml:space="preserve"> </w:t>
-      </w:r>
+    </w:p>
+    <w:p>
+      <w:pPr>
+        <w:numPr>
+          <w:ilvl w:val="0"/>
+          <w:numId w:val="1020"/>
+        </w:numPr>
+        <w:pStyle w:val="Compact"/>
+      </w:pPr>
       <w:r>
         <w:rPr>
           <w:bCs/>
@@ -11988,8 +12946,8 @@
         </w:pict>
       </w:r>
     </w:p>
-    <w:bookmarkEnd w:id="66"/>
-    <w:bookmarkStart w:id="67" w:name="参考文献-references"/>
+    <w:bookmarkEnd w:id="69"/>
+    <w:bookmarkStart w:id="70" w:name="参考文献-references"/>
     <w:p>
       <w:pPr>
         <w:pStyle w:val="2"/>
@@ -12022,8 +12980,8 @@
         <w:t xml:space="preserve">[3] Wilkinson M D, Dumontier M, Aalbersberg I J, et al. The FAIR Guiding Principles for scientific data management and stewardship[J]. Scientific Data, 2016, 3: 160018.</w:t>
       </w:r>
     </w:p>
-    <w:bookmarkEnd w:id="67"/>
-    <w:bookmarkEnd w:id="68"/>
+    <w:bookmarkEnd w:id="70"/>
+    <w:bookmarkEnd w:id="71"/>
     <w:sectPr>
       <w:headerReference r:id="rId12" w:type="even"/>
       <w:headerReference r:id="rId10" w:type="default"/>
@@ -12666,91 +13624,6 @@
       </w:pPr>
     </w:lvl>
   </w:abstractNum>
-  <w:abstractNum w:abstractNumId="99413">
-    <w:nsid w:val="A99413"/>
-    <w:multiLevelType w:val="multilevel"/>
-    <w:lvl w:ilvl="0">
-      <w:start w:val="3"/>
-      <w:numFmt w:val="decimal"/>
-      <w:lvlText w:val="%1."/>
-      <w:lvlJc w:val="left"/>
-      <w:pPr>
-        <w:ind w:left="720" w:hanging="480"/>
-      </w:pPr>
-    </w:lvl>
-    <w:lvl w:ilvl="1">
-      <w:start w:val="3"/>
-      <w:numFmt w:val="decimal"/>
-      <w:lvlText w:val="%2."/>
-      <w:lvlJc w:val="left"/>
-      <w:pPr>
-        <w:ind w:left="1440" w:hanging="480"/>
-      </w:pPr>
-    </w:lvl>
-    <w:lvl w:ilvl="2">
-      <w:start w:val="3"/>
-      <w:numFmt w:val="decimal"/>
-      <w:lvlText w:val="%3."/>
-      <w:lvlJc w:val="left"/>
-      <w:pPr>
-        <w:ind w:left="2160" w:hanging="480"/>
-      </w:pPr>
-    </w:lvl>
-    <w:lvl w:ilvl="3">
-      <w:start w:val="3"/>
-      <w:numFmt w:val="decimal"/>
-      <w:lvlText w:val="%4."/>
-      <w:lvlJc w:val="left"/>
-      <w:pPr>
-        <w:ind w:left="2880" w:hanging="480"/>
-      </w:pPr>
-    </w:lvl>
-    <w:lvl w:ilvl="4">
-      <w:start w:val="3"/>
-      <w:numFmt w:val="decimal"/>
-      <w:lvlText w:val="%5."/>
-      <w:lvlJc w:val="left"/>
-      <w:pPr>
-        <w:ind w:left="3600" w:hanging="480"/>
-      </w:pPr>
-    </w:lvl>
-    <w:lvl w:ilvl="5">
-      <w:start w:val="3"/>
-      <w:numFmt w:val="decimal"/>
-      <w:lvlText w:val="%6."/>
-      <w:lvlJc w:val="left"/>
-      <w:pPr>
-        <w:ind w:left="4320" w:hanging="480"/>
-      </w:pPr>
-    </w:lvl>
-    <w:lvl w:ilvl="6">
-      <w:start w:val="3"/>
-      <w:numFmt w:val="decimal"/>
-      <w:lvlText w:val="%7."/>
-      <w:lvlJc w:val="left"/>
-      <w:pPr>
-        <w:ind w:left="5040" w:hanging="480"/>
-      </w:pPr>
-    </w:lvl>
-    <w:lvl w:ilvl="7">
-      <w:start w:val="3"/>
-      <w:numFmt w:val="decimal"/>
-      <w:lvlText w:val="%8."/>
-      <w:lvlJc w:val="left"/>
-      <w:pPr>
-        <w:ind w:left="5760" w:hanging="480"/>
-      </w:pPr>
-    </w:lvl>
-    <w:lvl w:ilvl="8">
-      <w:start w:val="3"/>
-      <w:numFmt w:val="decimal"/>
-      <w:lvlText w:val="%9."/>
-      <w:lvlJc w:val="left"/>
-      <w:pPr>
-        <w:ind w:left="6480" w:hanging="480"/>
-      </w:pPr>
-    </w:lvl>
-  </w:abstractNum>
   <w:num w:numId="1000">
     <w:abstractNumId w:val="990"/>
   </w:num>
@@ -12791,6 +13664,21 @@
     <w:abstractNumId w:val="991"/>
   </w:num>
   <w:num w:numId="1004">
+    <w:abstractNumId w:val="991"/>
+  </w:num>
+  <w:num w:numId="1005">
+    <w:abstractNumId w:val="991"/>
+  </w:num>
+  <w:num w:numId="1006">
+    <w:abstractNumId w:val="991"/>
+  </w:num>
+  <w:num w:numId="1007">
+    <w:abstractNumId w:val="991"/>
+  </w:num>
+  <w:num w:numId="1008">
+    <w:abstractNumId w:val="991"/>
+  </w:num>
+  <w:num w:numId="1009">
     <w:abstractNumId w:val="99411"/>
     <w:lvlOverride w:ilvl="0">
       <w:startOverride w:val="1"/>
@@ -12820,16 +13708,7 @@
       <w:startOverride w:val="1"/>
     </w:lvlOverride>
   </w:num>
-  <w:num w:numId="1005">
-    <w:abstractNumId w:val="991"/>
-  </w:num>
-  <w:num w:numId="1006">
-    <w:abstractNumId w:val="991"/>
-  </w:num>
-  <w:num w:numId="1007">
-    <w:abstractNumId w:val="991"/>
-  </w:num>
-  <w:num w:numId="1008">
+  <w:num w:numId="1010">
     <w:abstractNumId w:val="99411"/>
     <w:lvlOverride w:ilvl="0">
       <w:startOverride w:val="1"/>
@@ -12859,34 +13738,223 @@
       <w:startOverride w:val="1"/>
     </w:lvlOverride>
   </w:num>
-  <w:num w:numId="1009">
-    <w:abstractNumId w:val="99413"/>
+  <w:num w:numId="1011">
+    <w:abstractNumId w:val="991"/>
+  </w:num>
+  <w:num w:numId="1012">
+    <w:abstractNumId w:val="991"/>
+  </w:num>
+  <w:num w:numId="1013">
+    <w:abstractNumId w:val="991"/>
+  </w:num>
+  <w:num w:numId="1014">
+    <w:abstractNumId w:val="99411"/>
     <w:lvlOverride w:ilvl="0">
-      <w:startOverride w:val="3"/>
+      <w:startOverride w:val="1"/>
     </w:lvlOverride>
     <w:lvlOverride w:ilvl="1">
-      <w:startOverride w:val="3"/>
+      <w:startOverride w:val="1"/>
     </w:lvlOverride>
     <w:lvlOverride w:ilvl="2">
-      <w:startOverride w:val="3"/>
+      <w:startOverride w:val="1"/>
     </w:lvlOverride>
     <w:lvlOverride w:ilvl="3">
-      <w:startOverride w:val="3"/>
+      <w:startOverride w:val="1"/>
     </w:lvlOverride>
     <w:lvlOverride w:ilvl="4">
-      <w:startOverride w:val="3"/>
+      <w:startOverride w:val="1"/>
     </w:lvlOverride>
     <w:lvlOverride w:ilvl="5">
-      <w:startOverride w:val="3"/>
+      <w:startOverride w:val="1"/>
     </w:lvlOverride>
     <w:lvlOverride w:ilvl="6">
-      <w:startOverride w:val="3"/>
+      <w:startOverride w:val="1"/>
     </w:lvlOverride>
     <w:lvlOverride w:ilvl="7">
-      <w:startOverride w:val="3"/>
+      <w:startOverride w:val="1"/>
     </w:lvlOverride>
     <w:lvlOverride w:ilvl="8">
-      <w:startOverride w:val="3"/>
+      <w:startOverride w:val="1"/>
+    </w:lvlOverride>
+  </w:num>
+  <w:num w:numId="1015">
+    <w:abstractNumId w:val="99411"/>
+    <w:lvlOverride w:ilvl="0">
+      <w:startOverride w:val="1"/>
+    </w:lvlOverride>
+    <w:lvlOverride w:ilvl="1">
+      <w:startOverride w:val="1"/>
+    </w:lvlOverride>
+    <w:lvlOverride w:ilvl="2">
+      <w:startOverride w:val="1"/>
+    </w:lvlOverride>
+    <w:lvlOverride w:ilvl="3">
+      <w:startOverride w:val="1"/>
+    </w:lvlOverride>
+    <w:lvlOverride w:ilvl="4">
+      <w:startOverride w:val="1"/>
+    </w:lvlOverride>
+    <w:lvlOverride w:ilvl="5">
+      <w:startOverride w:val="1"/>
+    </w:lvlOverride>
+    <w:lvlOverride w:ilvl="6">
+      <w:startOverride w:val="1"/>
+    </w:lvlOverride>
+    <w:lvlOverride w:ilvl="7">
+      <w:startOverride w:val="1"/>
+    </w:lvlOverride>
+    <w:lvlOverride w:ilvl="8">
+      <w:startOverride w:val="1"/>
+    </w:lvlOverride>
+  </w:num>
+  <w:num w:numId="1016">
+    <w:abstractNumId w:val="99411"/>
+    <w:lvlOverride w:ilvl="0">
+      <w:startOverride w:val="1"/>
+    </w:lvlOverride>
+    <w:lvlOverride w:ilvl="1">
+      <w:startOverride w:val="1"/>
+    </w:lvlOverride>
+    <w:lvlOverride w:ilvl="2">
+      <w:startOverride w:val="1"/>
+    </w:lvlOverride>
+    <w:lvlOverride w:ilvl="3">
+      <w:startOverride w:val="1"/>
+    </w:lvlOverride>
+    <w:lvlOverride w:ilvl="4">
+      <w:startOverride w:val="1"/>
+    </w:lvlOverride>
+    <w:lvlOverride w:ilvl="5">
+      <w:startOverride w:val="1"/>
+    </w:lvlOverride>
+    <w:lvlOverride w:ilvl="6">
+      <w:startOverride w:val="1"/>
+    </w:lvlOverride>
+    <w:lvlOverride w:ilvl="7">
+      <w:startOverride w:val="1"/>
+    </w:lvlOverride>
+    <w:lvlOverride w:ilvl="8">
+      <w:startOverride w:val="1"/>
+    </w:lvlOverride>
+  </w:num>
+  <w:num w:numId="1017">
+    <w:abstractNumId w:val="99411"/>
+    <w:lvlOverride w:ilvl="0">
+      <w:startOverride w:val="1"/>
+    </w:lvlOverride>
+    <w:lvlOverride w:ilvl="1">
+      <w:startOverride w:val="1"/>
+    </w:lvlOverride>
+    <w:lvlOverride w:ilvl="2">
+      <w:startOverride w:val="1"/>
+    </w:lvlOverride>
+    <w:lvlOverride w:ilvl="3">
+      <w:startOverride w:val="1"/>
+    </w:lvlOverride>
+    <w:lvlOverride w:ilvl="4">
+      <w:startOverride w:val="1"/>
+    </w:lvlOverride>
+    <w:lvlOverride w:ilvl="5">
+      <w:startOverride w:val="1"/>
+    </w:lvlOverride>
+    <w:lvlOverride w:ilvl="6">
+      <w:startOverride w:val="1"/>
+    </w:lvlOverride>
+    <w:lvlOverride w:ilvl="7">
+      <w:startOverride w:val="1"/>
+    </w:lvlOverride>
+    <w:lvlOverride w:ilvl="8">
+      <w:startOverride w:val="1"/>
+    </w:lvlOverride>
+  </w:num>
+  <w:num w:numId="1018">
+    <w:abstractNumId w:val="99411"/>
+    <w:lvlOverride w:ilvl="0">
+      <w:startOverride w:val="1"/>
+    </w:lvlOverride>
+    <w:lvlOverride w:ilvl="1">
+      <w:startOverride w:val="1"/>
+    </w:lvlOverride>
+    <w:lvlOverride w:ilvl="2">
+      <w:startOverride w:val="1"/>
+    </w:lvlOverride>
+    <w:lvlOverride w:ilvl="3">
+      <w:startOverride w:val="1"/>
+    </w:lvlOverride>
+    <w:lvlOverride w:ilvl="4">
+      <w:startOverride w:val="1"/>
+    </w:lvlOverride>
+    <w:lvlOverride w:ilvl="5">
+      <w:startOverride w:val="1"/>
+    </w:lvlOverride>
+    <w:lvlOverride w:ilvl="6">
+      <w:startOverride w:val="1"/>
+    </w:lvlOverride>
+    <w:lvlOverride w:ilvl="7">
+      <w:startOverride w:val="1"/>
+    </w:lvlOverride>
+    <w:lvlOverride w:ilvl="8">
+      <w:startOverride w:val="1"/>
+    </w:lvlOverride>
+  </w:num>
+  <w:num w:numId="1019">
+    <w:abstractNumId w:val="99411"/>
+    <w:lvlOverride w:ilvl="0">
+      <w:startOverride w:val="1"/>
+    </w:lvlOverride>
+    <w:lvlOverride w:ilvl="1">
+      <w:startOverride w:val="1"/>
+    </w:lvlOverride>
+    <w:lvlOverride w:ilvl="2">
+      <w:startOverride w:val="1"/>
+    </w:lvlOverride>
+    <w:lvlOverride w:ilvl="3">
+      <w:startOverride w:val="1"/>
+    </w:lvlOverride>
+    <w:lvlOverride w:ilvl="4">
+      <w:startOverride w:val="1"/>
+    </w:lvlOverride>
+    <w:lvlOverride w:ilvl="5">
+      <w:startOverride w:val="1"/>
+    </w:lvlOverride>
+    <w:lvlOverride w:ilvl="6">
+      <w:startOverride w:val="1"/>
+    </w:lvlOverride>
+    <w:lvlOverride w:ilvl="7">
+      <w:startOverride w:val="1"/>
+    </w:lvlOverride>
+    <w:lvlOverride w:ilvl="8">
+      <w:startOverride w:val="1"/>
+    </w:lvlOverride>
+  </w:num>
+  <w:num w:numId="1020">
+    <w:abstractNumId w:val="99411"/>
+    <w:lvlOverride w:ilvl="0">
+      <w:startOverride w:val="1"/>
+    </w:lvlOverride>
+    <w:lvlOverride w:ilvl="1">
+      <w:startOverride w:val="1"/>
+    </w:lvlOverride>
+    <w:lvlOverride w:ilvl="2">
+      <w:startOverride w:val="1"/>
+    </w:lvlOverride>
+    <w:lvlOverride w:ilvl="3">
+      <w:startOverride w:val="1"/>
+    </w:lvlOverride>
+    <w:lvlOverride w:ilvl="4">
+      <w:startOverride w:val="1"/>
+    </w:lvlOverride>
+    <w:lvlOverride w:ilvl="5">
+      <w:startOverride w:val="1"/>
+    </w:lvlOverride>
+    <w:lvlOverride w:ilvl="6">
+      <w:startOverride w:val="1"/>
+    </w:lvlOverride>
+    <w:lvlOverride w:ilvl="7">
+      <w:startOverride w:val="1"/>
+    </w:lvlOverride>
+    <w:lvlOverride w:ilvl="8">
+      <w:startOverride w:val="1"/>
     </w:lvlOverride>
   </w:num>
 </w:numbering>

</xml_diff>